<commit_message>
Deploying to gh-pages from @ Morrison-Lab/rme@d7790d71de99876f99fe7871ed734f3b481ea961 🚀
</commit_message>
<xml_diff>
--- a/chapters/Intro-to-GLMs-handout.docx
+++ b/chapters/Intro-to-GLMs-handout.docx
@@ -9536,13 +9536,29 @@
                 <w:b/>
                 <w:bCs/>
               </w:rPr>
-              <w:t xml:space="preserve">Definition 2 (Outcome)</w:t>
-            </w:r>
-            <w:r>
-              <w:t xml:space="preserve"> </w:t>
-            </w:r>
-            <w:r>
-              <w:t xml:space="preserve">The outcome variable in a regression model</w:t>
+              <w:t xml:space="preserve">Definition 2 (Outcome (response variable, regressand, predicted variable, explained variable, experimental variable, output variable, dependent variable, endogenous variable, target, label))</w:t>
+            </w:r>
+            <w:r>
+              <w:t xml:space="preserve"> </w:t>
+            </w:r>
+            <w:r>
+              <w:t xml:space="preserve">The</w:t>
+            </w:r>
+            <w:r>
+              <w:t xml:space="preserve"> </w:t>
+            </w:r>
+            <w:r>
+              <w:rPr>
+                <w:b/>
+                <w:bCs/>
+              </w:rPr>
+              <w:t xml:space="preserve">outcome variable</w:t>
+            </w:r>
+            <w:r>
+              <w:t xml:space="preserve"> </w:t>
+            </w:r>
+            <w:r>
+              <w:t xml:space="preserve">in a regression model</w:t>
             </w:r>
             <w:r>
               <w:t xml:space="preserve"> </w:t>
@@ -9580,7 +9596,7 @@
               <w:pStyle w:val="BodyText"/>
             </w:pPr>
             <w:r>
-              <w:t xml:space="preserve">The outcome variable is also called the</w:t>
+              <w:t xml:space="preserve">It is also called the</w:t>
             </w:r>
             <w:r>
               <w:t xml:space="preserve"> </w:t>
@@ -9681,7 +9697,7 @@
                 <w:b/>
                 <w:bCs/>
               </w:rPr>
-              <w:t xml:space="preserve">endogenous variables</w:t>
+              <w:t xml:space="preserve">endogenous variable</w:t>
             </w:r>
             <w:r>
               <w:t xml:space="preserve">,</w:t>
@@ -9786,13 +9802,29 @@
                 <w:b/>
                 <w:bCs/>
               </w:rPr>
-              <w:t xml:space="preserve">Definition 3 (Predictors)</w:t>
-            </w:r>
-            <w:r>
-              <w:t xml:space="preserve"> </w:t>
-            </w:r>
-            <w:r>
-              <w:t xml:space="preserve">The predictor variables in a regression model are the conditioning variables</w:t>
+              <w:t xml:space="preserve">Definition 3 (Predictors (regressors, covariates, independent variables, explanatory variables, risk factors, exposure variables, input variables, exogenous variables, candidate variables, carriers, manipulated variables, features))</w:t>
+            </w:r>
+            <w:r>
+              <w:t xml:space="preserve"> </w:t>
+            </w:r>
+            <w:r>
+              <w:t xml:space="preserve">The</w:t>
+            </w:r>
+            <w:r>
+              <w:t xml:space="preserve"> </w:t>
+            </w:r>
+            <w:r>
+              <w:rPr>
+                <w:b/>
+                <w:bCs/>
+              </w:rPr>
+              <w:t xml:space="preserve">predictor variables</w:t>
+            </w:r>
+            <w:r>
+              <w:t xml:space="preserve"> </w:t>
+            </w:r>
+            <w:r>
+              <w:t xml:space="preserve">in a regression model are the conditioning variables</w:t>
             </w:r>
             <w:r>
               <w:t xml:space="preserve"> </w:t>
@@ -11923,7 +11955,7 @@
                 <w:b/>
                 <w:bCs/>
               </w:rPr>
-              <w:t xml:space="preserve">Definition 4 (Linear predictor)</w:t>
+              <w:t xml:space="preserve">Definition 4 (Linear predictor (linear component))</w:t>
             </w:r>
             <w:r>
               <w:t xml:space="preserve"> </w:t>

</xml_diff>

<commit_message>
Deploying to gh-pages from @ Morrison-Lab/rme@0bf4c712b00d4334b7d89e1e498430bf8be69aa0 🚀
</commit_message>
<xml_diff>
--- a/chapters/Intro-to-GLMs-handout.docx
+++ b/chapters/Intro-to-GLMs-handout.docx
@@ -6916,7 +6916,25 @@
               <w:rPr>
                 <w:rStyle w:val="NormalTok"/>
               </w:rPr>
-              <w:t xml:space="preserve"> dose, </w:t>
+              <w:t xml:space="preserve"> </w:t>
+            </w:r>
+            <w:r>
+              <w:rPr>
+                <w:rStyle w:val="DecValTok"/>
+              </w:rPr>
+              <w:t xml:space="preserve">10</w:t>
+            </w:r>
+            <w:r>
+              <w:rPr>
+                <w:rStyle w:val="SpecialCharTok"/>
+              </w:rPr>
+              <w:t xml:space="preserve">^</w:t>
+            </w:r>
+            <w:r>
+              <w:rPr>
+                <w:rStyle w:val="NormalTok"/>
+              </w:rPr>
+              <w:t xml:space="preserve">dose, </w:t>
             </w:r>
             <w:r>
               <w:rPr>
@@ -7000,6 +7018,129 @@
               <w:rPr>
                 <w:rStyle w:val="FunctionTok"/>
               </w:rPr>
+              <w:t xml:space="preserve">scale_x_log10</w:t>
+            </w:r>
+            <w:r>
+              <w:rPr>
+                <w:rStyle w:val="NormalTok"/>
+              </w:rPr>
+              <w:t xml:space="preserve">(</w:t>
+            </w:r>
+            <w:r>
+              <w:rPr>
+                <w:rStyle w:val="AttributeTok"/>
+              </w:rPr>
+              <w:t xml:space="preserve">breaks =</w:t>
+            </w:r>
+            <w:r>
+              <w:rPr>
+                <w:rStyle w:val="NormalTok"/>
+              </w:rPr>
+              <w:t xml:space="preserve"> </w:t>
+            </w:r>
+            <w:r>
+              <w:rPr>
+                <w:rStyle w:val="FunctionTok"/>
+              </w:rPr>
+              <w:t xml:space="preserve">c</w:t>
+            </w:r>
+            <w:r>
+              <w:rPr>
+                <w:rStyle w:val="NormalTok"/>
+              </w:rPr>
+              <w:t xml:space="preserve">(</w:t>
+            </w:r>
+            <w:r>
+              <w:rPr>
+                <w:rStyle w:val="DecValTok"/>
+              </w:rPr>
+              <w:t xml:space="preserve">40</w:t>
+            </w:r>
+            <w:r>
+              <w:rPr>
+                <w:rStyle w:val="NormalTok"/>
+              </w:rPr>
+              <w:t xml:space="preserve">, </w:t>
+            </w:r>
+            <w:r>
+              <w:rPr>
+                <w:rStyle w:val="DecValTok"/>
+              </w:rPr>
+              <w:t xml:space="preserve">50</w:t>
+            </w:r>
+            <w:r>
+              <w:rPr>
+                <w:rStyle w:val="NormalTok"/>
+              </w:rPr>
+              <w:t xml:space="preserve">, </w:t>
+            </w:r>
+            <w:r>
+              <w:rPr>
+                <w:rStyle w:val="DecValTok"/>
+              </w:rPr>
+              <w:t xml:space="preserve">60</w:t>
+            </w:r>
+            <w:r>
+              <w:rPr>
+                <w:rStyle w:val="NormalTok"/>
+              </w:rPr>
+              <w:t xml:space="preserve">, </w:t>
+            </w:r>
+            <w:r>
+              <w:rPr>
+                <w:rStyle w:val="DecValTok"/>
+              </w:rPr>
+              <w:t xml:space="preserve">70</w:t>
+            </w:r>
+            <w:r>
+              <w:rPr>
+                <w:rStyle w:val="NormalTok"/>
+              </w:rPr>
+              <w:t xml:space="preserve">, </w:t>
+            </w:r>
+            <w:r>
+              <w:rPr>
+                <w:rStyle w:val="DecValTok"/>
+              </w:rPr>
+              <w:t xml:space="preserve">80</w:t>
+            </w:r>
+            <w:r>
+              <w:rPr>
+                <w:rStyle w:val="NormalTok"/>
+              </w:rPr>
+              <w:t xml:space="preserve">, </w:t>
+            </w:r>
+            <w:r>
+              <w:rPr>
+                <w:rStyle w:val="DecValTok"/>
+              </w:rPr>
+              <w:t xml:space="preserve">100</w:t>
+            </w:r>
+            <w:r>
+              <w:rPr>
+                <w:rStyle w:val="NormalTok"/>
+              </w:rPr>
+              <w:t xml:space="preserve">)) </w:t>
+            </w:r>
+            <w:r>
+              <w:rPr>
+                <w:rStyle w:val="SpecialCharTok"/>
+              </w:rPr>
+              <w:t xml:space="preserve">+</w:t>
+            </w:r>
+            <w:r>
+              <w:br/>
+            </w:r>
+            <w:r>
+              <w:rPr>
+                <w:rStyle w:val="NormalTok"/>
+              </w:rPr>
+              <w:t xml:space="preserve">  </w:t>
+            </w:r>
+            <w:r>
+              <w:rPr>
+                <w:rStyle w:val="FunctionTok"/>
+              </w:rPr>
               <w:t xml:space="preserve">xlab</w:t>
             </w:r>
             <w:r>
@@ -7012,7 +7153,7 @@
               <w:rPr>
                 <w:rStyle w:val="StringTok"/>
               </w:rPr>
-              <w:t xml:space="preserve">"Dose (log mg/L)"</w:t>
+              <w:t xml:space="preserve">"Dose of CS2 (mg/L)"</w:t>
             </w:r>
             <w:r>
               <w:rPr>
@@ -7115,21 +7256,6 @@
                 <w:rStyle w:val="SpecialCharTok"/>
               </w:rPr>
               <w:t xml:space="preserve">+</w:t>
-            </w:r>
-            <w:r>
-              <w:br/>
-            </w:r>
-            <w:r>
-              <w:rPr>
-                <w:rStyle w:val="NormalTok"/>
-              </w:rPr>
-              <w:t xml:space="preserve">  </w:t>
-            </w:r>
-            <w:r>
-              <w:rPr>
-                <w:rStyle w:val="CommentTok"/>
-              </w:rPr>
-              <w:t xml:space="preserve"># xlab(bquote(log[10]), bquote(CS[2])) +</w:t>
             </w:r>
             <w:r>
               <w:br/>
@@ -7276,7 +7402,40 @@
               <w:pStyle w:val="ImageCaption"/>
             </w:pPr>
             <w:r>
-              <w:t xml:space="preserve">Figure 5: Mortality rates of adult flour beetles after five hours’ exposure to gaseous carbon disulphide (Bliss 1935)</w:t>
+              <w:t xml:space="preserve">Figure 5: Mortality rates of adult flour beetles after five hours’ exposure to gaseous carbon disulphide (Bliss 1935).</w:t>
+            </w:r>
+            <w:r>
+              <w:t xml:space="preserve"> </w:t>
+            </w:r>
+            <w:r>
+              <w:t xml:space="preserve">The</w:t>
+            </w:r>
+            <w:r>
+              <w:t xml:space="preserve"> </w:t>
+            </w:r>
+            <w:r>
+              <w:rPr>
+                <w:rStyle w:val="VerbatimChar"/>
+              </w:rPr>
+              <w:t xml:space="preserve">dose</w:t>
+            </w:r>
+            <w:r>
+              <w:t xml:space="preserve"> </w:t>
+            </w:r>
+            <w:r>
+              <w:t xml:space="preserve">column holds the base-10 logarithm of the dose in mg/L,</w:t>
+            </w:r>
+            <w:r>
+              <w:t xml:space="preserve"> </w:t>
+            </w:r>
+            <w:r>
+              <w:t xml:space="preserve">and the models use it as is;</w:t>
+            </w:r>
+            <w:r>
+              <w:t xml:space="preserve"> </w:t>
+            </w:r>
+            <w:r>
+              <w:t xml:space="preserve">the figures show the dose itself, in mg/L, on a log-spaced axis.</w:t>
             </w:r>
           </w:p>
           <w:bookmarkEnd w:id="101"/>
@@ -7658,13 +7817,10 @@
               <w:br/>
             </w:r>
             <w:r>
-              <w:br/>
-            </w:r>
-            <w:r>
               <w:rPr>
                 <w:rStyle w:val="NormalTok"/>
               </w:rPr>
-              <w:t xml:space="preserve">range1 </w:t>
+              <w:t xml:space="preserve">f_linear </w:t>
             </w:r>
             <w:r>
               <w:rPr>
@@ -7680,171 +7836,75 @@
             </w:r>
             <w:r>
               <w:rPr>
+                <w:rStyle w:val="ControlFlowTok"/>
+              </w:rPr>
+              <w:t xml:space="preserve">function</w:t>
+            </w:r>
+            <w:r>
+              <w:rPr>
+                <w:rStyle w:val="NormalTok"/>
+              </w:rPr>
+              <w:t xml:space="preserve">(x) </w:t>
+            </w:r>
+            <w:r>
+              <w:rPr>
                 <w:rStyle w:val="FunctionTok"/>
               </w:rPr>
-              <w:t xml:space="preserve">range</w:t>
+              <w:t xml:space="preserve">predict</w:t>
             </w:r>
             <w:r>
               <w:rPr>
                 <w:rStyle w:val="NormalTok"/>
               </w:rPr>
-              <w:t xml:space="preserve">(beetles</w:t>
-            </w:r>
-            <w:r>
-              <w:rPr>
-                <w:rStyle w:val="SpecialCharTok"/>
-              </w:rPr>
-              <w:t xml:space="preserve">$</w:t>
+              <w:t xml:space="preserve">(lm1, </w:t>
+            </w:r>
+            <w:r>
+              <w:rPr>
+                <w:rStyle w:val="AttributeTok"/>
+              </w:rPr>
+              <w:t xml:space="preserve">newdata =</w:t>
             </w:r>
             <w:r>
               <w:rPr>
                 <w:rStyle w:val="NormalTok"/>
               </w:rPr>
-              <w:t xml:space="preserve">dose) </w:t>
-            </w:r>
-            <w:r>
-              <w:rPr>
-                <w:rStyle w:val="SpecialCharTok"/>
-              </w:rPr>
-              <w:t xml:space="preserve">+</w:t>
+              <w:t xml:space="preserve"> </w:t>
+            </w:r>
+            <w:r>
+              <w:rPr>
+                <w:rStyle w:val="FunctionTok"/>
+              </w:rPr>
+              <w:t xml:space="preserve">data.frame</w:t>
             </w:r>
             <w:r>
               <w:rPr>
                 <w:rStyle w:val="NormalTok"/>
               </w:rPr>
+              <w:t xml:space="preserve">(</w:t>
+            </w:r>
+            <w:r>
+              <w:rPr>
+                <w:rStyle w:val="AttributeTok"/>
+              </w:rPr>
+              <w:t xml:space="preserve">dose =</w:t>
+            </w:r>
+            <w:r>
+              <w:rPr>
+                <w:rStyle w:val="NormalTok"/>
+              </w:rPr>
               <w:t xml:space="preserve"> </w:t>
             </w:r>
             <w:r>
               <w:rPr>
                 <w:rStyle w:val="FunctionTok"/>
               </w:rPr>
-              <w:t xml:space="preserve">c</w:t>
+              <w:t xml:space="preserve">log10</w:t>
             </w:r>
             <w:r>
               <w:rPr>
                 <w:rStyle w:val="NormalTok"/>
               </w:rPr>
-              <w:t xml:space="preserve">(</w:t>
-            </w:r>
-            <w:r>
-              <w:rPr>
-                <w:rStyle w:val="SpecialCharTok"/>
-              </w:rPr>
-              <w:t xml:space="preserve">-</w:t>
-            </w:r>
-            <w:r>
-              <w:rPr>
-                <w:rStyle w:val="NormalTok"/>
-              </w:rPr>
-              <w:t xml:space="preserve">.</w:t>
-            </w:r>
-            <w:r>
-              <w:rPr>
-                <w:rStyle w:val="DecValTok"/>
-              </w:rPr>
-              <w:t xml:space="preserve">2</w:t>
-            </w:r>
-            <w:r>
-              <w:rPr>
-                <w:rStyle w:val="NormalTok"/>
-              </w:rPr>
-              <w:t xml:space="preserve">, .</w:t>
-            </w:r>
-            <w:r>
-              <w:rPr>
-                <w:rStyle w:val="DecValTok"/>
-              </w:rPr>
-              <w:t xml:space="preserve">2</w:t>
-            </w:r>
-            <w:r>
-              <w:rPr>
-                <w:rStyle w:val="NormalTok"/>
-              </w:rPr>
-              <w:t xml:space="preserve">)</w:t>
-            </w:r>
-            <w:r>
-              <w:br/>
-            </w:r>
-            <w:r>
-              <w:br/>
-            </w:r>
-            <w:r>
-              <w:rPr>
-                <w:rStyle w:val="NormalTok"/>
-              </w:rPr>
-              <w:t xml:space="preserve">f_linear </w:t>
-            </w:r>
-            <w:r>
-              <w:rPr>
-                <w:rStyle w:val="OtherTok"/>
-              </w:rPr>
-              <w:t xml:space="preserve">&lt;-</w:t>
-            </w:r>
-            <w:r>
-              <w:rPr>
-                <w:rStyle w:val="NormalTok"/>
-              </w:rPr>
-              <w:t xml:space="preserve"> </w:t>
-            </w:r>
-            <w:r>
-              <w:rPr>
-                <w:rStyle w:val="ControlFlowTok"/>
-              </w:rPr>
-              <w:t xml:space="preserve">function</w:t>
-            </w:r>
-            <w:r>
-              <w:rPr>
-                <w:rStyle w:val="NormalTok"/>
-              </w:rPr>
-              <w:t xml:space="preserve">(x) </w:t>
-            </w:r>
-            <w:r>
-              <w:rPr>
-                <w:rStyle w:val="FunctionTok"/>
-              </w:rPr>
-              <w:t xml:space="preserve">predict</w:t>
-            </w:r>
-            <w:r>
-              <w:rPr>
-                <w:rStyle w:val="NormalTok"/>
-              </w:rPr>
-              <w:t xml:space="preserve">(lm1, </w:t>
-            </w:r>
-            <w:r>
-              <w:rPr>
-                <w:rStyle w:val="AttributeTok"/>
-              </w:rPr>
-              <w:t xml:space="preserve">newdata =</w:t>
-            </w:r>
-            <w:r>
-              <w:rPr>
-                <w:rStyle w:val="NormalTok"/>
-              </w:rPr>
-              <w:t xml:space="preserve"> </w:t>
-            </w:r>
-            <w:r>
-              <w:rPr>
-                <w:rStyle w:val="FunctionTok"/>
-              </w:rPr>
-              <w:t xml:space="preserve">data.frame</w:t>
-            </w:r>
-            <w:r>
-              <w:rPr>
-                <w:rStyle w:val="NormalTok"/>
-              </w:rPr>
-              <w:t xml:space="preserve">(</w:t>
-            </w:r>
-            <w:r>
-              <w:rPr>
-                <w:rStyle w:val="AttributeTok"/>
-              </w:rPr>
-              <w:t xml:space="preserve">dose =</w:t>
-            </w:r>
-            <w:r>
-              <w:rPr>
-                <w:rStyle w:val="NormalTok"/>
-              </w:rPr>
-              <w:t xml:space="preserve"> x))</w:t>
+              <w:t xml:space="preserve">(x)))</w:t>
             </w:r>
             <w:r>
               <w:br/>
@@ -8413,7 +8473,19 @@
               <w:rPr>
                 <w:rStyle w:val="NormalTok"/>
               </w:rPr>
-              <w:t xml:space="preserve"> x))</w:t>
+              <w:t xml:space="preserve"> </w:t>
+            </w:r>
+            <w:r>
+              <w:rPr>
+                <w:rStyle w:val="FunctionTok"/>
+              </w:rPr>
+              <w:t xml:space="preserve">log10</w:t>
+            </w:r>
+            <w:r>
+              <w:rPr>
+                <w:rStyle w:val="NormalTok"/>
+              </w:rPr>
+              <w:t xml:space="preserve">(x)))</w:t>
             </w:r>
             <w:r>
               <w:br/>
@@ -8492,9 +8564,9 @@
             </w:r>
             <w:r>
               <w:rPr>
-                <w:rStyle w:val="FloatTok"/>
-              </w:rPr>
-              <w:t xml:space="preserve">1.6</w:t>
+                <w:rStyle w:val="DecValTok"/>
+              </w:rPr>
+              <w:t xml:space="preserve">40</w:t>
             </w:r>
             <w:r>
               <w:rPr>
@@ -8506,7 +8578,7 @@
               <w:rPr>
                 <w:rStyle w:val="DecValTok"/>
               </w:rPr>
-              <w:t xml:space="preserve">2</w:t>
+              <w:t xml:space="preserve">100</w:t>
             </w:r>
             <w:r>
               <w:rPr>
@@ -8657,9 +8729,9 @@
             </w:r>
             <w:r>
               <w:rPr>
-                <w:rStyle w:val="FloatTok"/>
-              </w:rPr>
-              <w:t xml:space="preserve">1.6</w:t>
+                <w:rStyle w:val="DecValTok"/>
+              </w:rPr>
+              <w:t xml:space="preserve">40</w:t>
             </w:r>
             <w:r>
               <w:rPr>
@@ -8671,7 +8743,7 @@
               <w:rPr>
                 <w:rStyle w:val="DecValTok"/>
               </w:rPr>
-              <w:t xml:space="preserve">2</w:t>
+              <w:t xml:space="preserve">100</w:t>
             </w:r>
             <w:r>
               <w:rPr>
@@ -8993,7 +9065,19 @@
               <w:rPr>
                 <w:rStyle w:val="NormalTok"/>
               </w:rPr>
-              <w:t xml:space="preserve"> x), </w:t>
+              <w:t xml:space="preserve"> </w:t>
+            </w:r>
+            <w:r>
+              <w:rPr>
+                <w:rStyle w:val="FunctionTok"/>
+              </w:rPr>
+              <w:t xml:space="preserve">log10</w:t>
+            </w:r>
+            <w:r>
+              <w:rPr>
+                <w:rStyle w:val="NormalTok"/>
+              </w:rPr>
+              <w:t xml:space="preserve">(x)), </w:t>
             </w:r>
             <w:r>
               <w:rPr>
@@ -9212,7 +9296,7 @@
     </w:tbl>
     <w:bookmarkEnd w:id="122"/>
     <w:bookmarkEnd w:id="123"/>
-    <w:bookmarkStart w:id="150" w:name="structure-of-regression-models"/>
+    <w:bookmarkStart w:id="151" w:name="structure-of-regression-models"/>
     <w:p>
       <w:pPr>
         <w:pStyle w:val="Heading1"/>
@@ -11654,11 +11738,11 @@
               <w:t xml:space="preserve"> </w:t>
             </w:r>
             <m:oMath>
-              <m:r>
-                <m:t>​</m:t>
-              </m:r>
               <m:sSup>
                 <m:e>
+                  <m:r>
+                    <m:t>​</m:t>
+                  </m:r>
                   <m:d>
                     <m:dPr>
                       <m:begChr m:val="("/>
@@ -11687,6 +11771,9 @@
                       </m:r>
                     </m:e>
                   </m:d>
+                  <m:r>
+                    <m:t>​</m:t>
+                  </m:r>
                 </m:e>
                 <m:sup>
                   <m:r>
@@ -11700,9 +11787,6 @@
                   </m:r>
                 </m:sup>
               </m:sSup>
-              <m:r>
-                <m:t>​</m:t>
-              </m:r>
               <m:r>
                 <m:rPr>
                   <m:sty m:val="p"/>
@@ -16188,7 +16272,7 @@
               <w:spacing w:before="16" w:after="64"/>
             </w:pPr>
           </w:p>
-          <w:bookmarkStart w:id="144" w:name="def-glm"/>
+          <w:bookmarkStart w:id="144" w:name="def-outcome-distribution"/>
           <w:p>
             <w:pPr>
               <w:pStyle w:val="BodyText"/>
@@ -16198,29 +16282,13 @@
                 <w:b/>
                 <w:bCs/>
               </w:rPr>
-              <w:t xml:space="preserve">Definition 7 (Generalized linear model)</w:t>
-            </w:r>
-            <w:r>
-              <w:t xml:space="preserve"> </w:t>
-            </w:r>
-            <w:r>
-              <w:t xml:space="preserve">A</w:t>
-            </w:r>
-            <w:r>
-              <w:t xml:space="preserve"> </w:t>
-            </w:r>
-            <w:r>
-              <w:rPr>
-                <w:b/>
-                <w:bCs/>
-              </w:rPr>
-              <w:t xml:space="preserve">generalized linear model (GLM)</w:t>
-            </w:r>
-            <w:r>
-              <w:t xml:space="preserve"> </w:t>
-            </w:r>
-            <w:r>
-              <w:t xml:space="preserve">is a regression model (</w:t>
+              <w:t xml:space="preserve">Definition 7 (Outcome distribution (random component))</w:t>
+            </w:r>
+            <w:r>
+              <w:t xml:space="preserve"> </w:t>
+            </w:r>
+            <w:r>
+              <w:t xml:space="preserve">In a regression model (</w:t>
             </w:r>
             <w:hyperlink w:anchor="def-regression-model">
               <w:r>
@@ -16285,30 +16353,13 @@
               </m:acc>
             </m:oMath>
             <w:r>
-              <w:t xml:space="preserve"> </w:t>
-            </w:r>
-            <w:r>
-              <w:t xml:space="preserve">with three components</w:t>
-            </w:r>
-            <w:r>
-              <w:t xml:space="preserve"> </w:t>
-            </w:r>
-            <w:r>
-              <w:t xml:space="preserve">(Dobson and Barnett 2018, chap. 3; Dunn and Smyth 2018, chap. 5)</w:t>
-            </w:r>
-            <w:r>
-              <w:t xml:space="preserve">:</w:t>
-            </w:r>
-          </w:p>
-          <w:p>
-            <w:pPr>
-              <w:numPr>
-                <w:ilvl w:val="0"/>
-                <w:numId w:val="1030"/>
-              </w:numPr>
-            </w:pPr>
-            <w:r>
-              <w:t xml:space="preserve">an</w:t>
+              <w:t xml:space="preserve">,</w:t>
+            </w:r>
+            <w:r>
+              <w:t xml:space="preserve"> </w:t>
+            </w:r>
+            <w:r>
+              <w:t xml:space="preserve">the</w:t>
             </w:r>
             <w:r>
               <w:t xml:space="preserve"> </w:t>
@@ -16337,13 +16388,27 @@
               <w:t xml:space="preserve">random component</w:t>
             </w:r>
             <w:r>
-              <w:t xml:space="preserve">):</w:t>
-            </w:r>
-            <w:r>
-              <w:t xml:space="preserve"> </w:t>
-            </w:r>
-            <w:r>
-              <w:t xml:space="preserve">given</w:t>
+              <w:t xml:space="preserve">)</w:t>
+            </w:r>
+            <w:r>
+              <w:t xml:space="preserve"> </w:t>
+            </w:r>
+            <w:r>
+              <w:t xml:space="preserve">is the specified distribution family that</w:t>
+            </w:r>
+            <w:r>
+              <w:t xml:space="preserve"> </w:t>
+            </w:r>
+            <m:oMath>
+              <m:r>
+                <m:t>Y</m:t>
+              </m:r>
+            </m:oMath>
+            <w:r>
+              <w:t xml:space="preserve"> </w:t>
+            </w:r>
+            <w:r>
+              <w:t xml:space="preserve">follows given</w:t>
             </w:r>
             <w:r>
               <w:t xml:space="preserve"> </w:t>
@@ -16378,20 +16443,6 @@
             </m:oMath>
             <w:r>
               <w:t xml:space="preserve">,</w:t>
-            </w:r>
-            <w:r>
-              <w:t xml:space="preserve"> </w:t>
-            </w:r>
-            <m:oMath>
-              <m:r>
-                <m:t>Y</m:t>
-              </m:r>
-            </m:oMath>
-            <w:r>
-              <w:t xml:space="preserve"> </w:t>
-            </w:r>
-            <w:r>
-              <w:t xml:space="preserve">follows a specified distribution family,</w:t>
             </w:r>
             <w:r>
               <w:t xml:space="preserve"> </w:t>
@@ -16518,7 +16569,166 @@
               <w:t xml:space="preserve"> </w:t>
             </w:r>
             <w:r>
-              <w:t xml:space="preserve">and observations are independent given their covariates;</w:t>
+              <w:t xml:space="preserve">where observations are independent given their covariates</w:t>
+            </w:r>
+            <w:r>
+              <w:t xml:space="preserve"> </w:t>
+            </w:r>
+            <w:r>
+              <w:t xml:space="preserve">(Dobson and Barnett 2018, chap. 3; Dunn and Smyth 2018, chap. 5)</w:t>
+            </w:r>
+            <w:r>
+              <w:t xml:space="preserve">.</w:t>
+            </w:r>
+          </w:p>
+          <w:bookmarkEnd w:id="144"/>
+        </w:tc>
+      </w:tr>
+    </w:tbl>
+    <w:tbl>
+      <w:tblPr>
+        <w:tblStyle w:val="Table"/>
+        <w:tblInd w:w="164" w:type="dxa"/>
+        <w:tblBorders>
+          <w:left w:val="single" w:sz="24" w:space="0" w:color="909090"/>
+        </w:tblBorders>
+        <w:tblCellMar>
+          <w:left w:w="0" w:type="dxa"/>
+          <w:right w:w="0" w:type="dxa"/>
+        </w:tblCellMar>
+        <w:tblLook w:firstRow="0" w:lastRow="0" w:firstColumn="0" w:lastColumn="0" w:noHBand="0" w:noVBand="0" w:val="0000"/>
+      </w:tblPr>
+      <w:tblGrid>
+        <w:gridCol w:w="7920"/>
+      </w:tblGrid>
+      <w:tr>
+        <w:trPr>
+          <w:cantSplit/>
+        </w:trPr>
+        <w:tc>
+          <w:tcPr>
+            <w:tcMar>
+              <w:left w:w="144" w:type="dxa"/>
+            </w:tcMar>
+          </w:tcPr>
+          <w:p>
+            <w:pPr>
+              <w:pStyle w:val="BodyText"/>
+            </w:pPr>
+            <w:pPr>
+              <w:spacing w:before="16" w:after="64"/>
+            </w:pPr>
+          </w:p>
+          <w:bookmarkStart w:id="145" w:name="def-glm"/>
+          <w:p>
+            <w:pPr>
+              <w:pStyle w:val="BodyText"/>
+            </w:pPr>
+            <w:r>
+              <w:rPr>
+                <w:b/>
+                <w:bCs/>
+              </w:rPr>
+              <w:t xml:space="preserve">Definition 8 (Generalized linear model)</w:t>
+            </w:r>
+            <w:r>
+              <w:t xml:space="preserve"> </w:t>
+            </w:r>
+            <w:r>
+              <w:t xml:space="preserve">A</w:t>
+            </w:r>
+            <w:r>
+              <w:t xml:space="preserve"> </w:t>
+            </w:r>
+            <w:r>
+              <w:rPr>
+                <w:b/>
+                <w:bCs/>
+              </w:rPr>
+              <w:t xml:space="preserve">generalized linear model (GLM)</w:t>
+            </w:r>
+            <w:r>
+              <w:t xml:space="preserve"> </w:t>
+            </w:r>
+            <w:r>
+              <w:t xml:space="preserve">is a regression model (</w:t>
+            </w:r>
+            <w:hyperlink w:anchor="def-regression-model">
+              <w:r>
+                <w:rPr>
+                  <w:rStyle w:val="Hyperlink"/>
+                </w:rPr>
+                <w:t xml:space="preserve">Definition 1</w:t>
+              </w:r>
+            </w:hyperlink>
+            <w:r>
+              <w:t xml:space="preserve">)</w:t>
+            </w:r>
+            <w:r>
+              <w:t xml:space="preserve"> </w:t>
+            </w:r>
+            <w:r>
+              <w:t xml:space="preserve">for an outcome</w:t>
+            </w:r>
+            <w:r>
+              <w:t xml:space="preserve"> </w:t>
+            </w:r>
+            <m:oMath>
+              <m:r>
+                <m:t>Y</m:t>
+              </m:r>
+            </m:oMath>
+            <w:r>
+              <w:t xml:space="preserve"> </w:t>
+            </w:r>
+            <w:r>
+              <w:t xml:space="preserve">given covariates</w:t>
+            </w:r>
+            <w:r>
+              <w:t xml:space="preserve"> </w:t>
+            </w:r>
+            <m:oMath>
+              <m:acc>
+                <m:accPr>
+                  <m:chr m:val="̃"/>
+                </m:accPr>
+                <m:e>
+                  <m:r>
+                    <m:t>X</m:t>
+                  </m:r>
+                </m:e>
+              </m:acc>
+              <m:r>
+                <m:rPr>
+                  <m:sty m:val="p"/>
+                </m:rPr>
+                <m:t>=</m:t>
+              </m:r>
+              <m:acc>
+                <m:accPr>
+                  <m:chr m:val="̃"/>
+                </m:accPr>
+                <m:e>
+                  <m:r>
+                    <m:t>x</m:t>
+                  </m:r>
+                </m:e>
+              </m:acc>
+            </m:oMath>
+            <w:r>
+              <w:t xml:space="preserve"> </w:t>
+            </w:r>
+            <w:r>
+              <w:t xml:space="preserve">with three components</w:t>
+            </w:r>
+            <w:r>
+              <w:t xml:space="preserve"> </w:t>
+            </w:r>
+            <w:r>
+              <w:t xml:space="preserve">(Dobson and Barnett 2018, chap. 3; Dunn and Smyth 2018, chap. 5)</w:t>
+            </w:r>
+            <w:r>
+              <w:t xml:space="preserve">:</w:t>
             </w:r>
           </w:p>
           <w:p>
@@ -16529,17 +16739,216 @@
               </w:numPr>
             </w:pPr>
             <w:r>
-              <w:t xml:space="preserve">a</w:t>
-            </w:r>
-            <w:r>
-              <w:t xml:space="preserve"> </w:t>
-            </w:r>
-            <w:r>
-              <w:rPr>
-                <w:b/>
-                <w:bCs/>
-              </w:rPr>
-              <w:t xml:space="preserve">linear predictor</w:t>
+              <w:t xml:space="preserve">an outcome distribution family (the random component):</w:t>
+            </w:r>
+            <w:r>
+              <w:t xml:space="preserve"> </w:t>
+            </w:r>
+            <w:r>
+              <w:t xml:space="preserve">given</w:t>
+            </w:r>
+            <w:r>
+              <w:t xml:space="preserve"> </w:t>
+            </w:r>
+            <m:oMath>
+              <m:acc>
+                <m:accPr>
+                  <m:chr m:val="̃"/>
+                </m:accPr>
+                <m:e>
+                  <m:r>
+                    <m:t>X</m:t>
+                  </m:r>
+                </m:e>
+              </m:acc>
+              <m:r>
+                <m:rPr>
+                  <m:sty m:val="p"/>
+                </m:rPr>
+                <m:t>=</m:t>
+              </m:r>
+              <m:acc>
+                <m:accPr>
+                  <m:chr m:val="̃"/>
+                </m:accPr>
+                <m:e>
+                  <m:r>
+                    <m:t>x</m:t>
+                  </m:r>
+                </m:e>
+              </m:acc>
+            </m:oMath>
+            <w:r>
+              <w:t xml:space="preserve">,</w:t>
+            </w:r>
+            <w:r>
+              <w:t xml:space="preserve"> </w:t>
+            </w:r>
+            <m:oMath>
+              <m:r>
+                <m:t>Y</m:t>
+              </m:r>
+            </m:oMath>
+            <w:r>
+              <w:t xml:space="preserve"> </w:t>
+            </w:r>
+            <w:r>
+              <w:t xml:space="preserve">follows a specified distribution family,</w:t>
+            </w:r>
+            <w:r>
+              <w:t xml:space="preserve"> </w:t>
+            </w:r>
+            <w:r>
+              <w:t xml:space="preserve">such as Gaussian, Bernoulli, or Poisson,</w:t>
+            </w:r>
+            <w:r>
+              <w:t xml:space="preserve"> </w:t>
+            </w:r>
+            <w:r>
+              <w:t xml:space="preserve">with conditional mean</w:t>
+            </w:r>
+            <w:r>
+              <w:t xml:space="preserve"> </w:t>
+            </w:r>
+            <m:oMath>
+              <m:r>
+                <m:t>μ</m:t>
+              </m:r>
+              <m:r>
+                <m:rPr>
+                  <m:sty m:val="p"/>
+                </m:rPr>
+                <m:t>(</m:t>
+              </m:r>
+              <m:acc>
+                <m:accPr>
+                  <m:chr m:val="̃"/>
+                </m:accPr>
+                <m:e>
+                  <m:r>
+                    <m:t>x</m:t>
+                  </m:r>
+                </m:e>
+              </m:acc>
+              <m:r>
+                <m:rPr>
+                  <m:sty m:val="p"/>
+                </m:rPr>
+                <m:t>)</m:t>
+              </m:r>
+              <m:limUpp>
+                <m:e>
+                  <m:r>
+                    <m:rPr>
+                      <m:sty m:val="p"/>
+                    </m:rPr>
+                    <m:t>=</m:t>
+                  </m:r>
+                </m:e>
+                <m:lim>
+                  <m:r>
+                    <m:rPr>
+                      <m:nor/>
+                      <m:sty m:val="p"/>
+                    </m:rPr>
+                    <m:t>def</m:t>
+                  </m:r>
+                </m:lim>
+              </m:limUpp>
+              <m:r>
+                <m:rPr>
+                  <m:sty m:val="p"/>
+                </m:rPr>
+                <m:t>E</m:t>
+              </m:r>
+              <m:r>
+                <m:t>​</m:t>
+              </m:r>
+              <m:d>
+                <m:dPr>
+                  <m:begChr m:val="["/>
+                  <m:sepChr m:val=""/>
+                  <m:endChr m:val="]"/>
+                  <m:grow/>
+                </m:dPr>
+                <m:e>
+                  <m:r>
+                    <m:t>Y</m:t>
+                  </m:r>
+                  <m:r>
+                    <m:rPr>
+                      <m:sty m:val="p"/>
+                    </m:rPr>
+                    <m:t>|</m:t>
+                  </m:r>
+                  <m:acc>
+                    <m:accPr>
+                      <m:chr m:val="̃"/>
+                    </m:accPr>
+                    <m:e>
+                      <m:r>
+                        <m:t>X</m:t>
+                      </m:r>
+                    </m:e>
+                  </m:acc>
+                  <m:r>
+                    <m:rPr>
+                      <m:sty m:val="p"/>
+                    </m:rPr>
+                    <m:t>=</m:t>
+                  </m:r>
+                  <m:acc>
+                    <m:accPr>
+                      <m:chr m:val="̃"/>
+                    </m:accPr>
+                    <m:e>
+                      <m:r>
+                        <m:t>x</m:t>
+                      </m:r>
+                    </m:e>
+                  </m:acc>
+                </m:e>
+              </m:d>
+              <m:r>
+                <m:t>​</m:t>
+              </m:r>
+            </m:oMath>
+            <w:r>
+              <w:t xml:space="preserve">,</w:t>
+            </w:r>
+            <w:r>
+              <w:t xml:space="preserve"> </w:t>
+            </w:r>
+            <w:r>
+              <w:t xml:space="preserve">and observations are independent given their covariates</w:t>
+            </w:r>
+            <w:r>
+              <w:t xml:space="preserve"> </w:t>
+            </w:r>
+            <w:r>
+              <w:t xml:space="preserve">(</w:t>
+            </w:r>
+            <w:hyperlink w:anchor="def-outcome-distribution">
+              <w:r>
+                <w:rPr>
+                  <w:rStyle w:val="Hyperlink"/>
+                </w:rPr>
+                <w:t xml:space="preserve">Definition 7</w:t>
+              </w:r>
+            </w:hyperlink>
+            <w:r>
+              <w:t xml:space="preserve">);</w:t>
+            </w:r>
+          </w:p>
+          <w:p>
+            <w:pPr>
+              <w:numPr>
+                <w:ilvl w:val="0"/>
+                <w:numId w:val="1030"/>
+              </w:numPr>
+            </w:pPr>
+            <w:r>
+              <w:t xml:space="preserve">a linear predictor</w:t>
             </w:r>
             <w:r>
               <w:t xml:space="preserve"> </w:t>
@@ -16635,17 +17044,7 @@
               </w:numPr>
             </w:pPr>
             <w:r>
-              <w:t xml:space="preserve">a</w:t>
-            </w:r>
-            <w:r>
-              <w:t xml:space="preserve"> </w:t>
-            </w:r>
-            <w:r>
-              <w:rPr>
-                <w:b/>
-                <w:bCs/>
-              </w:rPr>
-              <w:t xml:space="preserve">link function</w:t>
+              <w:t xml:space="preserve">a link function</w:t>
             </w:r>
             <w:r>
               <w:t xml:space="preserve"> </w:t>
@@ -16759,7 +17158,7 @@
               <w:t xml:space="preserve">).</w:t>
             </w:r>
           </w:p>
-          <w:bookmarkEnd w:id="144"/>
+          <w:bookmarkEnd w:id="145"/>
         </w:tc>
       </w:tr>
     </w:tbl>
@@ -16856,7 +17255,7 @@
               <w:bottom w:w="108" w:type="dxa"/>
             </w:tcMar>
           </w:tcPr>
-          <w:bookmarkStart w:id="145" w:name="exm-glm"/>
+          <w:bookmarkStart w:id="146" w:name="exm-glm"/>
           <w:p>
             <w:pPr>
               <w:pStyle w:val="BodyText"/>
@@ -17645,7 +18044,7 @@
               <w:t xml:space="preserve">.</w:t>
             </w:r>
           </w:p>
-          <w:bookmarkEnd w:id="145"/>
+          <w:bookmarkEnd w:id="146"/>
           <w:p/>
         </w:tc>
       </w:tr>
@@ -17684,7 +18083,7 @@
               <w:spacing w:before="16" w:after="64"/>
             </w:pPr>
           </w:p>
-          <w:bookmarkStart w:id="146" w:name="def-interaction"/>
+          <w:bookmarkStart w:id="147" w:name="def-interaction"/>
           <w:p>
             <w:pPr>
               <w:pStyle w:val="BodyText"/>
@@ -17694,7 +18093,7 @@
                 <w:b/>
                 <w:bCs/>
               </w:rPr>
-              <w:t xml:space="preserve">Definition 8 (Interaction)</w:t>
+              <w:t xml:space="preserve">Definition 9 (Interaction)</w:t>
             </w:r>
             <w:r>
               <w:t xml:space="preserve"> </w:t>
@@ -17944,7 +18343,7 @@
               <w:t xml:space="preserve">.</w:t>
             </w:r>
           </w:p>
-          <w:bookmarkEnd w:id="146"/>
+          <w:bookmarkEnd w:id="147"/>
         </w:tc>
       </w:tr>
     </w:tbl>
@@ -17957,7 +18356,7 @@
           <w:rPr>
             <w:rStyle w:val="Hyperlink"/>
           </w:rPr>
-          <w:t xml:space="preserve">Definition 8</w:t>
+          <w:t xml:space="preserve">Definition 9</w:t>
         </w:r>
       </w:hyperlink>
       <w:r>
@@ -17986,7 +18385,7 @@
           <w:rPr>
             <w:rStyle w:val="Hyperlink"/>
           </w:rPr>
-          <w:t xml:space="preserve">Definition 8</w:t>
+          <w:t xml:space="preserve">Definition 9</w:t>
         </w:r>
       </w:hyperlink>
       <w:r>
@@ -18102,7 +18501,7 @@
               <w:spacing w:before="16" w:after="64"/>
             </w:pPr>
           </w:p>
-          <w:bookmarkStart w:id="147" w:name="def-interaction-term"/>
+          <w:bookmarkStart w:id="148" w:name="def-interaction-term"/>
           <w:p>
             <w:pPr>
               <w:pStyle w:val="BodyText"/>
@@ -18112,7 +18511,7 @@
                 <w:b/>
                 <w:bCs/>
               </w:rPr>
-              <w:t xml:space="preserve">Definition 9 (Interaction term)</w:t>
+              <w:t xml:space="preserve">Definition 10 (Interaction term)</w:t>
             </w:r>
             <w:r>
               <w:t xml:space="preserve"> </w:t>
@@ -18420,7 +18819,7 @@
               </m:oMath>
             </m:oMathPara>
           </w:p>
-          <w:bookmarkEnd w:id="147"/>
+          <w:bookmarkEnd w:id="148"/>
         </w:tc>
       </w:tr>
     </w:tbl>
@@ -18476,7 +18875,7 @@
               <w:bottom w:w="108" w:type="dxa"/>
             </w:tcMar>
           </w:tcPr>
-          <w:bookmarkStart w:id="148" w:name="exm-interaction"/>
+          <w:bookmarkStart w:id="149" w:name="exm-interaction"/>
           <w:p>
             <w:pPr>
               <w:pStyle w:val="BodyText"/>
@@ -19427,7 +19826,7 @@
               <w:t xml:space="preserve">.</w:t>
             </w:r>
           </w:p>
-          <w:bookmarkEnd w:id="148"/>
+          <w:bookmarkEnd w:id="149"/>
           <w:p/>
         </w:tc>
       </w:tr>
@@ -19484,7 +19883,7 @@
               <w:bottom w:w="108" w:type="dxa"/>
             </w:tcMar>
           </w:tcPr>
-          <w:bookmarkStart w:id="149" w:name="exm-no-interaction"/>
+          <w:bookmarkStart w:id="150" w:name="exm-no-interaction"/>
           <w:p>
             <w:pPr>
               <w:pStyle w:val="BodyText"/>
@@ -20132,13 +20531,13 @@
               <w:t xml:space="preserve">.</w:t>
             </w:r>
           </w:p>
-          <w:bookmarkEnd w:id="149"/>
+          <w:bookmarkEnd w:id="150"/>
           <w:p/>
         </w:tc>
       </w:tr>
     </w:tbl>
-    <w:bookmarkEnd w:id="150"/>
-    <w:bookmarkStart w:id="155" w:name="sec-why-link"/>
+    <w:bookmarkEnd w:id="151"/>
+    <w:bookmarkStart w:id="156" w:name="sec-why-link"/>
     <w:p>
       <w:pPr>
         <w:pStyle w:val="Heading1"/>
@@ -20247,7 +20646,7 @@
               <w:spacing w:before="16" w:after="64"/>
             </w:pPr>
           </w:p>
-          <w:bookmarkStart w:id="151" w:name="exr-why-link"/>
+          <w:bookmarkStart w:id="152" w:name="exr-why-link"/>
           <w:p>
             <w:pPr>
               <w:pStyle w:val="BodyText"/>
@@ -20308,7 +20707,7 @@
               <w:t xml:space="preserve">as a linear function of the covariates, as in a Gaussian model?</w:t>
             </w:r>
           </w:p>
-          <w:bookmarkEnd w:id="151"/>
+          <w:bookmarkEnd w:id="152"/>
         </w:tc>
       </w:tr>
     </w:tbl>
@@ -20364,7 +20763,7 @@
               <w:bottom w:w="108" w:type="dxa"/>
             </w:tcMar>
           </w:tcPr>
-          <w:bookmarkStart w:id="152" w:name="sol-why-link"/>
+          <w:bookmarkStart w:id="153" w:name="sol-why-link"/>
           <w:p>
             <w:pPr>
               <w:pStyle w:val="BodyText"/>
@@ -20441,7 +20840,7 @@
                 <w:rPr>
                   <w:rStyle w:val="Hyperlink"/>
                 </w:rPr>
-                <w:t xml:space="preserve">Definition 8</w:t>
+                <w:t xml:space="preserve">Definition 9</w:t>
               </w:r>
             </w:hyperlink>
             <w:r>
@@ -21034,7 +21433,7 @@
               <w:t xml:space="preserve">so a probability is never below 0 or above 1.</w:t>
             </w:r>
           </w:p>
-          <w:bookmarkEnd w:id="152"/>
+          <w:bookmarkEnd w:id="153"/>
           <w:p/>
         </w:tc>
       </w:tr>
@@ -21073,7 +21472,7 @@
               <w:spacing w:before="16" w:after="64"/>
             </w:pPr>
           </w:p>
-          <w:bookmarkStart w:id="153" w:name="rem-link-slope-interpretation"/>
+          <w:bookmarkStart w:id="154" w:name="rem-link-slope-interpretation"/>
           <w:p>
             <w:pPr>
               <w:pStyle w:val="BodyText"/>
@@ -21197,7 +21596,7 @@
                 <w:rPr>
                   <w:rStyle w:val="Hyperlink"/>
                 </w:rPr>
-                <w:t xml:space="preserve">Definition 8</w:t>
+                <w:t xml:space="preserve">Definition 9</w:t>
               </w:r>
             </w:hyperlink>
             <w:r>
@@ -21282,7 +21681,7 @@
               <w:t xml:space="preserve">is not linear.</w:t>
             </w:r>
           </w:p>
-          <w:bookmarkEnd w:id="153"/>
+          <w:bookmarkEnd w:id="154"/>
         </w:tc>
       </w:tr>
     </w:tbl>
@@ -21338,7 +21737,7 @@
               <w:bottom w:w="108" w:type="dxa"/>
             </w:tcMar>
           </w:tcPr>
-          <w:bookmarkStart w:id="154" w:name="exm-link-slope-numeric"/>
+          <w:bookmarkStart w:id="155" w:name="exm-link-slope-numeric"/>
           <w:p>
             <w:pPr>
               <w:pStyle w:val="BodyText"/>
@@ -22086,13 +22485,13 @@
               <w:t xml:space="preserve">The odds ratio is the same in both subgroups, but the difference in probabilities is not.</w:t>
             </w:r>
           </w:p>
-          <w:bookmarkEnd w:id="154"/>
+          <w:bookmarkEnd w:id="155"/>
           <w:p/>
         </w:tc>
       </w:tr>
     </w:tbl>
-    <w:bookmarkEnd w:id="155"/>
-    <w:bookmarkStart w:id="178" w:name="sec-canonical-link"/>
+    <w:bookmarkEnd w:id="156"/>
+    <w:bookmarkStart w:id="181" w:name="sec-canonical-link"/>
     <w:p>
       <w:pPr>
         <w:pStyle w:val="Heading1"/>
@@ -22202,7 +22601,7 @@
               <w:spacing w:before="16" w:after="64"/>
             </w:pPr>
           </w:p>
-          <w:bookmarkStart w:id="158" w:name="def-natural-parameter"/>
+          <w:bookmarkStart w:id="159" w:name="def-exponential-dispersion-family"/>
           <w:p>
             <w:pPr>
               <w:pStyle w:val="BodyText"/>
@@ -22212,7 +22611,7 @@
                 <w:b/>
                 <w:bCs/>
               </w:rPr>
-              <w:t xml:space="preserve">Definition 10 (Exponential dispersion family and natural parameter)</w:t>
+              <w:t xml:space="preserve">Definition 11 (Exponential dispersion family)</w:t>
             </w:r>
             <w:r>
               <w:t xml:space="preserve"> </w:t>
@@ -22239,7 +22638,7 @@
             <w:r>
               <w:t xml:space="preserve"> </w:t>
             </w:r>
-            <w:hyperlink r:id="rId156">
+            <w:hyperlink r:id="rId157">
               <w:r>
                 <w:rPr>
                   <w:rStyle w:val="Hyperlink"/>
@@ -22256,7 +22655,7 @@
             <w:r>
               <w:t xml:space="preserve"> </w:t>
             </w:r>
-            <w:hyperlink r:id="rId157">
+            <w:hyperlink r:id="rId158">
               <w:r>
                 <w:rPr>
                   <w:rStyle w:val="Hyperlink"/>
@@ -22500,62 +22899,94 @@
               </m:r>
             </m:oMath>
             <w:r>
+              <w:t xml:space="preserve"> </w:t>
+            </w:r>
+            <w:r>
+              <w:t xml:space="preserve">(Dobson and Barnett 2018, chap. 3; Dunn and Smyth 2018, chap. 5)</w:t>
+            </w:r>
+            <w:r>
               <w:t xml:space="preserve">.</w:t>
             </w:r>
-            <w:r>
-              <w:t xml:space="preserve"> </w:t>
-            </w:r>
-            <w:r>
-              <w:t xml:space="preserve">The parameter</w:t>
-            </w:r>
-            <w:r>
-              <w:t xml:space="preserve"> </w:t>
-            </w:r>
-            <m:oMath>
-              <m:r>
-                <m:t>θ</m:t>
-              </m:r>
-            </m:oMath>
-            <w:r>
-              <w:t xml:space="preserve"> </w:t>
-            </w:r>
-            <w:r>
-              <w:t xml:space="preserve">is the</w:t>
-            </w:r>
-            <w:r>
-              <w:t xml:space="preserve"> </w:t>
-            </w:r>
+          </w:p>
+          <w:bookmarkEnd w:id="159"/>
+        </w:tc>
+      </w:tr>
+    </w:tbl>
+    <w:tbl>
+      <w:tblPr>
+        <w:tblStyle w:val="Table"/>
+        <w:tblInd w:w="164" w:type="dxa"/>
+        <w:tblBorders>
+          <w:left w:val="single" w:sz="24" w:space="0" w:color="909090"/>
+        </w:tblBorders>
+        <w:tblCellMar>
+          <w:left w:w="0" w:type="dxa"/>
+          <w:right w:w="0" w:type="dxa"/>
+        </w:tblCellMar>
+        <w:tblLook w:firstRow="0" w:lastRow="0" w:firstColumn="0" w:lastColumn="0" w:noHBand="0" w:noVBand="0" w:val="0000"/>
+      </w:tblPr>
+      <w:tblGrid>
+        <w:gridCol w:w="7920"/>
+      </w:tblGrid>
+      <w:tr>
+        <w:trPr>
+          <w:cantSplit/>
+        </w:trPr>
+        <w:tc>
+          <w:tcPr>
+            <w:tcMar>
+              <w:left w:w="144" w:type="dxa"/>
+            </w:tcMar>
+          </w:tcPr>
+          <w:p>
+            <w:pPr>
+              <w:pStyle w:val="BodyText"/>
+            </w:pPr>
+            <w:pPr>
+              <w:spacing w:before="16" w:after="64"/>
+            </w:pPr>
+          </w:p>
+          <w:bookmarkStart w:id="160" w:name="def-natural-parameter"/>
+          <w:p>
+            <w:pPr>
+              <w:pStyle w:val="BodyText"/>
+            </w:pPr>
             <w:r>
               <w:rPr>
                 <w:b/>
                 <w:bCs/>
               </w:rPr>
-              <w:t xml:space="preserve">natural parameter</w:t>
-            </w:r>
-            <w:r>
-              <w:t xml:space="preserve">,</w:t>
-            </w:r>
-            <w:r>
-              <w:t xml:space="preserve"> </w:t>
-            </w:r>
-            <w:r>
-              <w:t xml:space="preserve">and</w:t>
+              <w:t xml:space="preserve">Definition 12 (Natural parameter)</w:t>
+            </w:r>
+            <w:r>
+              <w:t xml:space="preserve"> </w:t>
+            </w:r>
+            <w:r>
+              <w:t xml:space="preserve">In an exponential dispersion family (</w:t>
+            </w:r>
+            <w:hyperlink w:anchor="def-exponential-dispersion-family">
+              <w:r>
+                <w:rPr>
+                  <w:rStyle w:val="Hyperlink"/>
+                </w:rPr>
+                <w:t xml:space="preserve">Definition 11</w:t>
+              </w:r>
+            </w:hyperlink>
+            <w:r>
+              <w:t xml:space="preserve">),</w:t>
+            </w:r>
+            <w:r>
+              <w:t xml:space="preserve"> </w:t>
+            </w:r>
+            <w:r>
+              <w:t xml:space="preserve">the parameter</w:t>
             </w:r>
             <w:r>
               <w:t xml:space="preserve"> </w:t>
             </w:r>
             <m:oMath>
               <m:r>
-                <m:t>ϕ</m:t>
-              </m:r>
-              <m:r>
-                <m:rPr>
-                  <m:sty m:val="p"/>
-                </m:rPr>
-                <m:t>&gt;</m:t>
-              </m:r>
-              <m:r>
-                <m:t>0</m:t>
+                <m:t>θ</m:t>
               </m:r>
             </m:oMath>
             <w:r>
@@ -22572,6 +23003,122 @@
                 <w:b/>
                 <w:bCs/>
               </w:rPr>
+              <w:t xml:space="preserve">natural parameter</w:t>
+            </w:r>
+            <w:r>
+              <w:t xml:space="preserve"> </w:t>
+            </w:r>
+            <w:r>
+              <w:t xml:space="preserve">(Dobson and Barnett 2018, chap. 3; Dunn and Smyth 2018, chap. 5)</w:t>
+            </w:r>
+            <w:r>
+              <w:t xml:space="preserve">.</w:t>
+            </w:r>
+          </w:p>
+          <w:bookmarkEnd w:id="160"/>
+        </w:tc>
+      </w:tr>
+    </w:tbl>
+    <w:tbl>
+      <w:tblPr>
+        <w:tblStyle w:val="Table"/>
+        <w:tblInd w:w="164" w:type="dxa"/>
+        <w:tblBorders>
+          <w:left w:val="single" w:sz="24" w:space="0" w:color="909090"/>
+        </w:tblBorders>
+        <w:tblCellMar>
+          <w:left w:w="0" w:type="dxa"/>
+          <w:right w:w="0" w:type="dxa"/>
+        </w:tblCellMar>
+        <w:tblLook w:firstRow="0" w:lastRow="0" w:firstColumn="0" w:lastColumn="0" w:noHBand="0" w:noVBand="0" w:val="0000"/>
+      </w:tblPr>
+      <w:tblGrid>
+        <w:gridCol w:w="7920"/>
+      </w:tblGrid>
+      <w:tr>
+        <w:trPr>
+          <w:cantSplit/>
+        </w:trPr>
+        <w:tc>
+          <w:tcPr>
+            <w:tcMar>
+              <w:left w:w="144" w:type="dxa"/>
+            </w:tcMar>
+          </w:tcPr>
+          <w:p>
+            <w:pPr>
+              <w:pStyle w:val="BodyText"/>
+            </w:pPr>
+            <w:pPr>
+              <w:spacing w:before="16" w:after="64"/>
+            </w:pPr>
+          </w:p>
+          <w:bookmarkStart w:id="161" w:name="def-dispersion-parameter"/>
+          <w:p>
+            <w:pPr>
+              <w:pStyle w:val="BodyText"/>
+            </w:pPr>
+            <w:r>
+              <w:rPr>
+                <w:b/>
+                <w:bCs/>
+              </w:rPr>
+              <w:t xml:space="preserve">Definition 13 (Dispersion parameter)</w:t>
+            </w:r>
+            <w:r>
+              <w:t xml:space="preserve"> </w:t>
+            </w:r>
+            <w:r>
+              <w:t xml:space="preserve">In an exponential dispersion family (</w:t>
+            </w:r>
+            <w:hyperlink w:anchor="def-exponential-dispersion-family">
+              <w:r>
+                <w:rPr>
+                  <w:rStyle w:val="Hyperlink"/>
+                </w:rPr>
+                <w:t xml:space="preserve">Definition 11</w:t>
+              </w:r>
+            </w:hyperlink>
+            <w:r>
+              <w:t xml:space="preserve">),</w:t>
+            </w:r>
+            <w:r>
+              <w:t xml:space="preserve"> </w:t>
+            </w:r>
+            <w:r>
+              <w:t xml:space="preserve">the parameter</w:t>
+            </w:r>
+            <w:r>
+              <w:t xml:space="preserve"> </w:t>
+            </w:r>
+            <m:oMath>
+              <m:r>
+                <m:t>ϕ</m:t>
+              </m:r>
+              <m:r>
+                <m:rPr>
+                  <m:sty m:val="p"/>
+                </m:rPr>
+                <m:t>&gt;</m:t>
+              </m:r>
+              <m:r>
+                <m:t>0</m:t>
+              </m:r>
+            </m:oMath>
+            <w:r>
+              <w:t xml:space="preserve"> </w:t>
+            </w:r>
+            <w:r>
+              <w:t xml:space="preserve">is the</w:t>
+            </w:r>
+            <w:r>
+              <w:t xml:space="preserve"> </w:t>
+            </w:r>
+            <w:r>
+              <w:rPr>
+                <w:b/>
+                <w:bCs/>
+              </w:rPr>
               <w:t xml:space="preserve">dispersion parameter</w:t>
             </w:r>
             <w:r>
@@ -22584,7 +23131,7 @@
               <w:t xml:space="preserve">.</w:t>
             </w:r>
           </w:p>
-          <w:bookmarkEnd w:id="158"/>
+          <w:bookmarkEnd w:id="161"/>
         </w:tc>
       </w:tr>
     </w:tbl>
@@ -22640,7 +23187,7 @@
               <w:bottom w:w="108" w:type="dxa"/>
             </w:tcMar>
           </w:tcPr>
-          <w:bookmarkStart w:id="160" w:name="exm-edf-poisson-bernoulli"/>
+          <w:bookmarkStart w:id="163" w:name="exm-edf-poisson-bernoulli"/>
           <w:p>
             <w:pPr>
               <w:pStyle w:val="BodyText"/>
@@ -23049,7 +23596,7 @@
             <w:r>
               <w:t xml:space="preserve"> </w:t>
             </w:r>
-            <w:hyperlink r:id="rId159">
+            <w:hyperlink r:id="rId162">
               <w:r>
                 <w:rPr>
                   <w:rStyle w:val="Hyperlink"/>
@@ -24381,7 +24928,7 @@
               <w:t xml:space="preserve">: TRUE.</w:t>
             </w:r>
           </w:p>
-          <w:bookmarkEnd w:id="160"/>
+          <w:bookmarkEnd w:id="163"/>
           <w:p/>
         </w:tc>
       </w:tr>
@@ -24438,7 +24985,7 @@
               <w:bottom w:w="108" w:type="dxa"/>
             </w:tcMar>
           </w:tcPr>
-          <w:bookmarkStart w:id="161" w:name="exm-edf-gaussian"/>
+          <w:bookmarkStart w:id="164" w:name="exm-edf-gaussian"/>
           <w:p>
             <w:pPr>
               <w:pStyle w:val="BodyText"/>
@@ -25288,12 +25835,12 @@
             <w:r>
               <w:t xml:space="preserve"> </w:t>
             </w:r>
-            <w:hyperlink w:anchor="def-natural-parameter">
+            <w:hyperlink w:anchor="def-exponential-dispersion-family">
               <w:r>
                 <w:rPr>
                   <w:rStyle w:val="Hyperlink"/>
                 </w:rPr>
-                <w:t xml:space="preserve">Definition 10</w:t>
+                <w:t xml:space="preserve">Definition 11</w:t>
               </w:r>
             </w:hyperlink>
             <w:r>
@@ -26373,7 +26920,7 @@
               <w:t xml:space="preserve">.</w:t>
             </w:r>
           </w:p>
-          <w:bookmarkEnd w:id="161"/>
+          <w:bookmarkEnd w:id="164"/>
           <w:p/>
         </w:tc>
       </w:tr>
@@ -26412,7 +26959,7 @@
               <w:spacing w:before="16" w:after="64"/>
             </w:pPr>
           </w:p>
-          <w:bookmarkStart w:id="162" w:name="thm-edf-mean-variance"/>
+          <w:bookmarkStart w:id="165" w:name="thm-edf-mean-variance"/>
           <w:p>
             <w:pPr>
               <w:pStyle w:val="BodyText"/>
@@ -26494,12 +27041,12 @@
             <w:r>
               <w:t xml:space="preserve"> </w:t>
             </w:r>
-            <w:hyperlink w:anchor="def-natural-parameter">
+            <w:hyperlink w:anchor="def-exponential-dispersion-family">
               <w:r>
                 <w:rPr>
                   <w:rStyle w:val="Hyperlink"/>
                 </w:rPr>
-                <w:t xml:space="preserve">Definition 10</w:t>
+                <w:t xml:space="preserve">Definition 11</w:t>
               </w:r>
             </w:hyperlink>
             <w:r>
@@ -26723,7 +27270,7 @@
               <w:t xml:space="preserve">.</w:t>
             </w:r>
           </w:p>
-          <w:bookmarkEnd w:id="162"/>
+          <w:bookmarkEnd w:id="165"/>
         </w:tc>
       </w:tr>
     </w:tbl>
@@ -29026,7 +29573,7 @@
               <w:bottom w:w="108" w:type="dxa"/>
             </w:tcMar>
           </w:tcPr>
-          <w:bookmarkStart w:id="163" w:name="exm-edf-mean-variance"/>
+          <w:bookmarkStart w:id="166" w:name="exm-edf-mean-variance"/>
           <w:p>
             <w:pPr>
               <w:pStyle w:val="BodyText"/>
@@ -31123,7 +31670,7 @@
               <w:t xml:space="preserve">Each result matches the familiar mean and variance of that distribution.</w:t>
             </w:r>
           </w:p>
-          <w:bookmarkEnd w:id="163"/>
+          <w:bookmarkEnd w:id="166"/>
           <w:p/>
         </w:tc>
       </w:tr>
@@ -31162,7 +31709,7 @@
               <w:spacing w:before="16" w:after="64"/>
             </w:pPr>
           </w:p>
-          <w:bookmarkStart w:id="164" w:name="def-variance-function"/>
+          <w:bookmarkStart w:id="167" w:name="def-variance-function"/>
           <w:p>
             <w:pPr>
               <w:pStyle w:val="BodyText"/>
@@ -31172,7 +31719,7 @@
                 <w:b/>
                 <w:bCs/>
               </w:rPr>
-              <w:t xml:space="preserve">Definition 11 (Variance function)</w:t>
+              <w:t xml:space="preserve">Definition 14 (Variance function)</w:t>
             </w:r>
             <w:r>
               <w:t xml:space="preserve"> </w:t>
@@ -31180,12 +31727,12 @@
             <w:r>
               <w:t xml:space="preserve">In an exponential dispersion family (</w:t>
             </w:r>
-            <w:hyperlink w:anchor="def-natural-parameter">
+            <w:hyperlink w:anchor="def-exponential-dispersion-family">
               <w:r>
                 <w:rPr>
                   <w:rStyle w:val="Hyperlink"/>
                 </w:rPr>
-                <w:t xml:space="preserve">Definition 10</w:t>
+                <w:t xml:space="preserve">Definition 11</w:t>
               </w:r>
             </w:hyperlink>
             <w:r>
@@ -31352,7 +31899,7 @@
               <w:t xml:space="preserve">.</w:t>
             </w:r>
           </w:p>
-          <w:bookmarkEnd w:id="164"/>
+          <w:bookmarkEnd w:id="167"/>
         </w:tc>
       </w:tr>
     </w:tbl>
@@ -31408,7 +31955,7 @@
               <w:bottom w:w="108" w:type="dxa"/>
             </w:tcMar>
           </w:tcPr>
-          <w:bookmarkStart w:id="165" w:name="exm-variance-function"/>
+          <w:bookmarkStart w:id="168" w:name="exm-variance-function"/>
           <w:p>
             <w:pPr>
               <w:pStyle w:val="BodyText"/>
@@ -32279,7 +32826,7 @@
               <w:t xml:space="preserve">approaches 0 or 1.</w:t>
             </w:r>
           </w:p>
-          <w:bookmarkEnd w:id="165"/>
+          <w:bookmarkEnd w:id="168"/>
           <w:p/>
         </w:tc>
       </w:tr>
@@ -32318,7 +32865,7 @@
               <w:spacing w:before="16" w:after="64"/>
             </w:pPr>
           </w:p>
-          <w:bookmarkStart w:id="166" w:name="rem-variance-function-variance"/>
+          <w:bookmarkStart w:id="169" w:name="rem-variance-function-variance"/>
           <w:p>
             <w:pPr>
               <w:pStyle w:val="BodyText"/>
@@ -32361,7 +32908,7 @@
                 <w:rPr>
                   <w:rStyle w:val="Hyperlink"/>
                 </w:rPr>
-                <w:t xml:space="preserve">Definition 11</w:t>
+                <w:t xml:space="preserve">Definition 14</w:t>
               </w:r>
             </w:hyperlink>
             <w:r>
@@ -32431,7 +32978,7 @@
               <w:t xml:space="preserve">.</w:t>
             </w:r>
           </w:p>
-          <w:bookmarkEnd w:id="166"/>
+          <w:bookmarkEnd w:id="169"/>
         </w:tc>
       </w:tr>
     </w:tbl>
@@ -32469,7 +33016,7 @@
               <w:spacing w:before="16" w:after="64"/>
             </w:pPr>
           </w:p>
-          <w:bookmarkStart w:id="167" w:name="def-canonical-link"/>
+          <w:bookmarkStart w:id="170" w:name="def-canonical-link"/>
           <w:p>
             <w:pPr>
               <w:pStyle w:val="BodyText"/>
@@ -32479,7 +33026,7 @@
                 <w:b/>
                 <w:bCs/>
               </w:rPr>
-              <w:t xml:space="preserve">Definition 12 (Canonical link)</w:t>
+              <w:t xml:space="preserve">Definition 15 (Canonical link)</w:t>
             </w:r>
             <w:r>
               <w:t xml:space="preserve"> </w:t>
@@ -32487,12 +33034,12 @@
             <w:r>
               <w:t xml:space="preserve">In an exponential dispersion family (</w:t>
             </w:r>
-            <w:hyperlink w:anchor="def-natural-parameter">
+            <w:hyperlink w:anchor="def-exponential-dispersion-family">
               <w:r>
                 <w:rPr>
                   <w:rStyle w:val="Hyperlink"/>
                 </w:rPr>
-                <w:t xml:space="preserve">Definition 10</w:t>
+                <w:t xml:space="preserve">Definition 11</w:t>
               </w:r>
             </w:hyperlink>
             <w:r>
@@ -32641,7 +33188,7 @@
               <w:t xml:space="preserve">.</w:t>
             </w:r>
           </w:p>
-          <w:bookmarkEnd w:id="167"/>
+          <w:bookmarkEnd w:id="170"/>
         </w:tc>
       </w:tr>
     </w:tbl>
@@ -32679,7 +33226,7 @@
               <w:spacing w:before="16" w:after="64"/>
             </w:pPr>
           </w:p>
-          <w:bookmarkStart w:id="168" w:name="thm-canonical-link-inverse"/>
+          <w:bookmarkStart w:id="171" w:name="thm-canonical-link-inverse"/>
           <w:p>
             <w:pPr>
               <w:pStyle w:val="BodyText"/>
@@ -32728,12 +33275,12 @@
             <w:r>
               <w:t xml:space="preserve">In an exponential dispersion family (</w:t>
             </w:r>
-            <w:hyperlink w:anchor="def-natural-parameter">
+            <w:hyperlink w:anchor="def-exponential-dispersion-family">
               <w:r>
                 <w:rPr>
                   <w:rStyle w:val="Hyperlink"/>
                 </w:rPr>
-                <w:t xml:space="preserve">Definition 10</w:t>
+                <w:t xml:space="preserve">Definition 11</w:t>
               </w:r>
             </w:hyperlink>
             <w:r>
@@ -32889,11 +33436,11 @@
                   </m:rPr>
                   <m:t>=</m:t>
                 </m:r>
-                <m:r>
-                  <m:t>​</m:t>
-                </m:r>
                 <m:sSup>
                   <m:e>
+                    <m:r>
+                      <m:t>​</m:t>
+                    </m:r>
                     <m:d>
                       <m:dPr>
                         <m:begChr m:val="("/>
@@ -32919,6 +33466,9 @@
                         </m:sSup>
                       </m:e>
                     </m:d>
+                    <m:r>
+                      <m:t>​</m:t>
+                    </m:r>
                   </m:e>
                   <m:sup>
                     <m:r>
@@ -32932,9 +33482,6 @@
                     </m:r>
                   </m:sup>
                 </m:sSup>
-                <m:r>
-                  <m:t>​</m:t>
-                </m:r>
                 <m:r>
                   <m:rPr>
                     <m:sty m:val="p"/>
@@ -32953,7 +33500,7 @@
               </m:oMath>
             </m:oMathPara>
           </w:p>
-          <w:bookmarkEnd w:id="168"/>
+          <w:bookmarkEnd w:id="171"/>
         </w:tc>
       </w:tr>
     </w:tbl>
@@ -33131,11 +33678,11 @@
               <w:t xml:space="preserve"> </w:t>
             </w:r>
             <m:oMath>
-              <m:r>
-                <m:t>​</m:t>
-              </m:r>
               <m:sSup>
                 <m:e>
+                  <m:r>
+                    <m:t>​</m:t>
+                  </m:r>
                   <m:d>
                     <m:dPr>
                       <m:begChr m:val="("/>
@@ -33161,6 +33708,9 @@
                       </m:sSup>
                     </m:e>
                   </m:d>
+                  <m:r>
+                    <m:t>​</m:t>
+                  </m:r>
                 </m:e>
                 <m:sup>
                   <m:r>
@@ -33174,9 +33724,6 @@
                   </m:r>
                 </m:sup>
               </m:sSup>
-              <m:r>
-                <m:t>​</m:t>
-              </m:r>
             </m:oMath>
             <w:r>
               <w:t xml:space="preserve"> </w:t>
@@ -33273,11 +33820,11 @@
                     </m:r>
                   </m:e>
                   <m:e>
-                    <m:r>
-                      <m:t>​</m:t>
-                    </m:r>
                     <m:sSup>
                       <m:e>
+                        <m:r>
+                          <m:t>​</m:t>
+                        </m:r>
                         <m:d>
                           <m:dPr>
                             <m:begChr m:val="("/>
@@ -33303,6 +33850,9 @@
                             </m:sSup>
                           </m:e>
                         </m:d>
+                        <m:r>
+                          <m:t>​</m:t>
+                        </m:r>
                       </m:e>
                       <m:sup>
                         <m:r>
@@ -33317,9 +33867,6 @@
                       </m:sup>
                     </m:sSup>
                     <m:r>
-                      <m:t>​</m:t>
-                    </m:r>
-                    <m:r>
                       <m:rPr>
                         <m:sty m:val="p"/>
                       </m:rPr>
@@ -33358,12 +33905,12 @@
                         <m:sty m:val="p"/>
                       </m:rPr>
                       <m:t>(apply </m:t>
-                    </m:r>
-                    <m:r>
-                      <m:t>​</m:t>
                     </m:r>
                     <m:sSup>
                       <m:e>
+                        <m:r>
+                          <m:t>​</m:t>
+                        </m:r>
                         <m:d>
                           <m:dPr>
                             <m:begChr m:val="("/>
@@ -33389,6 +33936,9 @@
                             </m:sSup>
                           </m:e>
                         </m:d>
+                        <m:r>
+                          <m:t>​</m:t>
+                        </m:r>
                       </m:e>
                       <m:sup>
                         <m:r>
@@ -33402,9 +33952,6 @@
                         </m:r>
                       </m:sup>
                     </m:sSup>
-                    <m:r>
-                      <m:t>​</m:t>
-                    </m:r>
                     <m:r>
                       <m:rPr>
                         <m:nor/>
@@ -33632,7 +34179,7 @@
               <w:bottom w:w="108" w:type="dxa"/>
             </w:tcMar>
           </w:tcPr>
-          <w:bookmarkStart w:id="169" w:name="exm-canonical-links"/>
+          <w:bookmarkStart w:id="172" w:name="exm-canonical-links"/>
           <w:p>
             <w:pPr>
               <w:pStyle w:val="BodyText"/>
@@ -33794,11 +34341,11 @@
               <w:t xml:space="preserve"> </w:t>
             </w:r>
             <m:oMath>
-              <m:r>
-                <m:t>​</m:t>
-              </m:r>
               <m:sSup>
                 <m:e>
+                  <m:r>
+                    <m:t>​</m:t>
+                  </m:r>
                   <m:d>
                     <m:dPr>
                       <m:begChr m:val="("/>
@@ -33824,6 +34371,9 @@
                       </m:sSup>
                     </m:e>
                   </m:d>
+                  <m:r>
+                    <m:t>​</m:t>
+                  </m:r>
                 </m:e>
                 <m:sup>
                   <m:r>
@@ -33837,9 +34387,6 @@
                   </m:r>
                 </m:sup>
               </m:sSup>
-              <m:r>
-                <m:t>​</m:t>
-              </m:r>
               <m:r>
                 <m:rPr>
                   <m:sty m:val="p"/>
@@ -35007,7 +35554,7 @@
               <w:t xml:space="preserve">.</w:t>
             </w:r>
           </w:p>
-          <w:bookmarkEnd w:id="169"/>
+          <w:bookmarkEnd w:id="172"/>
           <w:p/>
         </w:tc>
       </w:tr>
@@ -35064,7 +35611,7 @@
               <w:bottom w:w="108" w:type="dxa"/>
             </w:tcMar>
           </w:tcPr>
-          <w:bookmarkStart w:id="170" w:name="exm-noncanonical-link"/>
+          <w:bookmarkStart w:id="173" w:name="exm-noncanonical-link"/>
           <w:p>
             <w:pPr>
               <w:pStyle w:val="BodyText"/>
@@ -35382,12 +35929,12 @@
               <w:t xml:space="preserve">).</w:t>
             </w:r>
           </w:p>
-          <w:bookmarkEnd w:id="170"/>
+          <w:bookmarkEnd w:id="173"/>
           <w:p/>
         </w:tc>
       </w:tr>
     </w:tbl>
-    <w:bookmarkStart w:id="177" w:name="X753ec4f5c77d18b7f6dfaed9f2c6dfed7b3e62a"/>
+    <w:bookmarkStart w:id="180" w:name="X753ec4f5c77d18b7f6dfaed9f2c6dfed7b3e62a"/>
     <w:p>
       <w:pPr>
         <w:pStyle w:val="Heading2"/>
@@ -35430,7 +35977,7 @@
               <w:spacing w:before="16" w:after="64"/>
             </w:pPr>
           </w:p>
-          <w:bookmarkStart w:id="172" w:name="thm-canonical-score"/>
+          <w:bookmarkStart w:id="175" w:name="thm-canonical-score"/>
           <w:p>
             <w:pPr>
               <w:pStyle w:val="BodyText"/>
@@ -35453,7 +36000,7 @@
                 <w:rPr>
                   <w:rStyle w:val="Hyperlink"/>
                 </w:rPr>
-                <w:t xml:space="preserve">Definition 7</w:t>
+                <w:t xml:space="preserve">Definition 8</w:t>
               </w:r>
             </w:hyperlink>
             <w:r>
@@ -35588,12 +36135,12 @@
             <w:r>
               <w:t xml:space="preserve">(</w:t>
             </w:r>
-            <w:hyperlink w:anchor="def-natural-parameter">
+            <w:hyperlink w:anchor="def-exponential-dispersion-family">
               <w:r>
                 <w:rPr>
                   <w:rStyle w:val="Hyperlink"/>
                 </w:rPr>
-                <w:t xml:space="preserve">Definition 10</w:t>
+                <w:t xml:space="preserve">Definition 11</w:t>
               </w:r>
             </w:hyperlink>
             <w:r>
@@ -35670,7 +36217,7 @@
                 <w:rPr>
                   <w:rStyle w:val="Hyperlink"/>
                 </w:rPr>
-                <w:t xml:space="preserve">Definition 12</w:t>
+                <w:t xml:space="preserve">Definition 15</w:t>
               </w:r>
             </w:hyperlink>
             <w:r>
@@ -35854,7 +36401,7 @@
             <w:pPr>
               <w:pStyle w:val="BodyText"/>
             </w:pPr>
-            <w:bookmarkStart w:id="171" w:name="eq-canonical-score"/>
+            <w:bookmarkStart w:id="174" w:name="eq-canonical-score"/>
             <m:oMathPara>
               <m:oMathParaPr>
                 <m:jc m:val="center"/>
@@ -36116,7 +36663,7 @@
                 </m:r>
               </m:oMath>
             </m:oMathPara>
-            <w:bookmarkEnd w:id="171"/>
+            <w:bookmarkEnd w:id="174"/>
           </w:p>
           <w:p>
             <w:pPr>
@@ -36129,7 +36676,7 @@
               <w:t xml:space="preserve">.</w:t>
             </w:r>
           </w:p>
-          <w:bookmarkEnd w:id="172"/>
+          <w:bookmarkEnd w:id="175"/>
         </w:tc>
       </w:tr>
     </w:tbl>
@@ -38087,7 +38634,7 @@
               <w:bottom w:w="108" w:type="dxa"/>
             </w:tcMar>
           </w:tcPr>
-          <w:bookmarkStart w:id="173" w:name="exm-canonical-score"/>
+          <w:bookmarkStart w:id="176" w:name="exm-canonical-score"/>
           <w:p>
             <w:pPr>
               <w:pStyle w:val="BodyText"/>
@@ -39411,7 +39958,7 @@
               <w:t xml:space="preserve">from 1 would increase the log-likelihood.</w:t>
             </w:r>
           </w:p>
-          <w:bookmarkEnd w:id="173"/>
+          <w:bookmarkEnd w:id="176"/>
           <w:p/>
         </w:tc>
       </w:tr>
@@ -39426,7 +39973,7 @@
       <w:r>
         <w:t xml:space="preserve"> </w:t>
       </w:r>
-      <w:hyperlink r:id="rId174">
+      <w:hyperlink r:id="rId177">
         <w:r>
           <w:rPr>
             <w:rStyle w:val="Hyperlink"/>
@@ -39449,7 +39996,7 @@
       <w:r>
         <w:t xml:space="preserve"> </w:t>
       </w:r>
-      <w:hyperlink r:id="rId175">
+      <w:hyperlink r:id="rId178">
         <w:r>
           <w:rPr>
             <w:rStyle w:val="Hyperlink"/>
@@ -39516,7 +40063,7 @@
               <w:bottom w:w="108" w:type="dxa"/>
             </w:tcMar>
           </w:tcPr>
-          <w:bookmarkStart w:id="176" w:name="exm-noncanonical-score"/>
+          <w:bookmarkStart w:id="179" w:name="exm-noncanonical-score"/>
           <w:p>
             <w:pPr>
               <w:pStyle w:val="BodyText"/>
@@ -40747,14 +41294,14 @@
               <w:t xml:space="preserve">.</w:t>
             </w:r>
           </w:p>
-          <w:bookmarkEnd w:id="176"/>
+          <w:bookmarkEnd w:id="179"/>
           <w:p/>
         </w:tc>
       </w:tr>
     </w:tbl>
-    <w:bookmarkEnd w:id="177"/>
-    <w:bookmarkEnd w:id="178"/>
-    <w:bookmarkStart w:id="219" w:name="sec-glm-fitting"/>
+    <w:bookmarkEnd w:id="180"/>
+    <w:bookmarkEnd w:id="181"/>
+    <w:bookmarkStart w:id="222" w:name="sec-glm-fitting"/>
     <w:p>
       <w:pPr>
         <w:pStyle w:val="Heading1"/>
@@ -40930,7 +41477,7 @@
         <w:t xml:space="preserve">that precedes these four steps.</w:t>
       </w:r>
     </w:p>
-    <w:bookmarkStart w:id="189" w:name="step-0-exploratory-data-analysis"/>
+    <w:bookmarkStart w:id="192" w:name="step-0-exploratory-data-analysis"/>
     <w:p>
       <w:pPr>
         <w:pStyle w:val="Heading2"/>
@@ -41002,7 +41549,7 @@
       <w:r>
         <w:t xml:space="preserve"> </w:t>
       </w:r>
-      <w:hyperlink r:id="rId179">
+      <w:hyperlink r:id="rId182">
         <w:r>
           <w:rPr>
             <w:rStyle w:val="Hyperlink"/>
@@ -41019,7 +41566,7 @@
       <w:r>
         <w:t xml:space="preserve"> </w:t>
       </w:r>
-      <w:hyperlink r:id="rId180">
+      <w:hyperlink r:id="rId183">
         <w:r>
           <w:rPr>
             <w:rStyle w:val="Hyperlink"/>
@@ -41051,7 +41598,7 @@
       <w:r>
         <w:t xml:space="preserve"> </w:t>
       </w:r>
-      <w:hyperlink r:id="rId181">
+      <w:hyperlink r:id="rId184">
         <w:r>
           <w:rPr>
             <w:rStyle w:val="Hyperlink"/>
@@ -41106,7 +41653,7 @@
       <w:r>
         <w:t xml:space="preserve"> </w:t>
       </w:r>
-      <w:hyperlink r:id="rId182">
+      <w:hyperlink r:id="rId185">
         <w:r>
           <w:rPr>
             <w:rStyle w:val="Hyperlink"/>
@@ -41152,7 +41699,7 @@
       <w:r>
         <w:t xml:space="preserve"> </w:t>
       </w:r>
-      <w:hyperlink r:id="rId183">
+      <w:hyperlink r:id="rId186">
         <w:r>
           <w:rPr>
             <w:rStyle w:val="Hyperlink"/>
@@ -41175,7 +41722,7 @@
       <w:r>
         <w:t xml:space="preserve"> </w:t>
       </w:r>
-      <w:hyperlink r:id="rId184">
+      <w:hyperlink r:id="rId187">
         <w:r>
           <w:rPr>
             <w:rStyle w:val="Hyperlink"/>
@@ -41278,7 +41825,7 @@
               <w:bottom w:w="108" w:type="dxa"/>
             </w:tcMar>
           </w:tcPr>
-          <w:bookmarkStart w:id="188" w:name="exm-chronic-eda"/>
+          <w:bookmarkStart w:id="191" w:name="exm-chronic-eda"/>
           <w:p>
             <w:pPr>
               <w:pStyle w:val="BodyText"/>
@@ -41867,7 +42414,7 @@
             <w:r>
               <w:t xml:space="preserve">(</w:t>
             </w:r>
-            <w:hyperlink r:id="rId181">
+            <w:hyperlink r:id="rId184">
               <w:r>
                 <w:rPr>
                   <w:rStyle w:val="Hyperlink"/>
@@ -41881,7 +42428,7 @@
             <w:r>
               <w:t xml:space="preserve"> </w:t>
             </w:r>
-            <w:hyperlink r:id="rId185">
+            <w:hyperlink r:id="rId188">
               <w:r>
                 <w:rPr>
                   <w:rStyle w:val="Hyperlink"/>
@@ -41963,7 +42510,7 @@
             <w:r>
               <w:t xml:space="preserve">(</w:t>
             </w:r>
-            <w:hyperlink r:id="rId186">
+            <w:hyperlink r:id="rId189">
               <w:r>
                 <w:rPr>
                   <w:rStyle w:val="Hyperlink"/>
@@ -42009,7 +42556,7 @@
             <w:tr>
               <w:tc>
                 <w:tcPr/>
-                <w:bookmarkStart w:id="187" w:name="tbl-chronic-counts"/>
+                <w:bookmarkStart w:id="190" w:name="tbl-chronic-counts"/>
                 <w:p>
                   <w:pPr>
                     <w:jc w:val="center"/>
@@ -42164,17 +42711,17 @@
                     <w:t xml:space="preserve">#&gt;   country  9  8  5  1  0</w:t>
                   </w:r>
                 </w:p>
-                <w:bookmarkEnd w:id="187"/>
+                <w:bookmarkEnd w:id="190"/>
               </w:tc>
             </w:tr>
           </w:tbl>
-          <w:bookmarkEnd w:id="188"/>
+          <w:bookmarkEnd w:id="191"/>
           <w:p/>
         </w:tc>
       </w:tr>
     </w:tbl>
-    <w:bookmarkEnd w:id="189"/>
-    <w:bookmarkStart w:id="191" w:name="step-1-model-specification"/>
+    <w:bookmarkEnd w:id="192"/>
+    <w:bookmarkStart w:id="194" w:name="step-1-model-specification"/>
     <w:p>
       <w:pPr>
         <w:pStyle w:val="Heading2"/>
@@ -42470,7 +43017,7 @@
               <w:bottom w:w="108" w:type="dxa"/>
             </w:tcMar>
           </w:tcPr>
-          <w:bookmarkStart w:id="190" w:name="exm-chronic-spec"/>
+          <w:bookmarkStart w:id="193" w:name="exm-chronic-spec"/>
           <w:p>
             <w:pPr>
               <w:pStyle w:val="BodyText"/>
@@ -43526,13 +44073,13 @@
               </m:oMath>
             </m:oMathPara>
           </w:p>
-          <w:bookmarkEnd w:id="190"/>
+          <w:bookmarkEnd w:id="193"/>
           <w:p/>
         </w:tc>
       </w:tr>
     </w:tbl>
-    <w:bookmarkEnd w:id="191"/>
-    <w:bookmarkStart w:id="201" w:name="step-2-parameter-estimation"/>
+    <w:bookmarkEnd w:id="194"/>
+    <w:bookmarkStart w:id="204" w:name="step-2-parameter-estimation"/>
     <w:p>
       <w:pPr>
         <w:pStyle w:val="Heading2"/>
@@ -43580,7 +44127,7 @@
       <w:r>
         <w:t xml:space="preserve"> </w:t>
       </w:r>
-      <w:hyperlink r:id="rId192">
+      <w:hyperlink r:id="rId195">
         <w:r>
           <w:rPr>
             <w:rStyle w:val="Hyperlink"/>
@@ -43668,7 +44215,7 @@
               <w:bottom w:w="108" w:type="dxa"/>
             </w:tcMar>
           </w:tcPr>
-          <w:bookmarkStart w:id="195" w:name="exm-chronic-mle"/>
+          <w:bookmarkStart w:id="198" w:name="exm-chronic-mle"/>
           <w:p>
             <w:pPr>
               <w:pStyle w:val="BodyText"/>
@@ -46806,7 +47353,7 @@
             <w:r>
               <w:t xml:space="preserve"> </w:t>
             </w:r>
-            <w:hyperlink r:id="rId193">
+            <w:hyperlink r:id="rId196">
               <w:r>
                 <w:rPr>
                   <w:rStyle w:val="Hyperlink"/>
@@ -48004,7 +48551,7 @@
             <w:r>
               <w:t xml:space="preserve"> </w:t>
             </w:r>
-            <w:hyperlink r:id="rId194">
+            <w:hyperlink r:id="rId197">
               <w:r>
                 <w:rPr>
                   <w:rStyle w:val="Hyperlink"/>
@@ -48021,7 +48568,7 @@
             <w:r>
               <w:t xml:space="preserve"> </w:t>
             </w:r>
-            <w:hyperlink r:id="rId186">
+            <w:hyperlink r:id="rId189">
               <w:r>
                 <w:rPr>
                   <w:rStyle w:val="Hyperlink"/>
@@ -48157,7 +48704,7 @@
               <w:t xml:space="preserve">for country women.</w:t>
             </w:r>
           </w:p>
-          <w:bookmarkEnd w:id="195"/>
+          <w:bookmarkEnd w:id="198"/>
           <w:p/>
         </w:tc>
       </w:tr>
@@ -48214,7 +48761,7 @@
               <w:bottom w:w="108" w:type="dxa"/>
             </w:tcMar>
           </w:tcPr>
-          <w:bookmarkStart w:id="200" w:name="exm-chronic-concavity"/>
+          <w:bookmarkStart w:id="203" w:name="exm-chronic-concavity"/>
           <w:p>
             <w:pPr>
               <w:pStyle w:val="BodyText"/>
@@ -48415,7 +48962,7 @@
             <w:r>
               <w:t xml:space="preserve">(</w:t>
             </w:r>
-            <w:hyperlink r:id="rId196">
+            <w:hyperlink r:id="rId199">
               <w:r>
                 <w:rPr>
                   <w:rStyle w:val="Hyperlink"/>
@@ -49091,7 +49638,7 @@
             <w:r>
               <w:t xml:space="preserve"> </w:t>
             </w:r>
-            <w:hyperlink r:id="rId197">
+            <w:hyperlink r:id="rId200">
               <w:r>
                 <w:rPr>
                   <w:rStyle w:val="Hyperlink"/>
@@ -49992,7 +50539,7 @@
             <w:r>
               <w:t xml:space="preserve"> </w:t>
             </w:r>
-            <w:hyperlink r:id="rId198">
+            <w:hyperlink r:id="rId201">
               <w:r>
                 <w:rPr>
                   <w:rStyle w:val="Hyperlink"/>
@@ -50012,7 +50559,7 @@
             <w:r>
               <w:t xml:space="preserve"> </w:t>
             </w:r>
-            <w:hyperlink r:id="rId199">
+            <w:hyperlink r:id="rId202">
               <w:r>
                 <w:rPr>
                   <w:rStyle w:val="Hyperlink"/>
@@ -50027,13 +50574,13 @@
               <w:t xml:space="preserve">we found is its unique maximum.</w:t>
             </w:r>
           </w:p>
-          <w:bookmarkEnd w:id="200"/>
+          <w:bookmarkEnd w:id="203"/>
           <w:p/>
         </w:tc>
       </w:tr>
     </w:tbl>
-    <w:bookmarkEnd w:id="201"/>
-    <w:bookmarkStart w:id="212" w:name="step-3-checking-model-adequacy"/>
+    <w:bookmarkEnd w:id="204"/>
+    <w:bookmarkStart w:id="215" w:name="step-3-checking-model-adequacy"/>
     <w:p>
       <w:pPr>
         <w:pStyle w:val="Heading2"/>
@@ -50064,7 +50611,7 @@
       <w:r>
         <w:t xml:space="preserve"> </w:t>
       </w:r>
-      <w:hyperlink r:id="rId202">
+      <w:hyperlink r:id="rId205">
         <w:r>
           <w:rPr>
             <w:rStyle w:val="Hyperlink"/>
@@ -50084,7 +50631,7 @@
       <w:r>
         <w:t xml:space="preserve"> </w:t>
       </w:r>
-      <w:hyperlink r:id="rId194">
+      <w:hyperlink r:id="rId197">
         <w:r>
           <w:rPr>
             <w:rStyle w:val="Hyperlink"/>
@@ -50230,7 +50777,7 @@
               <w:spacing w:before="16" w:after="64"/>
             </w:pPr>
           </w:p>
-          <w:bookmarkStart w:id="203" w:name="def-pearson-residual-glm"/>
+          <w:bookmarkStart w:id="206" w:name="def-pearson-residual-glm"/>
           <w:p>
             <w:pPr>
               <w:pStyle w:val="BodyText"/>
@@ -50240,7 +50787,7 @@
                 <w:b/>
                 <w:bCs/>
               </w:rPr>
-              <w:t xml:space="preserve">Definition 13 (Pearson residual)</w:t>
+              <w:t xml:space="preserve">Definition 16 (Pearson residual)</w:t>
             </w:r>
             <w:r>
               <w:t xml:space="preserve"> </w:t>
@@ -50282,7 +50829,7 @@
                 <w:rPr>
                   <w:rStyle w:val="Hyperlink"/>
                 </w:rPr>
-                <w:t xml:space="preserve">Definition 11</w:t>
+                <w:t xml:space="preserve">Definition 14</w:t>
               </w:r>
             </w:hyperlink>
             <w:r>
@@ -50496,7 +51043,7 @@
               <w:t xml:space="preserve">(Dunn and Smyth 2018, chap. 7 and 8)</w:t>
             </w:r>
           </w:p>
-          <w:bookmarkEnd w:id="203"/>
+          <w:bookmarkEnd w:id="206"/>
         </w:tc>
       </w:tr>
     </w:tbl>
@@ -50534,7 +51081,7 @@
               <w:spacing w:before="16" w:after="64"/>
             </w:pPr>
           </w:p>
-          <w:bookmarkStart w:id="204" w:name="def-pearson-chisq-glm"/>
+          <w:bookmarkStart w:id="207" w:name="def-pearson-chisq-glm"/>
           <w:p>
             <w:pPr>
               <w:pStyle w:val="BodyText"/>
@@ -50544,7 +51091,7 @@
                 <w:b/>
                 <w:bCs/>
               </w:rPr>
-              <w:t xml:space="preserve">Definition 14 (Pearson chi-squared statistic)</w:t>
+              <w:t xml:space="preserve">Definition 17 (Pearson chi-squared statistic)</w:t>
             </w:r>
             <w:r>
               <w:t xml:space="preserve"> </w:t>
@@ -50573,7 +51120,7 @@
                 <w:rPr>
                   <w:rStyle w:val="Hyperlink"/>
                 </w:rPr>
-                <w:t xml:space="preserve">Definition 13</w:t>
+                <w:t xml:space="preserve">Definition 16</w:t>
               </w:r>
             </w:hyperlink>
             <w:r>
@@ -50671,7 +51218,7 @@
               <w:t xml:space="preserve">.</w:t>
             </w:r>
           </w:p>
-          <w:bookmarkEnd w:id="204"/>
+          <w:bookmarkEnd w:id="207"/>
         </w:tc>
       </w:tr>
     </w:tbl>
@@ -50708,7 +51255,7 @@
       <w:r>
         <w:t xml:space="preserve"> </w:t>
       </w:r>
-      <w:hyperlink r:id="rId205">
+      <w:hyperlink r:id="rId208">
         <w:r>
           <w:rPr>
             <w:rStyle w:val="Hyperlink"/>
@@ -50859,7 +51406,7 @@
       <w:r>
         <w:t xml:space="preserve"> </w:t>
       </w:r>
-      <w:hyperlink r:id="rId206">
+      <w:hyperlink r:id="rId209">
         <w:r>
           <w:rPr>
             <w:rStyle w:val="Hyperlink"/>
@@ -50926,7 +51473,7 @@
               <w:bottom w:w="108" w:type="dxa"/>
             </w:tcMar>
           </w:tcPr>
-          <w:bookmarkStart w:id="211" w:name="exm-chronic-pearson"/>
+          <w:bookmarkStart w:id="214" w:name="exm-chronic-pearson"/>
           <w:p>
             <w:pPr>
               <w:pStyle w:val="BodyText"/>
@@ -51625,7 +52172,7 @@
             <w:tr>
               <w:tc>
                 <w:tcPr/>
-                <w:bookmarkStart w:id="210" w:name="fig-chronic-pearson"/>
+                <w:bookmarkStart w:id="213" w:name="fig-chronic-pearson"/>
                 <w:p>
                   <w:pPr>
                     <w:pStyle w:val="SourceCode"/>
@@ -51989,18 +52536,18 @@
                       <wp:inline>
                         <wp:extent cx="4620126" cy="3696101"/>
                         <wp:effectExtent b="0" l="0" r="0" t="0"/>
-                        <wp:docPr descr="" title="" id="208" name="Picture"/>
+                        <wp:docPr descr="" title="" id="211" name="Picture"/>
                         <a:graphic>
                           <a:graphicData uri="http://schemas.openxmlformats.org/drawingml/2006/picture">
                             <pic:pic>
                               <pic:nvPicPr>
-                                <pic:cNvPr descr="Intro-to-GLMs_files/figure-docx/unnamed-chunk-9-1.png" id="209" name="Picture"/>
+                                <pic:cNvPr descr="Intro-to-GLMs_files/figure-docx/unnamed-chunk-9-1.png" id="212" name="Picture"/>
                                 <pic:cNvPicPr>
                                   <a:picLocks noChangeArrowheads="1" noChangeAspect="1"/>
                                 </pic:cNvPicPr>
                               </pic:nvPicPr>
                               <pic:blipFill>
-                                <a:blip r:embed="rId207"/>
+                                <a:blip r:embed="rId210"/>
                                 <a:stretch>
                                   <a:fillRect/>
                                 </a:stretch>
@@ -52046,17 +52593,17 @@
                     <w:t xml:space="preserve">by residence</w:t>
                   </w:r>
                 </w:p>
-                <w:bookmarkEnd w:id="210"/>
+                <w:bookmarkEnd w:id="213"/>
               </w:tc>
             </w:tr>
           </w:tbl>
-          <w:bookmarkEnd w:id="211"/>
+          <w:bookmarkEnd w:id="214"/>
           <w:p/>
         </w:tc>
       </w:tr>
     </w:tbl>
-    <w:bookmarkEnd w:id="212"/>
-    <w:bookmarkStart w:id="218" w:name="step-4-inference"/>
+    <w:bookmarkEnd w:id="215"/>
+    <w:bookmarkStart w:id="221" w:name="step-4-inference"/>
     <w:p>
       <w:pPr>
         <w:pStyle w:val="Heading2"/>
@@ -52130,7 +52677,7 @@
       <w:r>
         <w:t xml:space="preserve"> </w:t>
       </w:r>
-      <w:hyperlink r:id="rId213">
+      <w:hyperlink r:id="rId216">
         <w:r>
           <w:rPr>
             <w:rStyle w:val="Hyperlink"/>
@@ -52249,7 +52796,7 @@
       <w:r>
         <w:t xml:space="preserve"> </w:t>
       </w:r>
-      <w:hyperlink r:id="rId214">
+      <w:hyperlink r:id="rId217">
         <w:r>
           <w:rPr>
             <w:rStyle w:val="Hyperlink"/>
@@ -52378,7 +52925,7 @@
       <w:r>
         <w:t xml:space="preserve"> </w:t>
       </w:r>
-      <w:hyperlink r:id="rId215">
+      <w:hyperlink r:id="rId218">
         <w:r>
           <w:rPr>
             <w:rStyle w:val="Hyperlink"/>
@@ -52594,7 +53141,7 @@
               <w:bottom w:w="108" w:type="dxa"/>
             </w:tcMar>
           </w:tcPr>
-          <w:bookmarkStart w:id="217" w:name="exm-chronic-inference"/>
+          <w:bookmarkStart w:id="220" w:name="exm-chronic-inference"/>
           <w:p>
             <w:pPr>
               <w:pStyle w:val="BodyText"/>
@@ -53742,7 +54289,7 @@
             <w:r>
               <w:t xml:space="preserve"> </w:t>
             </w:r>
-            <w:hyperlink r:id="rId216">
+            <w:hyperlink r:id="rId219">
               <w:r>
                 <w:rPr>
                   <w:rStyle w:val="Hyperlink"/>
@@ -55160,14 +55707,14 @@
               <w:t xml:space="preserve">so these data are also consistent with no difference in the mean number of conditions.</w:t>
             </w:r>
           </w:p>
-          <w:bookmarkEnd w:id="217"/>
+          <w:bookmarkEnd w:id="220"/>
           <w:p/>
         </w:tc>
       </w:tr>
     </w:tbl>
-    <w:bookmarkEnd w:id="218"/>
-    <w:bookmarkEnd w:id="219"/>
-    <w:bookmarkStart w:id="227" w:name="sec-choosing-glm"/>
+    <w:bookmarkEnd w:id="221"/>
+    <w:bookmarkEnd w:id="222"/>
+    <w:bookmarkStart w:id="230" w:name="sec-choosing-glm"/>
     <w:p>
       <w:pPr>
         <w:pStyle w:val="Heading1"/>
@@ -55220,7 +55767,7 @@
       <w:r>
         <w:t xml:space="preserve"> </w:t>
       </w:r>
-      <w:hyperlink r:id="rId220">
+      <w:hyperlink r:id="rId223">
         <w:r>
           <w:rPr>
             <w:rStyle w:val="Hyperlink"/>
@@ -55240,7 +55787,7 @@
       <w:r>
         <w:t xml:space="preserve"> </w:t>
       </w:r>
-      <w:hyperlink r:id="rId221">
+      <w:hyperlink r:id="rId224">
         <w:r>
           <w:rPr>
             <w:rStyle w:val="Hyperlink"/>
@@ -55257,7 +55804,7 @@
       <w:r>
         <w:t xml:space="preserve"> </w:t>
       </w:r>
-      <w:hyperlink r:id="rId222">
+      <w:hyperlink r:id="rId225">
         <w:r>
           <w:rPr>
             <w:rStyle w:val="Hyperlink"/>
@@ -55333,7 +55880,7 @@
       <w:r>
         <w:t xml:space="preserve"> </w:t>
       </w:r>
-      <w:hyperlink r:id="rId206">
+      <w:hyperlink r:id="rId209">
         <w:r>
           <w:rPr>
             <w:rStyle w:val="Hyperlink"/>
@@ -55364,7 +55911,7 @@
       <w:r>
         <w:t xml:space="preserve"> </w:t>
       </w:r>
-      <w:hyperlink r:id="rId223">
+      <w:hyperlink r:id="rId226">
         <w:r>
           <w:rPr>
             <w:rStyle w:val="Hyperlink"/>
@@ -56129,7 +56676,7 @@
       <w:tr>
         <w:tc>
           <w:tcPr/>
-          <w:bookmarkStart w:id="224" w:name="tbl-glm-families"/>
+          <w:bookmarkStart w:id="227" w:name="tbl-glm-families"/>
           <w:p>
             <w:pPr>
               <w:jc w:val="center"/>
@@ -56457,7 +57004,7 @@
               </w:tc>
             </w:tr>
           </w:tbl>
-          <w:bookmarkEnd w:id="224"/>
+          <w:bookmarkEnd w:id="227"/>
           <w:p/>
         </w:tc>
       </w:tr>
@@ -56476,7 +57023,7 @@
       <w:tr>
         <w:tc>
           <w:tcPr/>
-          <w:bookmarkStart w:id="225" w:name="tbl-glm-links"/>
+          <w:bookmarkStart w:id="228" w:name="tbl-glm-links"/>
           <w:p>
             <w:pPr>
               <w:jc w:val="center"/>
@@ -58297,7 +58844,7 @@
               </w:tc>
             </w:tr>
           </w:tbl>
-          <w:bookmarkEnd w:id="225"/>
+          <w:bookmarkEnd w:id="228"/>
           <w:p/>
         </w:tc>
       </w:tr>
@@ -58354,7 +58901,7 @@
               <w:bottom w:w="108" w:type="dxa"/>
             </w:tcMar>
           </w:tcPr>
-          <w:bookmarkStart w:id="226" w:name="exm-choose-family"/>
+          <w:bookmarkStart w:id="229" w:name="exm-choose-family"/>
           <w:p>
             <w:pPr>
               <w:pStyle w:val="BodyText"/>
@@ -58722,7 +59269,7 @@
               <w:t xml:space="preserve">.</w:t>
             </w:r>
           </w:p>
-          <w:bookmarkEnd w:id="226"/>
+          <w:bookmarkEnd w:id="229"/>
           <w:p/>
         </w:tc>
       </w:tr>
@@ -58734,8 +59281,8 @@
         </w:pict>
       </w:r>
     </w:p>
-    <w:bookmarkEnd w:id="227"/>
-    <w:bookmarkStart w:id="231" w:name="exercises"/>
+    <w:bookmarkEnd w:id="230"/>
+    <w:bookmarkStart w:id="234" w:name="exercises"/>
     <w:p>
       <w:pPr>
         <w:pStyle w:val="Heading1"/>
@@ -58778,7 +59325,7 @@
               <w:spacing w:before="16" w:after="64"/>
             </w:pPr>
           </w:p>
-          <w:bookmarkStart w:id="228" w:name="exr-prac-glm-components"/>
+          <w:bookmarkStart w:id="231" w:name="exr-prac-glm-components"/>
           <w:p>
             <w:pPr>
               <w:pStyle w:val="BodyText"/>
@@ -59003,7 +59550,7 @@
               <w:t xml:space="preserve">using a gamma distribution and log link.</w:t>
             </w:r>
           </w:p>
-          <w:bookmarkEnd w:id="228"/>
+          <w:bookmarkEnd w:id="231"/>
         </w:tc>
       </w:tr>
     </w:tbl>
@@ -60459,7 +61006,7 @@
               <w:spacing w:before="16" w:after="64"/>
             </w:pPr>
           </w:p>
-          <w:bookmarkStart w:id="230" w:name="exr-prac-canonical-link"/>
+          <w:bookmarkStart w:id="233" w:name="exr-prac-canonical-link"/>
           <w:p>
             <w:pPr>
               <w:pStyle w:val="BodyText"/>
@@ -60621,7 +61168,7 @@
             <w:r>
               <w:t xml:space="preserve"> </w:t>
             </w:r>
-            <w:hyperlink r:id="rId229">
+            <w:hyperlink r:id="rId232">
               <w:r>
                 <w:rPr>
                   <w:rStyle w:val="Hyperlink"/>
@@ -61021,7 +61568,7 @@
               </m:r>
             </m:oMath>
           </w:p>
-          <w:bookmarkEnd w:id="230"/>
+          <w:bookmarkEnd w:id="233"/>
         </w:tc>
       </w:tr>
     </w:tbl>
@@ -62260,8 +62807,8 @@
         </w:tc>
       </w:tr>
     </w:tbl>
-    <w:bookmarkEnd w:id="231"/>
-    <w:bookmarkStart w:id="253" w:name="references"/>
+    <w:bookmarkEnd w:id="234"/>
+    <w:bookmarkStart w:id="256" w:name="references"/>
     <w:p>
       <w:pPr>
         <w:pStyle w:val="Heading1"/>
@@ -62270,8 +62817,8 @@
         <w:t xml:space="preserve">References</w:t>
       </w:r>
     </w:p>
-    <w:bookmarkStart w:id="252" w:name="refs"/>
-    <w:bookmarkStart w:id="233" w:name="ref-dalgaardintroductory"/>
+    <w:bookmarkStart w:id="255" w:name="refs"/>
+    <w:bookmarkStart w:id="236" w:name="ref-dalgaardintroductory"/>
     <w:p>
       <w:pPr>
         <w:pStyle w:val="Bibliography"/>
@@ -62295,7 +62842,7 @@
       <w:r>
         <w:t xml:space="preserve"> </w:t>
       </w:r>
-      <w:hyperlink r:id="rId232">
+      <w:hyperlink r:id="rId235">
         <w:r>
           <w:rPr>
             <w:rStyle w:val="Hyperlink"/>
@@ -62307,8 +62854,8 @@
         <w:t xml:space="preserve">.</w:t>
       </w:r>
     </w:p>
-    <w:bookmarkEnd w:id="233"/>
-    <w:bookmarkStart w:id="235" w:name="ref-dobson4e"/>
+    <w:bookmarkEnd w:id="236"/>
+    <w:bookmarkStart w:id="238" w:name="ref-dobson4e"/>
     <w:p>
       <w:pPr>
         <w:pStyle w:val="Bibliography"/>
@@ -62332,7 +62879,7 @@
       <w:r>
         <w:t xml:space="preserve"> </w:t>
       </w:r>
-      <w:hyperlink r:id="rId234">
+      <w:hyperlink r:id="rId237">
         <w:r>
           <w:rPr>
             <w:rStyle w:val="Hyperlink"/>
@@ -62344,8 +62891,8 @@
         <w:t xml:space="preserve">.</w:t>
       </w:r>
     </w:p>
-    <w:bookmarkEnd w:id="235"/>
-    <w:bookmarkStart w:id="237" w:name="ref-dunn2018generalized"/>
+    <w:bookmarkEnd w:id="238"/>
+    <w:bookmarkStart w:id="240" w:name="ref-dunn2018generalized"/>
     <w:p>
       <w:pPr>
         <w:pStyle w:val="Bibliography"/>
@@ -62383,7 +62930,7 @@
       <w:r>
         <w:t xml:space="preserve"> </w:t>
       </w:r>
-      <w:hyperlink r:id="rId236">
+      <w:hyperlink r:id="rId239">
         <w:r>
           <w:rPr>
             <w:rStyle w:val="Hyperlink"/>
@@ -62395,8 +62942,8 @@
         <w:t xml:space="preserve">.</w:t>
       </w:r>
     </w:p>
-    <w:bookmarkEnd w:id="237"/>
-    <w:bookmarkStart w:id="239" w:name="ref-hernan2020causal"/>
+    <w:bookmarkEnd w:id="240"/>
+    <w:bookmarkStart w:id="242" w:name="ref-hernan2020causal"/>
     <w:p>
       <w:pPr>
         <w:pStyle w:val="Bibliography"/>
@@ -62420,7 +62967,7 @@
       <w:r>
         <w:t xml:space="preserve"> </w:t>
       </w:r>
-      <w:hyperlink r:id="rId238">
+      <w:hyperlink r:id="rId241">
         <w:r>
           <w:rPr>
             <w:rStyle w:val="Hyperlink"/>
@@ -62432,8 +62979,8 @@
         <w:t xml:space="preserve">.</w:t>
       </w:r>
     </w:p>
-    <w:bookmarkEnd w:id="239"/>
-    <w:bookmarkStart w:id="241" w:name="ref-james2021islr2e"/>
+    <w:bookmarkEnd w:id="242"/>
+    <w:bookmarkStart w:id="244" w:name="ref-james2021islr2e"/>
     <w:p>
       <w:pPr>
         <w:pStyle w:val="Bibliography"/>
@@ -62471,7 +63018,7 @@
       <w:r>
         <w:t xml:space="preserve"> </w:t>
       </w:r>
-      <w:hyperlink r:id="rId240">
+      <w:hyperlink r:id="rId243">
         <w:r>
           <w:rPr>
             <w:rStyle w:val="Hyperlink"/>
@@ -62483,8 +63030,8 @@
         <w:t xml:space="preserve">.</w:t>
       </w:r>
     </w:p>
-    <w:bookmarkEnd w:id="241"/>
-    <w:bookmarkStart w:id="243" w:name="ref-kleinbaum2014applied"/>
+    <w:bookmarkEnd w:id="244"/>
+    <w:bookmarkStart w:id="246" w:name="ref-kleinbaum2014applied"/>
     <w:p>
       <w:pPr>
         <w:pStyle w:val="Bibliography"/>
@@ -62508,7 +63055,7 @@
       <w:r>
         <w:t xml:space="preserve"> </w:t>
       </w:r>
-      <w:hyperlink r:id="rId242">
+      <w:hyperlink r:id="rId245">
         <w:r>
           <w:rPr>
             <w:rStyle w:val="Hyperlink"/>
@@ -62520,8 +63067,8 @@
         <w:t xml:space="preserve">.</w:t>
       </w:r>
     </w:p>
-    <w:bookmarkEnd w:id="243"/>
-    <w:bookmarkStart w:id="245" w:name="ref-neyman1923application"/>
+    <w:bookmarkEnd w:id="246"/>
+    <w:bookmarkStart w:id="248" w:name="ref-neyman1923application"/>
     <w:p>
       <w:pPr>
         <w:pStyle w:val="Bibliography"/>
@@ -62554,7 +63101,7 @@
       <w:r>
         <w:t xml:space="preserve"> </w:t>
       </w:r>
-      <w:hyperlink r:id="rId244">
+      <w:hyperlink r:id="rId247">
         <w:r>
           <w:rPr>
             <w:rStyle w:val="Hyperlink"/>
@@ -62566,8 +63113,8 @@
         <w:t xml:space="preserve">.</w:t>
       </w:r>
     </w:p>
-    <w:bookmarkEnd w:id="245"/>
-    <w:bookmarkStart w:id="247" w:name="ref-rubin1974estimating"/>
+    <w:bookmarkEnd w:id="248"/>
+    <w:bookmarkStart w:id="250" w:name="ref-rubin1974estimating"/>
     <w:p>
       <w:pPr>
         <w:pStyle w:val="Bibliography"/>
@@ -62600,7 +63147,7 @@
       <w:r>
         <w:t xml:space="preserve"> </w:t>
       </w:r>
-      <w:hyperlink r:id="rId246">
+      <w:hyperlink r:id="rId249">
         <w:r>
           <w:rPr>
             <w:rStyle w:val="Hyperlink"/>
@@ -62612,8 +63159,8 @@
         <w:t xml:space="preserve">.</w:t>
       </w:r>
     </w:p>
-    <w:bookmarkEnd w:id="247"/>
-    <w:bookmarkStart w:id="249" w:name="ref-vittinghoff2e"/>
+    <w:bookmarkEnd w:id="250"/>
+    <w:bookmarkStart w:id="252" w:name="ref-vittinghoff2e"/>
     <w:p>
       <w:pPr>
         <w:pStyle w:val="Bibliography"/>
@@ -62637,7 +63184,7 @@
       <w:r>
         <w:t xml:space="preserve"> </w:t>
       </w:r>
-      <w:hyperlink r:id="rId248">
+      <w:hyperlink r:id="rId251">
         <w:r>
           <w:rPr>
             <w:rStyle w:val="Hyperlink"/>
@@ -62649,8 +63196,8 @@
         <w:t xml:space="preserve">.</w:t>
       </w:r>
     </w:p>
-    <w:bookmarkEnd w:id="249"/>
-    <w:bookmarkStart w:id="251" w:name="ref-r4ds"/>
+    <w:bookmarkEnd w:id="252"/>
+    <w:bookmarkStart w:id="254" w:name="ref-r4ds"/>
     <w:p>
       <w:pPr>
         <w:pStyle w:val="Bibliography"/>
@@ -62674,7 +63221,7 @@
       <w:r>
         <w:t xml:space="preserve"> </w:t>
       </w:r>
-      <w:hyperlink r:id="rId250">
+      <w:hyperlink r:id="rId253">
         <w:r>
           <w:rPr>
             <w:rStyle w:val="Hyperlink"/>
@@ -62686,9 +63233,9 @@
         <w:t xml:space="preserve">.</w:t>
       </w:r>
     </w:p>
-    <w:bookmarkEnd w:id="251"/>
-    <w:bookmarkEnd w:id="252"/>
-    <w:bookmarkEnd w:id="253"/>
+    <w:bookmarkEnd w:id="254"/>
+    <w:bookmarkEnd w:id="255"/>
+    <w:bookmarkEnd w:id="256"/>
     <w:sectPr>
       <w:footnotePr>
         <w:numRestart w:val="eachSect"/>

</xml_diff>

<commit_message>
Deploying to gh-pages from @ Morrison-Lab/rme@40c6d93177d9f5f5193b500002dddb1e634056eb 🚀
</commit_message>
<xml_diff>
--- a/chapters/Intro-to-GLMs-handout.docx
+++ b/chapters/Intro-to-GLMs-handout.docx
@@ -9451,16 +9451,21 @@
                   </m:rPr>
                   <m:t>|</m:t>
                 </m:r>
-                <m:acc>
-                  <m:accPr>
-                    <m:chr m:val="̃"/>
-                  </m:accPr>
+                <m:limLow>
                   <m:e>
                     <m:r>
                       <m:t>X</m:t>
                     </m:r>
                   </m:e>
-                </m:acc>
+                  <m:lim>
+                    <m:r>
+                      <m:rPr>
+                        <m:sty m:val="p"/>
+                      </m:rPr>
+                      <m:t>∼</m:t>
+                    </m:r>
+                  </m:lim>
+                </m:limLow>
                 <m:r>
                   <m:rPr>
                     <m:sty m:val="p"/>
@@ -9551,16 +9556,21 @@
                 </m:rPr>
                 <m:t>|</m:t>
               </m:r>
-              <m:acc>
-                <m:accPr>
-                  <m:chr m:val="̃"/>
-                </m:accPr>
+              <m:limLow>
                 <m:e>
                   <m:r>
                     <m:t>X</m:t>
                   </m:r>
                 </m:e>
-              </m:acc>
+                <m:lim>
+                  <m:r>
+                    <m:rPr>
+                      <m:sty m:val="p"/>
+                    </m:rPr>
+                    <m:t>∼</m:t>
+                  </m:r>
+                </m:lim>
+              </m:limLow>
               <m:r>
                 <m:rPr>
                   <m:sty m:val="p"/>
@@ -10111,16 +10121,21 @@
               <w:t xml:space="preserve"> </w:t>
             </w:r>
             <m:oMath>
-              <m:acc>
-                <m:accPr>
-                  <m:chr m:val="̃"/>
-                </m:accPr>
+              <m:limLow>
                 <m:e>
                   <m:r>
                     <m:t>X</m:t>
                   </m:r>
                 </m:e>
-              </m:acc>
+                <m:lim>
+                  <m:r>
+                    <m:rPr>
+                      <m:sty m:val="p"/>
+                    </m:rPr>
+                    <m:t>∼</m:t>
+                  </m:r>
+                </m:lim>
+              </m:limLow>
             </m:oMath>
             <w:r>
               <w:t xml:space="preserve">.</w:t>
@@ -10176,16 +10191,21 @@
               <w:t xml:space="preserve"> </w:t>
             </w:r>
             <m:oMath>
-              <m:acc>
-                <m:accPr>
-                  <m:chr m:val="̃"/>
-                </m:accPr>
+              <m:limLow>
                 <m:e>
                   <m:r>
                     <m:t>X</m:t>
                   </m:r>
                 </m:e>
-              </m:acc>
+                <m:lim>
+                  <m:r>
+                    <m:rPr>
+                      <m:sty m:val="p"/>
+                    </m:rPr>
+                    <m:t>∼</m:t>
+                  </m:r>
+                </m:lim>
+              </m:limLow>
             </m:oMath>
             <w:r>
               <w:t xml:space="preserve"> </w:t>
@@ -10229,16 +10249,21 @@
                 </m:rPr>
                 <m:t>|</m:t>
               </m:r>
-              <m:acc>
-                <m:accPr>
-                  <m:chr m:val="̃"/>
-                </m:accPr>
+              <m:limLow>
                 <m:e>
                   <m:r>
                     <m:t>X</m:t>
                   </m:r>
                 </m:e>
-              </m:acc>
+                <m:lim>
+                  <m:r>
+                    <m:rPr>
+                      <m:sty m:val="p"/>
+                    </m:rPr>
+                    <m:t>∼</m:t>
+                  </m:r>
+                </m:lim>
+              </m:limLow>
               <m:r>
                 <m:rPr>
                   <m:sty m:val="p"/>
@@ -10279,16 +10304,21 @@
                     <w:jc w:val="center"/>
                   </w:pPr>
                   <m:oMath>
-                    <m:acc>
-                      <m:accPr>
-                        <m:chr m:val="̃"/>
-                      </m:accPr>
+                    <m:limLow>
                       <m:e>
                         <m:r>
                           <m:t>X</m:t>
                         </m:r>
                       </m:e>
-                    </m:acc>
+                      <m:lim>
+                        <m:r>
+                          <m:rPr>
+                            <m:sty m:val="p"/>
+                          </m:rPr>
+                          <m:t>∼</m:t>
+                        </m:r>
+                      </m:lim>
+                    </m:limLow>
                   </m:oMath>
                   <w:r>
                     <w:t xml:space="preserve">​</w:t>
@@ -10807,16 +10837,21 @@
                 </m:rPr>
                 <m:t>(</m:t>
               </m:r>
-              <m:acc>
-                <m:accPr>
-                  <m:chr m:val="̃"/>
-                </m:accPr>
+              <m:limLow>
                 <m:e>
                   <m:r>
                     <m:t>x</m:t>
                   </m:r>
                 </m:e>
-              </m:acc>
+                <m:lim>
+                  <m:r>
+                    <m:rPr>
+                      <m:sty m:val="p"/>
+                    </m:rPr>
+                    <m:t>∼</m:t>
+                  </m:r>
+                </m:lim>
+              </m:limLow>
               <m:r>
                 <m:rPr>
                   <m:sty m:val="p"/>
@@ -10876,16 +10911,21 @@
                 </m:rPr>
                 <m:t>(</m:t>
               </m:r>
-              <m:acc>
-                <m:accPr>
-                  <m:chr m:val="̃"/>
-                </m:accPr>
+              <m:limLow>
                 <m:e>
                   <m:r>
                     <m:t>x</m:t>
                   </m:r>
                 </m:e>
-              </m:acc>
+                <m:lim>
+                  <m:r>
+                    <m:rPr>
+                      <m:sty m:val="p"/>
+                    </m:rPr>
+                    <m:t>∼</m:t>
+                  </m:r>
+                </m:lim>
+              </m:limLow>
               <m:r>
                 <m:rPr>
                   <m:sty m:val="p"/>
@@ -10913,16 +10953,21 @@
                 </m:rPr>
                 <m:t>(</m:t>
               </m:r>
-              <m:acc>
-                <m:accPr>
-                  <m:chr m:val="̃"/>
-                </m:accPr>
+              <m:limLow>
                 <m:e>
                   <m:r>
                     <m:t>x</m:t>
                   </m:r>
                 </m:e>
-              </m:acc>
+                <m:lim>
+                  <m:r>
+                    <m:rPr>
+                      <m:sty m:val="p"/>
+                    </m:rPr>
+                    <m:t>∼</m:t>
+                  </m:r>
+                </m:lim>
+              </m:limLow>
               <m:r>
                 <m:rPr>
                   <m:sty m:val="p"/>
@@ -10967,16 +11012,21 @@
                 </m:rPr>
                 <m:t>(</m:t>
               </m:r>
-              <m:acc>
-                <m:accPr>
-                  <m:chr m:val="̃"/>
-                </m:accPr>
+              <m:limLow>
                 <m:e>
                   <m:r>
                     <m:t>x</m:t>
                   </m:r>
                 </m:e>
-              </m:acc>
+                <m:lim>
+                  <m:r>
+                    <m:rPr>
+                      <m:sty m:val="p"/>
+                    </m:rPr>
+                    <m:t>∼</m:t>
+                  </m:r>
+                </m:lim>
+              </m:limLow>
               <m:r>
                 <m:rPr>
                   <m:sty m:val="p"/>
@@ -10989,16 +11039,21 @@
                 </m:rPr>
                 <m:t>=</m:t>
               </m:r>
-              <m:acc>
-                <m:accPr>
-                  <m:chr m:val="̃"/>
-                </m:accPr>
+              <m:limLow>
                 <m:e>
                   <m:r>
                     <m:t>x</m:t>
                   </m:r>
                 </m:e>
-              </m:acc>
+                <m:lim>
+                  <m:r>
+                    <m:rPr>
+                      <m:sty m:val="p"/>
+                    </m:rPr>
+                    <m:t>∼</m:t>
+                  </m:r>
+                </m:lim>
+              </m:limLow>
               <m:r>
                 <m:rPr>
                   <m:sty m:val="p"/>
@@ -11232,16 +11287,21 @@
                   </m:rPr>
                   <m:t>(</m:t>
                 </m:r>
-                <m:acc>
-                  <m:accPr>
-                    <m:chr m:val="̃"/>
-                  </m:accPr>
+                <m:limLow>
                   <m:e>
                     <m:r>
                       <m:t>x</m:t>
                     </m:r>
                   </m:e>
-                </m:acc>
+                  <m:lim>
+                    <m:r>
+                      <m:rPr>
+                        <m:sty m:val="p"/>
+                      </m:rPr>
+                      <m:t>∼</m:t>
+                    </m:r>
+                  </m:lim>
+                </m:limLow>
                 <m:r>
                   <m:rPr>
                     <m:sty m:val="p"/>
@@ -11269,16 +11329,21 @@
                 </m:limUpp>
                 <m:sSup>
                   <m:e>
-                    <m:acc>
-                      <m:accPr>
-                        <m:chr m:val="̃"/>
-                      </m:accPr>
+                    <m:limLow>
                       <m:e>
                         <m:r>
                           <m:t>x</m:t>
                         </m:r>
                       </m:e>
-                    </m:acc>
+                      <m:lim>
+                        <m:r>
+                          <m:rPr>
+                            <m:sty m:val="p"/>
+                          </m:rPr>
+                          <m:t>∼</m:t>
+                        </m:r>
+                      </m:lim>
+                    </m:limLow>
                   </m:e>
                   <m:sup>
                     <m:r>
@@ -11289,16 +11354,21 @@
                     </m:r>
                   </m:sup>
                 </m:sSup>
-                <m:acc>
-                  <m:accPr>
-                    <m:chr m:val="̃"/>
-                  </m:accPr>
+                <m:limLow>
                   <m:e>
                     <m:r>
                       <m:t>β</m:t>
                     </m:r>
                   </m:e>
-                </m:acc>
+                  <m:lim>
+                    <m:r>
+                      <m:rPr>
+                        <m:sty m:val="p"/>
+                      </m:rPr>
+                      <m:t>∼</m:t>
+                    </m:r>
+                  </m:lim>
+                </m:limLow>
                 <m:r>
                   <m:rPr>
                     <m:sty m:val="p"/>
@@ -11493,16 +11563,21 @@
                 </m:rPr>
                 <m:t>(</m:t>
               </m:r>
-              <m:acc>
-                <m:accPr>
-                  <m:chr m:val="̃"/>
-                </m:accPr>
+              <m:limLow>
                 <m:e>
                   <m:r>
                     <m:t>x</m:t>
                   </m:r>
                 </m:e>
-              </m:acc>
+                <m:lim>
+                  <m:r>
+                    <m:rPr>
+                      <m:sty m:val="p"/>
+                    </m:rPr>
+                    <m:t>∼</m:t>
+                  </m:r>
+                </m:lim>
+              </m:limLow>
               <m:r>
                 <m:rPr>
                   <m:sty m:val="p"/>
@@ -11617,16 +11692,21 @@
                 </m:rPr>
                 <m:t>(</m:t>
               </m:r>
-              <m:acc>
-                <m:accPr>
-                  <m:chr m:val="̃"/>
-                </m:accPr>
+              <m:limLow>
                 <m:e>
                   <m:r>
                     <m:t>x</m:t>
                   </m:r>
                 </m:e>
-              </m:acc>
+                <m:lim>
+                  <m:r>
+                    <m:rPr>
+                      <m:sty m:val="p"/>
+                    </m:rPr>
+                    <m:t>∼</m:t>
+                  </m:r>
+                </m:lim>
+              </m:limLow>
               <m:r>
                 <m:rPr>
                   <m:sty m:val="p"/>
@@ -11705,16 +11785,21 @@
                 </m:rPr>
                 <m:t>(</m:t>
               </m:r>
-              <m:acc>
-                <m:accPr>
-                  <m:chr m:val="̃"/>
-                </m:accPr>
+              <m:limLow>
                 <m:e>
                   <m:r>
                     <m:t>x</m:t>
                   </m:r>
                 </m:e>
-              </m:acc>
+                <m:lim>
+                  <m:r>
+                    <m:rPr>
+                      <m:sty m:val="p"/>
+                    </m:rPr>
+                    <m:t>∼</m:t>
+                  </m:r>
+                </m:lim>
+              </m:limLow>
               <m:r>
                 <m:rPr>
                   <m:sty m:val="p"/>
@@ -11802,16 +11887,21 @@
                 </m:rPr>
                 <m:t>(</m:t>
               </m:r>
-              <m:acc>
-                <m:accPr>
-                  <m:chr m:val="̃"/>
-                </m:accPr>
+              <m:limLow>
                 <m:e>
                   <m:r>
                     <m:t>x</m:t>
                   </m:r>
                 </m:e>
-              </m:acc>
+                <m:lim>
+                  <m:r>
+                    <m:rPr>
+                      <m:sty m:val="p"/>
+                    </m:rPr>
+                    <m:t>∼</m:t>
+                  </m:r>
+                </m:lim>
+              </m:limLow>
               <m:r>
                 <m:rPr>
                   <m:sty m:val="p"/>
@@ -11927,16 +12017,21 @@
                 </m:rPr>
                 <m:t>(</m:t>
               </m:r>
-              <m:acc>
-                <m:accPr>
-                  <m:chr m:val="̃"/>
-                </m:accPr>
+              <m:limLow>
                 <m:e>
                   <m:r>
                     <m:t>x</m:t>
                   </m:r>
                 </m:e>
-              </m:acc>
+                <m:lim>
+                  <m:r>
+                    <m:rPr>
+                      <m:sty m:val="p"/>
+                    </m:rPr>
+                    <m:t>∼</m:t>
+                  </m:r>
+                </m:lim>
+              </m:limLow>
               <m:r>
                 <m:rPr>
                   <m:sty m:val="p"/>
@@ -12051,16 +12146,21 @@
               <w:t xml:space="preserve"> </w:t>
             </w:r>
             <m:oMath>
-              <m:acc>
-                <m:accPr>
-                  <m:chr m:val="̃"/>
-                </m:accPr>
+              <m:limLow>
                 <m:e>
                   <m:r>
                     <m:t>x</m:t>
                   </m:r>
                 </m:e>
-              </m:acc>
+                <m:lim>
+                  <m:r>
+                    <m:rPr>
+                      <m:sty m:val="p"/>
+                    </m:rPr>
+                    <m:t>∼</m:t>
+                  </m:r>
+                </m:lim>
+              </m:limLow>
               <m:limUpp>
                 <m:e>
                   <m:r>
@@ -12178,16 +12278,21 @@
               <w:t xml:space="preserve"> </w:t>
             </w:r>
             <m:oMath>
-              <m:acc>
-                <m:accPr>
-                  <m:chr m:val="̃"/>
-                </m:accPr>
+              <m:limLow>
                 <m:e>
                   <m:r>
                     <m:t>β</m:t>
                   </m:r>
                 </m:e>
-              </m:acc>
+                <m:lim>
+                  <m:r>
+                    <m:rPr>
+                      <m:sty m:val="p"/>
+                    </m:rPr>
+                    <m:t>∼</m:t>
+                  </m:r>
+                </m:lim>
+              </m:limLow>
               <m:limUpp>
                 <m:e>
                   <m:r>
@@ -12358,16 +12463,21 @@
                   </m:rPr>
                   <m:t>(</m:t>
                 </m:r>
-                <m:acc>
-                  <m:accPr>
-                    <m:chr m:val="̃"/>
-                  </m:accPr>
+                <m:limLow>
                   <m:e>
                     <m:r>
                       <m:t>x</m:t>
                     </m:r>
                   </m:e>
-                </m:acc>
+                  <m:lim>
+                    <m:r>
+                      <m:rPr>
+                        <m:sty m:val="p"/>
+                      </m:rPr>
+                      <m:t>∼</m:t>
+                    </m:r>
+                  </m:lim>
+                </m:limLow>
                 <m:r>
                   <m:rPr>
                     <m:sty m:val="p"/>
@@ -12399,16 +12509,21 @@
                       <m:e>
                         <m:sSup>
                           <m:e>
-                            <m:acc>
-                              <m:accPr>
-                                <m:chr m:val="̃"/>
-                              </m:accPr>
+                            <m:limLow>
                               <m:e>
                                 <m:r>
                                   <m:t>x</m:t>
                                 </m:r>
                               </m:e>
-                            </m:acc>
+                              <m:lim>
+                                <m:r>
+                                  <m:rPr>
+                                    <m:sty m:val="p"/>
+                                  </m:rPr>
+                                  <m:t>∼</m:t>
+                                </m:r>
+                              </m:lim>
+                            </m:limLow>
                           </m:e>
                           <m:sup>
                             <m:r>
@@ -12470,16 +12585,21 @@
                   <m:e>
                     <m:limLow>
                       <m:e>
-                        <m:acc>
-                          <m:accPr>
-                            <m:chr m:val="̃"/>
-                          </m:accPr>
+                        <m:limLow>
                           <m:e>
                             <m:r>
                               <m:t>β</m:t>
                             </m:r>
                           </m:e>
-                        </m:acc>
+                          <m:lim>
+                            <m:r>
+                              <m:rPr>
+                                <m:sty m:val="p"/>
+                              </m:rPr>
+                              <m:t>∼</m:t>
+                            </m:r>
+                          </m:lim>
+                        </m:limLow>
                       </m:e>
                       <m:lim>
                         <m:r>
@@ -13074,16 +13194,21 @@
                 </m:rPr>
                 <m:t>(</m:t>
               </m:r>
-              <m:acc>
-                <m:accPr>
-                  <m:chr m:val="̃"/>
-                </m:accPr>
+              <m:limLow>
                 <m:e>
                   <m:r>
                     <m:t>x</m:t>
                   </m:r>
                 </m:e>
-              </m:acc>
+                <m:lim>
+                  <m:r>
+                    <m:rPr>
+                      <m:sty m:val="p"/>
+                    </m:rPr>
+                    <m:t>∼</m:t>
+                  </m:r>
+                </m:lim>
+              </m:limLow>
               <m:r>
                 <m:rPr>
                   <m:sty m:val="p"/>
@@ -13446,16 +13571,21 @@
               <w:t xml:space="preserve"> </w:t>
             </w:r>
             <m:oMath>
-              <m:acc>
-                <m:accPr>
-                  <m:chr m:val="̃"/>
-                </m:accPr>
+              <m:limLow>
                 <m:e>
                   <m:r>
                     <m:t>β</m:t>
                   </m:r>
                 </m:e>
-              </m:acc>
+                <m:lim>
+                  <m:r>
+                    <m:rPr>
+                      <m:sty m:val="p"/>
+                    </m:rPr>
+                    <m:t>∼</m:t>
+                  </m:r>
+                </m:lim>
+              </m:limLow>
             </m:oMath>
             <w:r>
               <w:t xml:space="preserve">;</w:t>
@@ -14058,16 +14188,21 @@
                 </m:rPr>
                 <m:t>(</m:t>
               </m:r>
-              <m:acc>
-                <m:accPr>
-                  <m:chr m:val="̃"/>
-                </m:accPr>
+              <m:limLow>
                 <m:e>
                   <m:r>
                     <m:t>x</m:t>
                   </m:r>
                 </m:e>
-              </m:acc>
+                <m:lim>
+                  <m:r>
+                    <m:rPr>
+                      <m:sty m:val="p"/>
+                    </m:rPr>
+                    <m:t>∼</m:t>
+                  </m:r>
+                </m:lim>
+              </m:limLow>
               <m:r>
                 <m:rPr>
                   <m:sty m:val="p"/>
@@ -14119,32 +14254,42 @@
                     </m:rPr>
                     <m:t>|</m:t>
                   </m:r>
-                  <m:acc>
-                    <m:accPr>
-                      <m:chr m:val="̃"/>
-                    </m:accPr>
+                  <m:limLow>
                     <m:e>
                       <m:r>
                         <m:t>X</m:t>
                       </m:r>
                     </m:e>
-                  </m:acc>
+                    <m:lim>
+                      <m:r>
+                        <m:rPr>
+                          <m:sty m:val="p"/>
+                        </m:rPr>
+                        <m:t>∼</m:t>
+                      </m:r>
+                    </m:lim>
+                  </m:limLow>
                   <m:r>
                     <m:rPr>
                       <m:sty m:val="p"/>
                     </m:rPr>
                     <m:t>=</m:t>
                   </m:r>
-                  <m:acc>
-                    <m:accPr>
-                      <m:chr m:val="̃"/>
-                    </m:accPr>
+                  <m:limLow>
                     <m:e>
                       <m:r>
                         <m:t>x</m:t>
                       </m:r>
                     </m:e>
-                  </m:acc>
+                    <m:lim>
+                      <m:r>
+                        <m:rPr>
+                          <m:sty m:val="p"/>
+                        </m:rPr>
+                        <m:t>∼</m:t>
+                      </m:r>
+                    </m:lim>
+                  </m:limLow>
                 </m:e>
               </m:d>
               <m:r>
@@ -14255,16 +14400,21 @@
                       </m:rPr>
                       <m:t>(</m:t>
                     </m:r>
-                    <m:acc>
-                      <m:accPr>
-                        <m:chr m:val="̃"/>
-                      </m:accPr>
+                    <m:limLow>
                       <m:e>
                         <m:r>
                           <m:t>x</m:t>
                         </m:r>
                       </m:e>
-                    </m:acc>
+                      <m:lim>
+                        <m:r>
+                          <m:rPr>
+                            <m:sty m:val="p"/>
+                          </m:rPr>
+                          <m:t>∼</m:t>
+                        </m:r>
+                      </m:lim>
+                    </m:limLow>
                     <m:r>
                       <m:rPr>
                         <m:sty m:val="p"/>
@@ -14304,16 +14454,21 @@
                   </m:rPr>
                   <m:t>(</m:t>
                 </m:r>
-                <m:acc>
-                  <m:accPr>
-                    <m:chr m:val="̃"/>
-                  </m:accPr>
+                <m:limLow>
                   <m:e>
                     <m:r>
                       <m:t>x</m:t>
                     </m:r>
                   </m:e>
-                </m:acc>
+                  <m:lim>
+                    <m:r>
+                      <m:rPr>
+                        <m:sty m:val="p"/>
+                      </m:rPr>
+                      <m:t>∼</m:t>
+                    </m:r>
+                  </m:lim>
+                </m:limLow>
                 <m:r>
                   <m:rPr>
                     <m:sty m:val="p"/>
@@ -14495,16 +14650,21 @@
                   </m:rPr>
                   <m:t>(</m:t>
                 </m:r>
-                <m:acc>
-                  <m:accPr>
-                    <m:chr m:val="̃"/>
-                  </m:accPr>
+                <m:limLow>
                   <m:e>
                     <m:r>
                       <m:t>x</m:t>
                     </m:r>
                   </m:e>
-                </m:acc>
+                  <m:lim>
+                    <m:r>
+                      <m:rPr>
+                        <m:sty m:val="p"/>
+                      </m:rPr>
+                      <m:t>∼</m:t>
+                    </m:r>
+                  </m:lim>
+                </m:limLow>
                 <m:r>
                   <m:rPr>
                     <m:sty m:val="p"/>
@@ -14555,16 +14715,21 @@
                       </m:rPr>
                       <m:t>(</m:t>
                     </m:r>
-                    <m:acc>
-                      <m:accPr>
-                        <m:chr m:val="̃"/>
-                      </m:accPr>
+                    <m:limLow>
                       <m:e>
                         <m:r>
                           <m:t>x</m:t>
                         </m:r>
                       </m:e>
-                    </m:acc>
+                      <m:lim>
+                        <m:r>
+                          <m:rPr>
+                            <m:sty m:val="p"/>
+                          </m:rPr>
+                          <m:t>∼</m:t>
+                        </m:r>
+                      </m:lim>
+                    </m:limLow>
                     <m:r>
                       <m:rPr>
                         <m:sty m:val="p"/>
@@ -16180,16 +16345,21 @@
                 </m:rPr>
                 <m:t>(</m:t>
               </m:r>
-              <m:acc>
-                <m:accPr>
-                  <m:chr m:val="̃"/>
-                </m:accPr>
+              <m:limLow>
                 <m:e>
                   <m:r>
                     <m:t>x</m:t>
                   </m:r>
                 </m:e>
-              </m:acc>
+                <m:lim>
+                  <m:r>
+                    <m:rPr>
+                      <m:sty m:val="p"/>
+                    </m:rPr>
+                    <m:t>∼</m:t>
+                  </m:r>
+                </m:lim>
+              </m:limLow>
               <m:r>
                 <m:rPr>
                   <m:sty m:val="p"/>
@@ -16325,32 +16495,42 @@
               <w:t xml:space="preserve"> </w:t>
             </w:r>
             <m:oMath>
-              <m:acc>
-                <m:accPr>
-                  <m:chr m:val="̃"/>
-                </m:accPr>
+              <m:limLow>
                 <m:e>
                   <m:r>
                     <m:t>X</m:t>
                   </m:r>
                 </m:e>
-              </m:acc>
+                <m:lim>
+                  <m:r>
+                    <m:rPr>
+                      <m:sty m:val="p"/>
+                    </m:rPr>
+                    <m:t>∼</m:t>
+                  </m:r>
+                </m:lim>
+              </m:limLow>
               <m:r>
                 <m:rPr>
                   <m:sty m:val="p"/>
                 </m:rPr>
                 <m:t>=</m:t>
               </m:r>
-              <m:acc>
-                <m:accPr>
-                  <m:chr m:val="̃"/>
-                </m:accPr>
+              <m:limLow>
                 <m:e>
                   <m:r>
                     <m:t>x</m:t>
                   </m:r>
                 </m:e>
-              </m:acc>
+                <m:lim>
+                  <m:r>
+                    <m:rPr>
+                      <m:sty m:val="p"/>
+                    </m:rPr>
+                    <m:t>∼</m:t>
+                  </m:r>
+                </m:lim>
+              </m:limLow>
             </m:oMath>
             <w:r>
               <w:t xml:space="preserve">,</w:t>
@@ -16414,32 +16594,42 @@
               <w:t xml:space="preserve"> </w:t>
             </w:r>
             <m:oMath>
-              <m:acc>
-                <m:accPr>
-                  <m:chr m:val="̃"/>
-                </m:accPr>
+              <m:limLow>
                 <m:e>
                   <m:r>
                     <m:t>X</m:t>
                   </m:r>
                 </m:e>
-              </m:acc>
+                <m:lim>
+                  <m:r>
+                    <m:rPr>
+                      <m:sty m:val="p"/>
+                    </m:rPr>
+                    <m:t>∼</m:t>
+                  </m:r>
+                </m:lim>
+              </m:limLow>
               <m:r>
                 <m:rPr>
                   <m:sty m:val="p"/>
                 </m:rPr>
                 <m:t>=</m:t>
               </m:r>
-              <m:acc>
-                <m:accPr>
-                  <m:chr m:val="̃"/>
-                </m:accPr>
+              <m:limLow>
                 <m:e>
                   <m:r>
                     <m:t>x</m:t>
                   </m:r>
                 </m:e>
-              </m:acc>
+                <m:lim>
+                  <m:r>
+                    <m:rPr>
+                      <m:sty m:val="p"/>
+                    </m:rPr>
+                    <m:t>∼</m:t>
+                  </m:r>
+                </m:lim>
+              </m:limLow>
             </m:oMath>
             <w:r>
               <w:t xml:space="preserve">,</w:t>
@@ -16469,16 +16659,21 @@
                 </m:rPr>
                 <m:t>(</m:t>
               </m:r>
-              <m:acc>
-                <m:accPr>
-                  <m:chr m:val="̃"/>
-                </m:accPr>
+              <m:limLow>
                 <m:e>
                   <m:r>
                     <m:t>x</m:t>
                   </m:r>
                 </m:e>
-              </m:acc>
+                <m:lim>
+                  <m:r>
+                    <m:rPr>
+                      <m:sty m:val="p"/>
+                    </m:rPr>
+                    <m:t>∼</m:t>
+                  </m:r>
+                </m:lim>
+              </m:limLow>
               <m:r>
                 <m:rPr>
                   <m:sty m:val="p"/>
@@ -16530,32 +16725,42 @@
                     </m:rPr>
                     <m:t>|</m:t>
                   </m:r>
-                  <m:acc>
-                    <m:accPr>
-                      <m:chr m:val="̃"/>
-                    </m:accPr>
+                  <m:limLow>
                     <m:e>
                       <m:r>
                         <m:t>X</m:t>
                       </m:r>
                     </m:e>
-                  </m:acc>
+                    <m:lim>
+                      <m:r>
+                        <m:rPr>
+                          <m:sty m:val="p"/>
+                        </m:rPr>
+                        <m:t>∼</m:t>
+                      </m:r>
+                    </m:lim>
+                  </m:limLow>
                   <m:r>
                     <m:rPr>
                       <m:sty m:val="p"/>
                     </m:rPr>
                     <m:t>=</m:t>
                   </m:r>
-                  <m:acc>
-                    <m:accPr>
-                      <m:chr m:val="̃"/>
-                    </m:accPr>
+                  <m:limLow>
                     <m:e>
                       <m:r>
                         <m:t>x</m:t>
                       </m:r>
                     </m:e>
-                  </m:acc>
+                    <m:lim>
+                      <m:r>
+                        <m:rPr>
+                          <m:sty m:val="p"/>
+                        </m:rPr>
+                        <m:t>∼</m:t>
+                      </m:r>
+                    </m:lim>
+                  </m:limLow>
                 </m:e>
               </m:d>
               <m:r>
@@ -16688,32 +16893,42 @@
               <w:t xml:space="preserve"> </w:t>
             </w:r>
             <m:oMath>
-              <m:acc>
-                <m:accPr>
-                  <m:chr m:val="̃"/>
-                </m:accPr>
+              <m:limLow>
                 <m:e>
                   <m:r>
                     <m:t>X</m:t>
                   </m:r>
                 </m:e>
-              </m:acc>
+                <m:lim>
+                  <m:r>
+                    <m:rPr>
+                      <m:sty m:val="p"/>
+                    </m:rPr>
+                    <m:t>∼</m:t>
+                  </m:r>
+                </m:lim>
+              </m:limLow>
               <m:r>
                 <m:rPr>
                   <m:sty m:val="p"/>
                 </m:rPr>
                 <m:t>=</m:t>
               </m:r>
-              <m:acc>
-                <m:accPr>
-                  <m:chr m:val="̃"/>
-                </m:accPr>
+              <m:limLow>
                 <m:e>
                   <m:r>
                     <m:t>x</m:t>
                   </m:r>
                 </m:e>
-              </m:acc>
+                <m:lim>
+                  <m:r>
+                    <m:rPr>
+                      <m:sty m:val="p"/>
+                    </m:rPr>
+                    <m:t>∼</m:t>
+                  </m:r>
+                </m:lim>
+              </m:limLow>
             </m:oMath>
             <w:r>
               <w:t xml:space="preserve"> </w:t>
@@ -16751,32 +16966,42 @@
               <w:t xml:space="preserve"> </w:t>
             </w:r>
             <m:oMath>
-              <m:acc>
-                <m:accPr>
-                  <m:chr m:val="̃"/>
-                </m:accPr>
+              <m:limLow>
                 <m:e>
                   <m:r>
                     <m:t>X</m:t>
                   </m:r>
                 </m:e>
-              </m:acc>
+                <m:lim>
+                  <m:r>
+                    <m:rPr>
+                      <m:sty m:val="p"/>
+                    </m:rPr>
+                    <m:t>∼</m:t>
+                  </m:r>
+                </m:lim>
+              </m:limLow>
               <m:r>
                 <m:rPr>
                   <m:sty m:val="p"/>
                 </m:rPr>
                 <m:t>=</m:t>
               </m:r>
-              <m:acc>
-                <m:accPr>
-                  <m:chr m:val="̃"/>
-                </m:accPr>
+              <m:limLow>
                 <m:e>
                   <m:r>
                     <m:t>x</m:t>
                   </m:r>
                 </m:e>
-              </m:acc>
+                <m:lim>
+                  <m:r>
+                    <m:rPr>
+                      <m:sty m:val="p"/>
+                    </m:rPr>
+                    <m:t>∼</m:t>
+                  </m:r>
+                </m:lim>
+              </m:limLow>
             </m:oMath>
             <w:r>
               <w:t xml:space="preserve">,</w:t>
@@ -16820,16 +17045,21 @@
                 </m:rPr>
                 <m:t>(</m:t>
               </m:r>
-              <m:acc>
-                <m:accPr>
-                  <m:chr m:val="̃"/>
-                </m:accPr>
+              <m:limLow>
                 <m:e>
                   <m:r>
                     <m:t>x</m:t>
                   </m:r>
                 </m:e>
-              </m:acc>
+                <m:lim>
+                  <m:r>
+                    <m:rPr>
+                      <m:sty m:val="p"/>
+                    </m:rPr>
+                    <m:t>∼</m:t>
+                  </m:r>
+                </m:lim>
+              </m:limLow>
               <m:r>
                 <m:rPr>
                   <m:sty m:val="p"/>
@@ -16881,32 +17111,42 @@
                     </m:rPr>
                     <m:t>|</m:t>
                   </m:r>
-                  <m:acc>
-                    <m:accPr>
-                      <m:chr m:val="̃"/>
-                    </m:accPr>
+                  <m:limLow>
                     <m:e>
                       <m:r>
                         <m:t>X</m:t>
                       </m:r>
                     </m:e>
-                  </m:acc>
+                    <m:lim>
+                      <m:r>
+                        <m:rPr>
+                          <m:sty m:val="p"/>
+                        </m:rPr>
+                        <m:t>∼</m:t>
+                      </m:r>
+                    </m:lim>
+                  </m:limLow>
                   <m:r>
                     <m:rPr>
                       <m:sty m:val="p"/>
                     </m:rPr>
                     <m:t>=</m:t>
                   </m:r>
-                  <m:acc>
-                    <m:accPr>
-                      <m:chr m:val="̃"/>
-                    </m:accPr>
+                  <m:limLow>
                     <m:e>
                       <m:r>
                         <m:t>x</m:t>
                       </m:r>
                     </m:e>
-                  </m:acc>
+                    <m:lim>
+                      <m:r>
+                        <m:rPr>
+                          <m:sty m:val="p"/>
+                        </m:rPr>
+                        <m:t>∼</m:t>
+                      </m:r>
+                    </m:lim>
+                  </m:limLow>
                 </m:e>
               </m:d>
               <m:r>
@@ -16963,16 +17203,21 @@
                 </m:rPr>
                 <m:t>(</m:t>
               </m:r>
-              <m:acc>
-                <m:accPr>
-                  <m:chr m:val="̃"/>
-                </m:accPr>
+              <m:limLow>
                 <m:e>
                   <m:r>
                     <m:t>x</m:t>
                   </m:r>
                 </m:e>
-              </m:acc>
+                <m:lim>
+                  <m:r>
+                    <m:rPr>
+                      <m:sty m:val="p"/>
+                    </m:rPr>
+                    <m:t>∼</m:t>
+                  </m:r>
+                </m:lim>
+              </m:limLow>
               <m:r>
                 <m:rPr>
                   <m:sty m:val="p"/>
@@ -16987,16 +17232,21 @@
               </m:r>
               <m:sSup>
                 <m:e>
-                  <m:acc>
-                    <m:accPr>
-                      <m:chr m:val="̃"/>
-                    </m:accPr>
+                  <m:limLow>
                     <m:e>
                       <m:r>
                         <m:t>x</m:t>
                       </m:r>
                     </m:e>
-                  </m:acc>
+                    <m:lim>
+                      <m:r>
+                        <m:rPr>
+                          <m:sty m:val="p"/>
+                        </m:rPr>
+                        <m:t>∼</m:t>
+                      </m:r>
+                    </m:lim>
+                  </m:limLow>
                 </m:e>
                 <m:sup>
                   <m:r>
@@ -17007,16 +17257,21 @@
                   </m:r>
                 </m:sup>
               </m:sSup>
-              <m:acc>
-                <m:accPr>
-                  <m:chr m:val="̃"/>
-                </m:accPr>
+              <m:limLow>
                 <m:e>
                   <m:r>
                     <m:t>β</m:t>
                   </m:r>
                 </m:e>
-              </m:acc>
+                <m:lim>
+                  <m:r>
+                    <m:rPr>
+                      <m:sty m:val="p"/>
+                    </m:rPr>
+                    <m:t>∼</m:t>
+                  </m:r>
+                </m:lim>
+              </m:limLow>
             </m:oMath>
             <w:r>
               <w:t xml:space="preserve"> </w:t>
@@ -17087,16 +17342,21 @@
                     </m:rPr>
                     <m:t>(</m:t>
                   </m:r>
-                  <m:acc>
-                    <m:accPr>
-                      <m:chr m:val="̃"/>
-                    </m:accPr>
+                  <m:limLow>
                     <m:e>
                       <m:r>
                         <m:t>x</m:t>
                       </m:r>
                     </m:e>
-                  </m:acc>
+                    <m:lim>
+                      <m:r>
+                        <m:rPr>
+                          <m:sty m:val="p"/>
+                        </m:rPr>
+                        <m:t>∼</m:t>
+                      </m:r>
+                    </m:lim>
+                  </m:limLow>
                   <m:r>
                     <m:rPr>
                       <m:sty m:val="p"/>
@@ -17123,16 +17383,21 @@
                 </m:rPr>
                 <m:t>(</m:t>
               </m:r>
-              <m:acc>
-                <m:accPr>
-                  <m:chr m:val="̃"/>
-                </m:accPr>
+              <m:limLow>
                 <m:e>
                   <m:r>
                     <m:t>x</m:t>
                   </m:r>
                 </m:e>
-              </m:acc>
+                <m:lim>
+                  <m:r>
+                    <m:rPr>
+                      <m:sty m:val="p"/>
+                    </m:rPr>
+                    <m:t>∼</m:t>
+                  </m:r>
+                </m:lim>
+              </m:limLow>
               <m:r>
                 <m:rPr>
                   <m:sty m:val="p"/>
@@ -17179,16 +17444,21 @@
         <w:t xml:space="preserve"> </w:t>
       </w:r>
       <m:oMath>
-        <m:acc>
-          <m:accPr>
-            <m:chr m:val="̃"/>
-          </m:accPr>
+        <m:limLow>
           <m:e>
             <m:r>
               <m:t>β</m:t>
             </m:r>
           </m:e>
-        </m:acc>
+          <m:lim>
+            <m:r>
+              <m:rPr>
+                <m:sty m:val="p"/>
+              </m:rPr>
+              <m:t>∼</m:t>
+            </m:r>
+          </m:lim>
+        </m:limLow>
       </m:oMath>
       <w:r>
         <w:t xml:space="preserve"> </w:t>
@@ -18114,16 +18384,21 @@
                 </m:rPr>
                 <m:t>(</m:t>
               </m:r>
-              <m:acc>
-                <m:accPr>
-                  <m:chr m:val="̃"/>
-                </m:accPr>
+              <m:limLow>
                 <m:e>
                   <m:r>
                     <m:t>x</m:t>
                   </m:r>
                 </m:e>
-              </m:acc>
+                <m:lim>
+                  <m:r>
+                    <m:rPr>
+                      <m:sty m:val="p"/>
+                    </m:rPr>
+                    <m:t>∼</m:t>
+                  </m:r>
+                </m:lim>
+              </m:limLow>
               <m:r>
                 <m:rPr>
                   <m:sty m:val="p"/>
@@ -18261,16 +18536,21 @@
                 </m:rPr>
                 <m:t>(</m:t>
               </m:r>
-              <m:acc>
-                <m:accPr>
-                  <m:chr m:val="̃"/>
-                </m:accPr>
+              <m:limLow>
                 <m:e>
                   <m:r>
                     <m:t>x</m:t>
                   </m:r>
                 </m:e>
-              </m:acc>
+                <m:lim>
+                  <m:r>
+                    <m:rPr>
+                      <m:sty m:val="p"/>
+                    </m:rPr>
+                    <m:t>∼</m:t>
+                  </m:r>
+                </m:lim>
+              </m:limLow>
               <m:r>
                 <m:rPr>
                   <m:sty m:val="p"/>
@@ -18407,16 +18687,21 @@
           </m:rPr>
           <m:t>(</m:t>
         </m:r>
-        <m:acc>
-          <m:accPr>
-            <m:chr m:val="̃"/>
-          </m:accPr>
+        <m:limLow>
           <m:e>
             <m:r>
               <m:t>x</m:t>
             </m:r>
           </m:e>
-        </m:acc>
+          <m:lim>
+            <m:r>
+              <m:rPr>
+                <m:sty m:val="p"/>
+              </m:rPr>
+              <m:t>∼</m:t>
+            </m:r>
+          </m:lim>
+        </m:limLow>
         <m:r>
           <m:rPr>
             <m:sty m:val="p"/>
@@ -18446,16 +18731,21 @@
           </m:rPr>
           <m:t>(</m:t>
         </m:r>
-        <m:acc>
-          <m:accPr>
-            <m:chr m:val="̃"/>
-          </m:accPr>
+        <m:limLow>
           <m:e>
             <m:r>
               <m:t>x</m:t>
             </m:r>
           </m:e>
-        </m:acc>
+          <m:lim>
+            <m:r>
+              <m:rPr>
+                <m:sty m:val="p"/>
+              </m:rPr>
+              <m:t>∼</m:t>
+            </m:r>
+          </m:lim>
+        </m:limLow>
         <m:r>
           <m:rPr>
             <m:sty m:val="p"/>
@@ -18664,16 +18954,21 @@
                   </m:rPr>
                   <m:t>(</m:t>
                 </m:r>
-                <m:acc>
-                  <m:accPr>
-                    <m:chr m:val="̃"/>
-                  </m:accPr>
+                <m:limLow>
                   <m:e>
                     <m:r>
                       <m:t>x</m:t>
                     </m:r>
                   </m:e>
-                </m:acc>
+                  <m:lim>
+                    <m:r>
+                      <m:rPr>
+                        <m:sty m:val="p"/>
+                      </m:rPr>
+                      <m:t>∼</m:t>
+                    </m:r>
+                  </m:lim>
+                </m:limLow>
                 <m:r>
                   <m:rPr>
                     <m:sty m:val="p"/>
@@ -20683,16 +20978,21 @@
                 </m:rPr>
                 <m:t>(</m:t>
               </m:r>
-              <m:acc>
-                <m:accPr>
-                  <m:chr m:val="̃"/>
-                </m:accPr>
+              <m:limLow>
                 <m:e>
                   <m:r>
                     <m:t>x</m:t>
                   </m:r>
                 </m:e>
-              </m:acc>
+                <m:lim>
+                  <m:r>
+                    <m:rPr>
+                      <m:sty m:val="p"/>
+                    </m:rPr>
+                    <m:t>∼</m:t>
+                  </m:r>
+                </m:lim>
+              </m:limLow>
               <m:r>
                 <m:rPr>
                   <m:sty m:val="p"/>
@@ -20794,16 +21094,21 @@
                 </m:rPr>
                 <m:t>(</m:t>
               </m:r>
-              <m:acc>
-                <m:accPr>
-                  <m:chr m:val="̃"/>
-                </m:accPr>
+              <m:limLow>
                 <m:e>
                   <m:r>
                     <m:t>x</m:t>
                   </m:r>
                 </m:e>
-              </m:acc>
+                <m:lim>
+                  <m:r>
+                    <m:rPr>
+                      <m:sty m:val="p"/>
+                    </m:rPr>
+                    <m:t>∼</m:t>
+                  </m:r>
+                </m:lim>
+              </m:limLow>
               <m:r>
                 <m:rPr>
                   <m:sty m:val="p"/>
@@ -20890,16 +21195,21 @@
                 </m:rPr>
                 <m:t>(</m:t>
               </m:r>
-              <m:acc>
-                <m:accPr>
-                  <m:chr m:val="̃"/>
-                </m:accPr>
+              <m:limLow>
                 <m:e>
                   <m:r>
                     <m:t>x</m:t>
                   </m:r>
                 </m:e>
-              </m:acc>
+                <m:lim>
+                  <m:r>
+                    <m:rPr>
+                      <m:sty m:val="p"/>
+                    </m:rPr>
+                    <m:t>∼</m:t>
+                  </m:r>
+                </m:lim>
+              </m:limLow>
               <m:r>
                 <m:rPr>
                   <m:sty m:val="p"/>
@@ -20989,16 +21299,21 @@
                     </m:rPr>
                     <m:t>(</m:t>
                   </m:r>
-                  <m:acc>
-                    <m:accPr>
-                      <m:chr m:val="̃"/>
-                    </m:accPr>
+                  <m:limLow>
                     <m:e>
                       <m:r>
                         <m:t>x</m:t>
                       </m:r>
                     </m:e>
-                  </m:acc>
+                    <m:lim>
+                      <m:r>
+                        <m:rPr>
+                          <m:sty m:val="p"/>
+                        </m:rPr>
+                        <m:t>∼</m:t>
+                      </m:r>
+                    </m:lim>
+                  </m:limLow>
                   <m:r>
                     <m:rPr>
                       <m:sty m:val="p"/>
@@ -21025,16 +21340,21 @@
                 </m:rPr>
                 <m:t>(</m:t>
               </m:r>
-              <m:acc>
-                <m:accPr>
-                  <m:chr m:val="̃"/>
-                </m:accPr>
+              <m:limLow>
                 <m:e>
                   <m:r>
                     <m:t>x</m:t>
                   </m:r>
                 </m:e>
-              </m:acc>
+                <m:lim>
+                  <m:r>
+                    <m:rPr>
+                      <m:sty m:val="p"/>
+                    </m:rPr>
+                    <m:t>∼</m:t>
+                  </m:r>
+                </m:lim>
+              </m:limLow>
               <m:r>
                 <m:rPr>
                   <m:sty m:val="p"/>
@@ -21099,16 +21419,21 @@
                   </m:rPr>
                   <m:t>(</m:t>
                 </m:r>
-                <m:acc>
-                  <m:accPr>
-                    <m:chr m:val="̃"/>
-                  </m:accPr>
+                <m:limLow>
                   <m:e>
                     <m:r>
                       <m:t>x</m:t>
                     </m:r>
                   </m:e>
-                </m:acc>
+                  <m:lim>
+                    <m:r>
+                      <m:rPr>
+                        <m:sty m:val="p"/>
+                      </m:rPr>
+                      <m:t>∼</m:t>
+                    </m:r>
+                  </m:lim>
+                </m:limLow>
                 <m:r>
                   <m:rPr>
                     <m:sty m:val="p"/>
@@ -21159,16 +21484,21 @@
                       </m:rPr>
                       <m:t>(</m:t>
                     </m:r>
-                    <m:acc>
-                      <m:accPr>
-                        <m:chr m:val="̃"/>
-                      </m:accPr>
+                    <m:limLow>
                       <m:e>
                         <m:r>
                           <m:t>x</m:t>
                         </m:r>
                       </m:e>
-                    </m:acc>
+                      <m:lim>
+                        <m:r>
+                          <m:rPr>
+                            <m:sty m:val="p"/>
+                          </m:rPr>
+                          <m:t>∼</m:t>
+                        </m:r>
+                      </m:lim>
+                    </m:limLow>
                     <m:r>
                       <m:rPr>
                         <m:sty m:val="p"/>
@@ -21215,16 +21545,21 @@
                 </m:rPr>
                 <m:t>(</m:t>
               </m:r>
-              <m:acc>
-                <m:accPr>
-                  <m:chr m:val="̃"/>
-                </m:accPr>
+              <m:limLow>
                 <m:e>
                   <m:r>
                     <m:t>x</m:t>
                   </m:r>
                 </m:e>
-              </m:acc>
+                <m:lim>
+                  <m:r>
+                    <m:rPr>
+                      <m:sty m:val="p"/>
+                    </m:rPr>
+                    <m:t>∼</m:t>
+                  </m:r>
+                </m:lim>
+              </m:limLow>
               <m:r>
                 <m:rPr>
                   <m:sty m:val="p"/>
@@ -21263,16 +21598,21 @@
                     </m:rPr>
                     <m:t>(</m:t>
                   </m:r>
-                  <m:acc>
-                    <m:accPr>
-                      <m:chr m:val="̃"/>
-                    </m:accPr>
+                  <m:limLow>
                     <m:e>
                       <m:r>
                         <m:t>x</m:t>
                       </m:r>
                     </m:e>
-                  </m:acc>
+                    <m:lim>
+                      <m:r>
+                        <m:rPr>
+                          <m:sty m:val="p"/>
+                        </m:rPr>
+                        <m:t>∼</m:t>
+                      </m:r>
+                    </m:lim>
+                  </m:limLow>
                   <m:r>
                     <m:rPr>
                       <m:sty m:val="p"/>
@@ -21322,16 +21662,21 @@
                 </m:rPr>
                 <m:t>(</m:t>
               </m:r>
-              <m:acc>
-                <m:accPr>
-                  <m:chr m:val="̃"/>
-                </m:accPr>
+              <m:limLow>
                 <m:e>
                   <m:r>
                     <m:t>x</m:t>
                   </m:r>
                 </m:e>
-              </m:acc>
+                <m:lim>
+                  <m:r>
+                    <m:rPr>
+                      <m:sty m:val="p"/>
+                    </m:rPr>
+                    <m:t>∼</m:t>
+                  </m:r>
+                </m:lim>
+              </m:limLow>
               <m:r>
                 <m:rPr>
                   <m:sty m:val="p"/>
@@ -21365,16 +21710,21 @@
                 </m:rPr>
                 <m:t>(</m:t>
               </m:r>
-              <m:acc>
-                <m:accPr>
-                  <m:chr m:val="̃"/>
-                </m:accPr>
+              <m:limLow>
                 <m:e>
                   <m:r>
                     <m:t>x</m:t>
                   </m:r>
                 </m:e>
-              </m:acc>
+                <m:lim>
+                  <m:r>
+                    <m:rPr>
+                      <m:sty m:val="p"/>
+                    </m:rPr>
+                    <m:t>∼</m:t>
+                  </m:r>
+                </m:lim>
+              </m:limLow>
               <m:r>
                 <m:rPr>
                   <m:sty m:val="p"/>
@@ -36065,16 +36415,21 @@
             <m:oMath>
               <m:sSub>
                 <m:e>
-                  <m:acc>
-                    <m:accPr>
-                      <m:chr m:val="̃"/>
-                    </m:accPr>
+                  <m:limLow>
                     <m:e>
                       <m:r>
                         <m:t>x</m:t>
                       </m:r>
                     </m:e>
-                  </m:acc>
+                    <m:lim>
+                      <m:r>
+                        <m:rPr>
+                          <m:sty m:val="p"/>
+                        </m:rPr>
+                        <m:t>∼</m:t>
+                      </m:r>
+                    </m:lim>
+                  </m:limLow>
                 </m:e>
                 <m:sub>
                   <m:r>
@@ -36102,16 +36457,21 @@
               </m:r>
               <m:sSub>
                 <m:e>
-                  <m:acc>
-                    <m:accPr>
-                      <m:chr m:val="̃"/>
-                    </m:accPr>
+                  <m:limLow>
                     <m:e>
                       <m:r>
                         <m:t>x</m:t>
                       </m:r>
                     </m:e>
-                  </m:acc>
+                    <m:lim>
+                      <m:r>
+                        <m:rPr>
+                          <m:sty m:val="p"/>
+                        </m:rPr>
+                        <m:t>∼</m:t>
+                      </m:r>
+                    </m:lim>
+                  </m:limLow>
                 </m:e>
                 <m:sub>
                   <m:r>
@@ -36301,16 +36661,21 @@
                   </m:r>
                   <m:sSub>
                     <m:e>
-                      <m:acc>
-                        <m:accPr>
-                          <m:chr m:val="̃"/>
-                        </m:accPr>
+                      <m:limLow>
                         <m:e>
                           <m:r>
                             <m:t>X</m:t>
                           </m:r>
                         </m:e>
-                      </m:acc>
+                        <m:lim>
+                          <m:r>
+                            <m:rPr>
+                              <m:sty m:val="p"/>
+                            </m:rPr>
+                            <m:t>∼</m:t>
+                          </m:r>
+                        </m:lim>
+                      </m:limLow>
                     </m:e>
                     <m:sub>
                       <m:r>
@@ -36326,16 +36691,21 @@
                   </m:r>
                   <m:sSub>
                     <m:e>
-                      <m:acc>
-                        <m:accPr>
-                          <m:chr m:val="̃"/>
-                        </m:accPr>
+                      <m:limLow>
                         <m:e>
                           <m:r>
                             <m:t>x</m:t>
                           </m:r>
                         </m:e>
-                      </m:acc>
+                        <m:lim>
+                          <m:r>
+                            <m:rPr>
+                              <m:sty m:val="p"/>
+                            </m:rPr>
+                            <m:t>∼</m:t>
+                          </m:r>
+                        </m:lim>
+                      </m:limLow>
                     </m:e>
                     <m:sub>
                       <m:r>
@@ -36379,16 +36749,21 @@
               <w:t xml:space="preserve"> </w:t>
             </w:r>
             <m:oMath>
-              <m:acc>
-                <m:accPr>
-                  <m:chr m:val="̃"/>
-                </m:accPr>
+              <m:limLow>
                 <m:e>
                   <m:r>
                     <m:t>β</m:t>
                   </m:r>
                 </m:e>
-              </m:acc>
+                <m:lim>
+                  <m:r>
+                    <m:rPr>
+                      <m:sty m:val="p"/>
+                    </m:rPr>
+                    <m:t>∼</m:t>
+                  </m:r>
+                </m:lim>
+              </m:limLow>
             </m:oMath>
             <w:r>
               <w:t xml:space="preserve"> </w:t>
@@ -36407,10 +36782,7 @@
                 <m:jc m:val="center"/>
               </m:oMathParaPr>
               <m:oMath>
-                <m:acc>
-                  <m:accPr>
-                    <m:chr m:val="̃"/>
-                  </m:accPr>
+                <m:limLow>
                   <m:e>
                     <m:sSup>
                       <m:e>
@@ -36428,23 +36800,36 @@
                       </m:sup>
                     </m:sSup>
                   </m:e>
-                </m:acc>
+                  <m:lim>
+                    <m:r>
+                      <m:rPr>
+                        <m:sty m:val="p"/>
+                      </m:rPr>
+                      <m:t>∼</m:t>
+                    </m:r>
+                  </m:lim>
+                </m:limLow>
                 <m:r>
                   <m:rPr>
                     <m:sty m:val="p"/>
                   </m:rPr>
                   <m:t>(</m:t>
                 </m:r>
-                <m:acc>
-                  <m:accPr>
-                    <m:chr m:val="̃"/>
-                  </m:accPr>
+                <m:limLow>
                   <m:e>
                     <m:r>
                       <m:t>β</m:t>
                     </m:r>
                   </m:e>
-                </m:acc>
+                  <m:lim>
+                    <m:r>
+                      <m:rPr>
+                        <m:sty m:val="p"/>
+                      </m:rPr>
+                      <m:t>∼</m:t>
+                    </m:r>
+                  </m:lim>
+                </m:limLow>
                 <m:r>
                   <m:rPr>
                     <m:sty m:val="p"/>
@@ -36505,16 +36890,21 @@
                           <m:e>
                             <m:sSub>
                               <m:e>
-                                <m:acc>
-                                  <m:accPr>
-                                    <m:chr m:val="̃"/>
-                                  </m:accPr>
+                                <m:limLow>
                                   <m:e>
                                     <m:r>
                                       <m:t>x</m:t>
                                     </m:r>
                                   </m:e>
-                                </m:acc>
+                                  <m:lim>
+                                    <m:r>
+                                      <m:rPr>
+                                        <m:sty m:val="p"/>
+                                      </m:rPr>
+                                      <m:t>∼</m:t>
+                                    </m:r>
+                                  </m:lim>
+                                </m:limLow>
                               </m:e>
                               <m:sub>
                                 <m:r>
@@ -36872,16 +37262,21 @@
                     </m:r>
                     <m:sSub>
                       <m:e>
-                        <m:acc>
-                          <m:accPr>
-                            <m:chr m:val="̃"/>
-                          </m:accPr>
+                        <m:limLow>
                           <m:e>
                             <m:r>
                               <m:t>x</m:t>
                             </m:r>
                           </m:e>
-                        </m:acc>
+                          <m:lim>
+                            <m:r>
+                              <m:rPr>
+                                <m:sty m:val="p"/>
+                              </m:rPr>
+                              <m:t>∼</m:t>
+                            </m:r>
+                          </m:lim>
+                        </m:limLow>
                       </m:e>
                       <m:sub>
                         <m:r>
@@ -36923,16 +37318,21 @@
                       <m:e>
                         <m:sSub>
                           <m:e>
-                            <m:acc>
-                              <m:accPr>
-                                <m:chr m:val="̃"/>
-                              </m:accPr>
+                            <m:limLow>
                               <m:e>
                                 <m:r>
                                   <m:t>x</m:t>
                                 </m:r>
                               </m:e>
-                            </m:acc>
+                              <m:lim>
+                                <m:r>
+                                  <m:rPr>
+                                    <m:sty m:val="p"/>
+                                  </m:rPr>
+                                  <m:t>∼</m:t>
+                                </m:r>
+                              </m:lim>
+                            </m:limLow>
                           </m:e>
                           <m:sub>
                             <m:r>
@@ -36950,16 +37350,21 @@
                         </m:r>
                       </m:sup>
                     </m:sSup>
-                    <m:acc>
-                      <m:accPr>
-                        <m:chr m:val="̃"/>
-                      </m:accPr>
+                    <m:limLow>
                       <m:e>
                         <m:r>
                           <m:t>β</m:t>
                         </m:r>
                       </m:e>
-                    </m:acc>
+                      <m:lim>
+                        <m:r>
+                          <m:rPr>
+                            <m:sty m:val="p"/>
+                          </m:rPr>
+                          <m:t>∼</m:t>
+                        </m:r>
+                      </m:lim>
+                    </m:limLow>
                     <m:r>
                       <m:t>&amp;</m:t>
                     </m:r>
@@ -37027,16 +37432,21 @@
                   </m:rPr>
                   <m:t>(</m:t>
                 </m:r>
-                <m:acc>
-                  <m:accPr>
-                    <m:chr m:val="̃"/>
-                  </m:accPr>
+                <m:limLow>
                   <m:e>
                     <m:r>
                       <m:t>β</m:t>
                     </m:r>
                   </m:e>
-                </m:acc>
+                  <m:lim>
+                    <m:r>
+                      <m:rPr>
+                        <m:sty m:val="p"/>
+                      </m:rPr>
+                      <m:t>∼</m:t>
+                    </m:r>
+                  </m:lim>
+                </m:limLow>
                 <m:r>
                   <m:rPr>
                     <m:sty m:val="p"/>
@@ -37510,16 +37920,21 @@
                 <m:e>
                   <m:sSub>
                     <m:e>
-                      <m:acc>
-                        <m:accPr>
-                          <m:chr m:val="̃"/>
-                        </m:accPr>
+                      <m:limLow>
                         <m:e>
                           <m:r>
                             <m:t>x</m:t>
                           </m:r>
                         </m:e>
-                      </m:acc>
+                        <m:lim>
+                          <m:r>
+                            <m:rPr>
+                              <m:sty m:val="p"/>
+                            </m:rPr>
+                            <m:t>∼</m:t>
+                          </m:r>
+                        </m:lim>
+                      </m:limLow>
                     </m:e>
                     <m:sub>
                       <m:r>
@@ -37537,16 +37952,21 @@
                   </m:r>
                 </m:sup>
               </m:sSup>
-              <m:acc>
-                <m:accPr>
-                  <m:chr m:val="̃"/>
-                </m:accPr>
+              <m:limLow>
                 <m:e>
                   <m:r>
                     <m:t>β</m:t>
                   </m:r>
                 </m:e>
-              </m:acc>
+                <m:lim>
+                  <m:r>
+                    <m:rPr>
+                      <m:sty m:val="p"/>
+                    </m:rPr>
+                    <m:t>∼</m:t>
+                  </m:r>
+                </m:lim>
+              </m:limLow>
             </m:oMath>
             <w:r>
               <w:t xml:space="preserve"> </w:t>
@@ -37558,16 +37978,21 @@
               <w:t xml:space="preserve"> </w:t>
             </w:r>
             <m:oMath>
-              <m:acc>
-                <m:accPr>
-                  <m:chr m:val="̃"/>
-                </m:accPr>
+              <m:limLow>
                 <m:e>
                   <m:r>
                     <m:t>β</m:t>
                   </m:r>
                 </m:e>
-              </m:acc>
+                <m:lim>
+                  <m:r>
+                    <m:rPr>
+                      <m:sty m:val="p"/>
+                    </m:rPr>
+                    <m:t>∼</m:t>
+                  </m:r>
+                </m:lim>
+              </m:limLow>
             </m:oMath>
             <w:r>
               <w:t xml:space="preserve"> </w:t>
@@ -37585,16 +38010,21 @@
                     <m:e>
                       <m:sSub>
                         <m:e>
-                          <m:acc>
-                            <m:accPr>
-                              <m:chr m:val="̃"/>
-                            </m:accPr>
+                          <m:limLow>
                             <m:e>
                               <m:r>
                                 <m:t>x</m:t>
                               </m:r>
                             </m:e>
-                          </m:acc>
+                            <m:lim>
+                              <m:r>
+                                <m:rPr>
+                                  <m:sty m:val="p"/>
+                                </m:rPr>
+                                <m:t>∼</m:t>
+                              </m:r>
+                            </m:lim>
+                          </m:limLow>
                         </m:e>
                         <m:sub>
                           <m:r>
@@ -37694,16 +38124,21 @@
                                   </m:rPr>
                                   <m:t>∂</m:t>
                                 </m:r>
-                                <m:acc>
-                                  <m:accPr>
-                                    <m:chr m:val="̃"/>
-                                  </m:accPr>
+                                <m:limLow>
                                   <m:e>
                                     <m:r>
                                       <m:t>β</m:t>
                                     </m:r>
                                   </m:e>
-                                </m:acc>
+                                  <m:lim>
+                                    <m:r>
+                                      <m:rPr>
+                                        <m:sty m:val="p"/>
+                                      </m:rPr>
+                                      <m:t>∼</m:t>
+                                    </m:r>
+                                  </m:lim>
+                                </m:limLow>
                               </m:den>
                             </m:f>
                             <m:sSub>
@@ -37797,16 +38232,21 @@
                                   </m:rPr>
                                   <m:t>∂</m:t>
                                 </m:r>
-                                <m:acc>
-                                  <m:accPr>
-                                    <m:chr m:val="̃"/>
-                                  </m:accPr>
+                                <m:limLow>
                                   <m:e>
                                     <m:r>
                                       <m:t>β</m:t>
                                     </m:r>
                                   </m:e>
-                                </m:acc>
+                                  <m:lim>
+                                    <m:r>
+                                      <m:rPr>
+                                        <m:sty m:val="p"/>
+                                      </m:rPr>
+                                      <m:t>∼</m:t>
+                                    </m:r>
+                                  </m:lim>
+                                </m:limLow>
                               </m:den>
                             </m:f>
                             <m:sSub>
@@ -37969,16 +38409,21 @@
                     </m:r>
                     <m:sSub>
                       <m:e>
-                        <m:acc>
-                          <m:accPr>
-                            <m:chr m:val="̃"/>
-                          </m:accPr>
+                        <m:limLow>
                           <m:e>
                             <m:r>
                               <m:t>x</m:t>
                             </m:r>
                           </m:e>
-                        </m:acc>
+                          <m:lim>
+                            <m:r>
+                              <m:rPr>
+                                <m:sty m:val="p"/>
+                              </m:rPr>
+                              <m:t>∼</m:t>
+                            </m:r>
+                          </m:lim>
+                        </m:limLow>
                       </m:e>
                       <m:sub>
                         <m:r>
@@ -38072,16 +38517,21 @@
                 </m:rPr>
                 <m:t>(</m:t>
               </m:r>
-              <m:acc>
-                <m:accPr>
-                  <m:chr m:val="̃"/>
-                </m:accPr>
+              <m:limLow>
                 <m:e>
                   <m:r>
                     <m:t>β</m:t>
                   </m:r>
                 </m:e>
-              </m:acc>
+                <m:lim>
+                  <m:r>
+                    <m:rPr>
+                      <m:sty m:val="p"/>
+                    </m:rPr>
+                    <m:t>∼</m:t>
+                  </m:r>
+                </m:lim>
+              </m:limLow>
               <m:r>
                 <m:rPr>
                   <m:sty m:val="p"/>
@@ -38141,16 +38591,21 @@
                 </m:rPr>
                 <m:t>(</m:t>
               </m:r>
-              <m:acc>
-                <m:accPr>
-                  <m:chr m:val="̃"/>
-                </m:accPr>
+              <m:limLow>
                 <m:e>
                   <m:r>
                     <m:t>β</m:t>
                   </m:r>
                 </m:e>
-              </m:acc>
+                <m:lim>
+                  <m:r>
+                    <m:rPr>
+                      <m:sty m:val="p"/>
+                    </m:rPr>
+                    <m:t>∼</m:t>
+                  </m:r>
+                </m:lim>
+              </m:limLow>
               <m:r>
                 <m:rPr>
                   <m:sty m:val="p"/>
@@ -38173,10 +38628,7 @@
               <m:oMath>
                 <m:eqArr>
                   <m:e>
-                    <m:acc>
-                      <m:accPr>
-                        <m:chr m:val="̃"/>
-                      </m:accPr>
+                    <m:limLow>
                       <m:e>
                         <m:sSup>
                           <m:e>
@@ -38194,23 +38646,36 @@
                           </m:sup>
                         </m:sSup>
                       </m:e>
-                    </m:acc>
+                      <m:lim>
+                        <m:r>
+                          <m:rPr>
+                            <m:sty m:val="p"/>
+                          </m:rPr>
+                          <m:t>∼</m:t>
+                        </m:r>
+                      </m:lim>
+                    </m:limLow>
                     <m:r>
                       <m:rPr>
                         <m:sty m:val="p"/>
                       </m:rPr>
                       <m:t>(</m:t>
                     </m:r>
-                    <m:acc>
-                      <m:accPr>
-                        <m:chr m:val="̃"/>
-                      </m:accPr>
+                    <m:limLow>
                       <m:e>
                         <m:r>
                           <m:t>β</m:t>
                         </m:r>
                       </m:e>
-                    </m:acc>
+                      <m:lim>
+                        <m:r>
+                          <m:rPr>
+                            <m:sty m:val="p"/>
+                          </m:rPr>
+                          <m:t>∼</m:t>
+                        </m:r>
+                      </m:lim>
+                    </m:limLow>
                     <m:r>
                       <m:rPr>
                         <m:sty m:val="p"/>
@@ -38272,16 +38737,21 @@
                               </m:rPr>
                               <m:t>∂</m:t>
                             </m:r>
-                            <m:acc>
-                              <m:accPr>
-                                <m:chr m:val="̃"/>
-                              </m:accPr>
+                            <m:limLow>
                               <m:e>
                                 <m:r>
                                   <m:t>β</m:t>
                                 </m:r>
                               </m:e>
-                            </m:acc>
+                              <m:lim>
+                                <m:r>
+                                  <m:rPr>
+                                    <m:sty m:val="p"/>
+                                  </m:rPr>
+                                  <m:t>∼</m:t>
+                                </m:r>
+                              </m:lim>
+                            </m:limLow>
                           </m:den>
                         </m:f>
                       </m:e>
@@ -38351,16 +38821,21 @@
                       <m:e>
                         <m:sSub>
                           <m:e>
-                            <m:acc>
-                              <m:accPr>
-                                <m:chr m:val="̃"/>
-                              </m:accPr>
+                            <m:limLow>
                               <m:e>
                                 <m:r>
                                   <m:t>x</m:t>
                                 </m:r>
                               </m:e>
-                            </m:acc>
+                              <m:lim>
+                                <m:r>
+                                  <m:rPr>
+                                    <m:sty m:val="p"/>
+                                  </m:rPr>
+                                  <m:t>∼</m:t>
+                                </m:r>
+                              </m:lim>
+                            </m:limLow>
                           </m:e>
                           <m:sub>
                             <m:r>
@@ -38480,16 +38955,21 @@
                       <m:e>
                         <m:sSub>
                           <m:e>
-                            <m:acc>
-                              <m:accPr>
-                                <m:chr m:val="̃"/>
-                              </m:accPr>
+                            <m:limLow>
                               <m:e>
                                 <m:r>
                                   <m:t>x</m:t>
                                 </m:r>
                               </m:e>
-                            </m:acc>
+                              <m:lim>
+                                <m:r>
+                                  <m:rPr>
+                                    <m:sty m:val="p"/>
+                                  </m:rPr>
+                                  <m:t>∼</m:t>
+                                </m:r>
+                              </m:lim>
+                            </m:limLow>
                           </m:e>
                           <m:sub>
                             <m:r>
@@ -38753,16 +39233,21 @@
             <m:oMath>
               <m:sSub>
                 <m:e>
-                  <m:acc>
-                    <m:accPr>
-                      <m:chr m:val="̃"/>
-                    </m:accPr>
+                  <m:limLow>
                     <m:e>
                       <m:r>
                         <m:t>x</m:t>
                       </m:r>
                     </m:e>
-                  </m:acc>
+                    <m:lim>
+                      <m:r>
+                        <m:rPr>
+                          <m:sty m:val="p"/>
+                        </m:rPr>
+                        <m:t>∼</m:t>
+                      </m:r>
+                    </m:lim>
+                  </m:limLow>
                 </m:e>
                 <m:sub>
                   <m:r>
@@ -38938,16 +39423,21 @@
               <w:t xml:space="preserve"> </w:t>
             </w:r>
             <m:oMath>
-              <m:acc>
-                <m:accPr>
-                  <m:chr m:val="̃"/>
-                </m:accPr>
+              <m:limLow>
                 <m:e>
                   <m:r>
                     <m:t>β</m:t>
                   </m:r>
                 </m:e>
-              </m:acc>
+                <m:lim>
+                  <m:r>
+                    <m:rPr>
+                      <m:sty m:val="p"/>
+                    </m:rPr>
+                    <m:t>∼</m:t>
+                  </m:r>
+                </m:lim>
+              </m:limLow>
               <m:r>
                 <m:rPr>
                   <m:sty m:val="p"/>
@@ -39466,10 +39956,7 @@
               <m:oMath>
                 <m:eqArr>
                   <m:e>
-                    <m:acc>
-                      <m:accPr>
-                        <m:chr m:val="̃"/>
-                      </m:accPr>
+                    <m:limLow>
                       <m:e>
                         <m:sSup>
                           <m:e>
@@ -39487,7 +39974,15 @@
                           </m:sup>
                         </m:sSup>
                       </m:e>
-                    </m:acc>
+                      <m:lim>
+                        <m:r>
+                          <m:rPr>
+                            <m:sty m:val="p"/>
+                          </m:rPr>
+                          <m:t>∼</m:t>
+                        </m:r>
+                      </m:lim>
+                    </m:limLow>
                     <m:r>
                       <m:t>​</m:t>
                     </m:r>
@@ -40136,16 +40631,21 @@
                 <m:e>
                   <m:sSub>
                     <m:e>
-                      <m:acc>
-                        <m:accPr>
-                          <m:chr m:val="̃"/>
-                        </m:accPr>
+                      <m:limLow>
                         <m:e>
                           <m:r>
                             <m:t>x</m:t>
                           </m:r>
                         </m:e>
-                      </m:acc>
+                        <m:lim>
+                          <m:r>
+                            <m:rPr>
+                              <m:sty m:val="p"/>
+                            </m:rPr>
+                            <m:t>∼</m:t>
+                          </m:r>
+                        </m:lim>
+                      </m:limLow>
                     </m:e>
                     <m:sub>
                       <m:r>
@@ -40163,16 +40663,21 @@
                   </m:r>
                 </m:sup>
               </m:sSup>
-              <m:acc>
-                <m:accPr>
-                  <m:chr m:val="̃"/>
-                </m:accPr>
+              <m:limLow>
                 <m:e>
                   <m:r>
                     <m:t>β</m:t>
                   </m:r>
                 </m:e>
-              </m:acc>
+                <m:lim>
+                  <m:r>
+                    <m:rPr>
+                      <m:sty m:val="p"/>
+                    </m:rPr>
+                    <m:t>∼</m:t>
+                  </m:r>
+                </m:lim>
+              </m:limLow>
             </m:oMath>
             <w:r>
               <w:t xml:space="preserve">.</w:t>
@@ -40350,16 +40855,21 @@
                           </m:rPr>
                           <m:t>∂</m:t>
                         </m:r>
-                        <m:acc>
-                          <m:accPr>
-                            <m:chr m:val="̃"/>
-                          </m:accPr>
+                        <m:limLow>
                           <m:e>
                             <m:r>
                               <m:t>β</m:t>
                             </m:r>
                           </m:e>
-                        </m:acc>
+                          <m:lim>
+                            <m:r>
+                              <m:rPr>
+                                <m:sty m:val="p"/>
+                              </m:rPr>
+                              <m:t>∼</m:t>
+                            </m:r>
+                          </m:lim>
+                        </m:limLow>
                       </m:den>
                     </m:f>
                     <m:sSub>
@@ -40402,16 +40912,21 @@
                           </m:rPr>
                           <m:t>∂</m:t>
                         </m:r>
-                        <m:acc>
-                          <m:accPr>
-                            <m:chr m:val="̃"/>
-                          </m:accPr>
+                        <m:limLow>
                           <m:e>
                             <m:r>
                               <m:t>β</m:t>
                             </m:r>
                           </m:e>
-                        </m:acc>
+                          <m:lim>
+                            <m:r>
+                              <m:rPr>
+                                <m:sty m:val="p"/>
+                              </m:rPr>
+                              <m:t>∼</m:t>
+                            </m:r>
+                          </m:lim>
+                        </m:limLow>
                       </m:den>
                     </m:f>
                     <m:sSub>
@@ -40503,16 +41018,21 @@
                     </m:r>
                     <m:sSub>
                       <m:e>
-                        <m:acc>
-                          <m:accPr>
-                            <m:chr m:val="̃"/>
-                          </m:accPr>
+                        <m:limLow>
                           <m:e>
                             <m:r>
                               <m:t>x</m:t>
                             </m:r>
                           </m:e>
-                        </m:acc>
+                          <m:lim>
+                            <m:r>
+                              <m:rPr>
+                                <m:sty m:val="p"/>
+                              </m:rPr>
+                              <m:t>∼</m:t>
+                            </m:r>
+                          </m:lim>
+                        </m:limLow>
                       </m:e>
                       <m:sub>
                         <m:r>
@@ -40604,16 +41124,21 @@
                     </m:r>
                     <m:sSub>
                       <m:e>
-                        <m:acc>
-                          <m:accPr>
-                            <m:chr m:val="̃"/>
-                          </m:accPr>
+                        <m:limLow>
                           <m:e>
                             <m:r>
                               <m:t>x</m:t>
                             </m:r>
                           </m:e>
-                        </m:acc>
+                          <m:lim>
+                            <m:r>
+                              <m:rPr>
+                                <m:sty m:val="p"/>
+                              </m:rPr>
+                              <m:t>∼</m:t>
+                            </m:r>
+                          </m:lim>
+                        </m:limLow>
                       </m:e>
                       <m:sub>
                         <m:r>
@@ -40727,16 +41252,21 @@
               <w:t xml:space="preserve"> </w:t>
             </w:r>
             <m:oMath>
-              <m:acc>
-                <m:accPr>
-                  <m:chr m:val="̃"/>
-                </m:accPr>
+              <m:limLow>
                 <m:e>
                   <m:r>
                     <m:t>β</m:t>
                   </m:r>
                 </m:e>
-              </m:acc>
+                <m:lim>
+                  <m:r>
+                    <m:rPr>
+                      <m:sty m:val="p"/>
+                    </m:rPr>
+                    <m:t>∼</m:t>
+                  </m:r>
+                </m:lim>
+              </m:limLow>
               <m:r>
                 <m:rPr>
                   <m:sty m:val="p"/>
@@ -42850,32 +43380,42 @@
             </m:r>
           </m:lim>
         </m:limUpp>
-        <m:acc>
-          <m:accPr>
-            <m:chr m:val="̃"/>
-          </m:accPr>
+        <m:limLow>
           <m:e>
             <m:r>
               <m:t>x</m:t>
             </m:r>
           </m:e>
-        </m:acc>
+          <m:lim>
+            <m:r>
+              <m:rPr>
+                <m:sty m:val="p"/>
+              </m:rPr>
+              <m:t>∼</m:t>
+            </m:r>
+          </m:lim>
+        </m:limLow>
         <m:r>
           <m:rPr>
             <m:sty m:val="p"/>
           </m:rPr>
           <m:t>⋅</m:t>
         </m:r>
-        <m:acc>
-          <m:accPr>
-            <m:chr m:val="̃"/>
-          </m:accPr>
+        <m:limLow>
           <m:e>
             <m:r>
               <m:t>β</m:t>
             </m:r>
           </m:e>
-        </m:acc>
+          <m:lim>
+            <m:r>
+              <m:rPr>
+                <m:sty m:val="p"/>
+              </m:rPr>
+              <m:t>∼</m:t>
+            </m:r>
+          </m:lim>
+        </m:limLow>
       </m:oMath>
       <w:r>
         <w:t xml:space="preserve">,</w:t>
@@ -49450,16 +49990,21 @@
             <m:oMath>
               <m:sSub>
                 <m:e>
-                  <m:acc>
-                    <m:accPr>
-                      <m:chr m:val="̃"/>
-                    </m:accPr>
+                  <m:limLow>
                     <m:e>
                       <m:r>
                         <m:t>x</m:t>
                       </m:r>
                     </m:e>
-                  </m:acc>
+                    <m:lim>
+                      <m:r>
+                        <m:rPr>
+                          <m:sty m:val="p"/>
+                        </m:rPr>
+                        <m:t>∼</m:t>
+                      </m:r>
+                    </m:lim>
+                  </m:limLow>
                 </m:e>
                 <m:sub>
                   <m:r>
@@ -49542,16 +50087,21 @@
               <w:t xml:space="preserve"> </w:t>
             </w:r>
             <m:oMath>
-              <m:acc>
-                <m:accPr>
-                  <m:chr m:val="̃"/>
-                </m:accPr>
+              <m:limLow>
                 <m:e>
                   <m:r>
                     <m:t>β</m:t>
                   </m:r>
                 </m:e>
-              </m:acc>
+                <m:lim>
+                  <m:r>
+                    <m:rPr>
+                      <m:sty m:val="p"/>
+                    </m:rPr>
+                    <m:t>∼</m:t>
+                  </m:r>
+                </m:lim>
+              </m:limLow>
               <m:limUpp>
                 <m:e>
                   <m:r>
@@ -49686,16 +50236,21 @@
                             <m:grow/>
                           </m:dPr>
                           <m:e>
-                            <m:acc>
-                              <m:accPr>
-                                <m:chr m:val="̃"/>
-                              </m:accPr>
+                            <m:limLow>
                               <m:e>
                                 <m:r>
                                   <m:t>β</m:t>
                                 </m:r>
                               </m:e>
-                            </m:acc>
+                              <m:lim>
+                                <m:r>
+                                  <m:rPr>
+                                    <m:sty m:val="p"/>
+                                  </m:rPr>
+                                  <m:t>∼</m:t>
+                                </m:r>
+                              </m:lim>
+                            </m:limLow>
                           </m:e>
                         </m:d>
                         <m:r>
@@ -49786,16 +50341,21 @@
                       <m:e>
                         <m:sSub>
                           <m:e>
-                            <m:acc>
-                              <m:accPr>
-                                <m:chr m:val="̃"/>
-                              </m:accPr>
+                            <m:limLow>
                               <m:e>
                                 <m:r>
                                   <m:t>x</m:t>
                                 </m:r>
                               </m:e>
-                            </m:acc>
+                              <m:lim>
+                                <m:r>
+                                  <m:rPr>
+                                    <m:sty m:val="p"/>
+                                  </m:rPr>
+                                  <m:t>∼</m:t>
+                                </m:r>
+                              </m:lim>
+                            </m:limLow>
                           </m:e>
                           <m:sub>
                             <m:r>
@@ -49837,16 +50397,21 @@
                           <m:e>
                             <m:sSub>
                               <m:e>
-                                <m:acc>
-                                  <m:accPr>
-                                    <m:chr m:val="̃"/>
-                                  </m:accPr>
+                                <m:limLow>
                                   <m:e>
                                     <m:r>
                                       <m:t>x</m:t>
                                     </m:r>
                                   </m:e>
-                                </m:acc>
+                                  <m:lim>
+                                    <m:r>
+                                      <m:rPr>
+                                        <m:sty m:val="p"/>
+                                      </m:rPr>
+                                      <m:t>∼</m:t>
+                                    </m:r>
+                                  </m:lim>
+                                </m:limLow>
                               </m:e>
                               <m:sub>
                                 <m:r>
@@ -49915,16 +50480,21 @@
                       <m:e>
                         <m:sSub>
                           <m:e>
-                            <m:acc>
-                              <m:accPr>
-                                <m:chr m:val="̃"/>
-                              </m:accPr>
+                            <m:limLow>
                               <m:e>
                                 <m:r>
                                   <m:t>x</m:t>
                                 </m:r>
                               </m:e>
-                            </m:acc>
+                              <m:lim>
+                                <m:r>
+                                  <m:rPr>
+                                    <m:sty m:val="p"/>
+                                  </m:rPr>
+                                  <m:t>∼</m:t>
+                                </m:r>
+                              </m:lim>
+                            </m:limLow>
                           </m:e>
                           <m:sub>
                             <m:r>
@@ -49966,16 +50536,21 @@
                           <m:e>
                             <m:sSub>
                               <m:e>
-                                <m:acc>
-                                  <m:accPr>
-                                    <m:chr m:val="̃"/>
-                                  </m:accPr>
+                                <m:limLow>
                                   <m:e>
                                     <m:r>
                                       <m:t>x</m:t>
                                     </m:r>
                                   </m:e>
-                                </m:acc>
+                                  <m:lim>
+                                    <m:r>
+                                      <m:rPr>
+                                        <m:sty m:val="p"/>
+                                      </m:rPr>
+                                      <m:t>∼</m:t>
+                                    </m:r>
+                                  </m:lim>
+                                </m:limLow>
                               </m:e>
                               <m:sub>
                                 <m:r>
@@ -50165,16 +50740,21 @@
                 <m:e>
                   <m:limLow>
                     <m:e>
-                      <m:acc>
-                        <m:accPr>
-                          <m:chr m:val="̃"/>
-                        </m:accPr>
+                      <m:limLow>
                         <m:e>
                           <m:r>
                             <m:t>a</m:t>
                           </m:r>
                         </m:e>
-                      </m:acc>
+                        <m:lim>
+                          <m:r>
+                            <m:rPr>
+                              <m:sty m:val="p"/>
+                            </m:rPr>
+                            <m:t>∼</m:t>
+                          </m:r>
+                        </m:lim>
+                      </m:limLow>
                     </m:e>
                     <m:lim>
                       <m:r>
@@ -50211,16 +50791,21 @@
             <m:oMath>
               <m:sSup>
                 <m:e>
-                  <m:acc>
-                    <m:accPr>
-                      <m:chr m:val="̃"/>
-                    </m:accPr>
+                  <m:limLow>
                     <m:e>
                       <m:r>
                         <m:t>a</m:t>
                       </m:r>
                     </m:e>
-                  </m:acc>
+                    <m:lim>
+                      <m:r>
+                        <m:rPr>
+                          <m:sty m:val="p"/>
+                        </m:rPr>
+                        <m:t>∼</m:t>
+                      </m:r>
+                    </m:lim>
+                  </m:limLow>
                 </m:e>
                 <m:sup>
                   <m:r>
@@ -50257,31 +50842,41 @@
                   <m:grow/>
                 </m:dPr>
                 <m:e>
-                  <m:acc>
-                    <m:accPr>
-                      <m:chr m:val="̃"/>
-                    </m:accPr>
+                  <m:limLow>
                     <m:e>
                       <m:r>
                         <m:t>β</m:t>
                       </m:r>
                     </m:e>
-                  </m:acc>
+                    <m:lim>
+                      <m:r>
+                        <m:rPr>
+                          <m:sty m:val="p"/>
+                        </m:rPr>
+                        <m:t>∼</m:t>
+                      </m:r>
+                    </m:lim>
+                  </m:limLow>
                 </m:e>
               </m:d>
               <m:r>
                 <m:t>​</m:t>
               </m:r>
-              <m:acc>
-                <m:accPr>
-                  <m:chr m:val="̃"/>
-                </m:accPr>
+              <m:limLow>
                 <m:e>
                   <m:r>
                     <m:t>a</m:t>
                   </m:r>
                 </m:e>
-              </m:acc>
+                <m:lim>
+                  <m:r>
+                    <m:rPr>
+                      <m:sty m:val="p"/>
+                    </m:rPr>
+                    <m:t>∼</m:t>
+                  </m:r>
+                </m:lim>
+              </m:limLow>
               <m:r>
                 <m:rPr>
                   <m:sty m:val="p"/>
@@ -50348,16 +50943,21 @@
                 <m:e>
                   <m:sSup>
                     <m:e>
-                      <m:acc>
-                        <m:accPr>
-                          <m:chr m:val="̃"/>
-                        </m:accPr>
+                      <m:limLow>
                         <m:e>
                           <m:r>
                             <m:t>a</m:t>
                           </m:r>
                         </m:e>
-                      </m:acc>
+                        <m:lim>
+                          <m:r>
+                            <m:rPr>
+                              <m:sty m:val="p"/>
+                            </m:rPr>
+                            <m:t>∼</m:t>
+                          </m:r>
+                        </m:lim>
+                      </m:limLow>
                     </m:e>
                     <m:sup>
                       <m:r>
@@ -50370,16 +50970,21 @@
                   </m:sSup>
                   <m:sSub>
                     <m:e>
-                      <m:acc>
-                        <m:accPr>
-                          <m:chr m:val="̃"/>
-                        </m:accPr>
+                      <m:limLow>
                         <m:e>
                           <m:r>
                             <m:t>x</m:t>
                           </m:r>
                         </m:e>
-                      </m:acc>
+                        <m:lim>
+                          <m:r>
+                            <m:rPr>
+                              <m:sty m:val="p"/>
+                            </m:rPr>
+                            <m:t>∼</m:t>
+                          </m:r>
+                        </m:lim>
+                      </m:limLow>
                     </m:e>
                     <m:sub>
                       <m:r>
@@ -50464,16 +51069,21 @@
             <m:oMath>
               <m:sSup>
                 <m:e>
-                  <m:acc>
-                    <m:accPr>
-                      <m:chr m:val="̃"/>
-                    </m:accPr>
+                  <m:limLow>
                     <m:e>
                       <m:r>
                         <m:t>a</m:t>
                       </m:r>
                     </m:e>
-                  </m:acc>
+                    <m:lim>
+                      <m:r>
+                        <m:rPr>
+                          <m:sty m:val="p"/>
+                        </m:rPr>
+                        <m:t>∼</m:t>
+                      </m:r>
+                    </m:lim>
+                  </m:limLow>
                 </m:e>
                 <m:sup>
                   <m:r>
@@ -50486,16 +51096,21 @@
               </m:sSup>
               <m:sSub>
                 <m:e>
-                  <m:acc>
-                    <m:accPr>
-                      <m:chr m:val="̃"/>
-                    </m:accPr>
+                  <m:limLow>
                     <m:e>
                       <m:r>
                         <m:t>x</m:t>
                       </m:r>
                     </m:e>
-                  </m:acc>
+                    <m:lim>
+                      <m:r>
+                        <m:rPr>
+                          <m:sty m:val="p"/>
+                        </m:rPr>
+                        <m:t>∼</m:t>
+                      </m:r>
+                    </m:lim>
+                  </m:limLow>
                 </m:e>
                 <m:sub>
                   <m:r>
@@ -56021,32 +56636,42 @@
             </m:r>
           </m:lim>
         </m:limUpp>
-        <m:acc>
-          <m:accPr>
-            <m:chr m:val="̃"/>
-          </m:accPr>
+        <m:limLow>
           <m:e>
             <m:r>
               <m:t>x</m:t>
             </m:r>
           </m:e>
-        </m:acc>
+          <m:lim>
+            <m:r>
+              <m:rPr>
+                <m:sty m:val="p"/>
+              </m:rPr>
+              <m:t>∼</m:t>
+            </m:r>
+          </m:lim>
+        </m:limLow>
         <m:r>
           <m:rPr>
             <m:sty m:val="p"/>
           </m:rPr>
           <m:t>⋅</m:t>
         </m:r>
-        <m:acc>
-          <m:accPr>
-            <m:chr m:val="̃"/>
-          </m:accPr>
+        <m:limLow>
           <m:e>
             <m:r>
               <m:t>β</m:t>
             </m:r>
           </m:e>
-        </m:acc>
+          <m:lim>
+            <m:r>
+              <m:rPr>
+                <m:sty m:val="p"/>
+              </m:rPr>
+              <m:t>∼</m:t>
+            </m:r>
+          </m:lim>
+        </m:limLow>
       </m:oMath>
       <w:r>
         <w:t xml:space="preserve"> </w:t>
@@ -56212,32 +56837,42 @@
               </m:rPr>
               <m:t>∣</m:t>
             </m:r>
-            <m:acc>
-              <m:accPr>
-                <m:chr m:val="̃"/>
-              </m:accPr>
+            <m:limLow>
               <m:e>
                 <m:r>
                   <m:t>X</m:t>
                 </m:r>
               </m:e>
-            </m:acc>
+              <m:lim>
+                <m:r>
+                  <m:rPr>
+                    <m:sty m:val="p"/>
+                  </m:rPr>
+                  <m:t>∼</m:t>
+                </m:r>
+              </m:lim>
+            </m:limLow>
             <m:r>
               <m:rPr>
                 <m:sty m:val="p"/>
               </m:rPr>
               <m:t>=</m:t>
             </m:r>
-            <m:acc>
-              <m:accPr>
-                <m:chr m:val="̃"/>
-              </m:accPr>
+            <m:limLow>
               <m:e>
                 <m:r>
                   <m:t>x</m:t>
                 </m:r>
               </m:e>
-            </m:acc>
+              <m:lim>
+                <m:r>
+                  <m:rPr>
+                    <m:sty m:val="p"/>
+                  </m:rPr>
+                  <m:t>∼</m:t>
+                </m:r>
+              </m:lim>
+            </m:limLow>
           </m:e>
         </m:d>
         <m:r>
@@ -57074,32 +57709,42 @@
                   </m:r>
                 </m:lim>
               </m:limUpp>
-              <m:acc>
-                <m:accPr>
-                  <m:chr m:val="̃"/>
-                </m:accPr>
+              <m:limLow>
                 <m:e>
                   <m:r>
                     <m:t>x</m:t>
                   </m:r>
                 </m:e>
-              </m:acc>
+                <m:lim>
+                  <m:r>
+                    <m:rPr>
+                      <m:sty m:val="p"/>
+                    </m:rPr>
+                    <m:t>∼</m:t>
+                  </m:r>
+                </m:lim>
+              </m:limLow>
               <m:r>
                 <m:rPr>
                   <m:sty m:val="p"/>
                 </m:rPr>
                 <m:t>⋅</m:t>
               </m:r>
-              <m:acc>
-                <m:accPr>
-                  <m:chr m:val="̃"/>
-                </m:accPr>
+              <m:limLow>
                 <m:e>
                   <m:r>
                     <m:t>β</m:t>
                   </m:r>
                 </m:e>
-              </m:acc>
+                <m:lim>
+                  <m:r>
+                    <m:rPr>
+                      <m:sty m:val="p"/>
+                    </m:rPr>
+                    <m:t>∼</m:t>
+                  </m:r>
+                </m:lim>
+              </m:limLow>
               <m:r>
                 <m:rPr>
                   <m:sty m:val="p"/>
@@ -59435,32 +60080,42 @@
                 </m:rPr>
                 <m:t>=</m:t>
               </m:r>
-              <m:acc>
-                <m:accPr>
-                  <m:chr m:val="̃"/>
-                </m:accPr>
+              <m:limLow>
                 <m:e>
                   <m:r>
                     <m:t>x</m:t>
                   </m:r>
                 </m:e>
-              </m:acc>
+                <m:lim>
+                  <m:r>
+                    <m:rPr>
+                      <m:sty m:val="p"/>
+                    </m:rPr>
+                    <m:t>∼</m:t>
+                  </m:r>
+                </m:lim>
+              </m:limLow>
               <m:r>
                 <m:rPr>
                   <m:sty m:val="p"/>
                 </m:rPr>
                 <m:t>⋅</m:t>
               </m:r>
-              <m:acc>
-                <m:accPr>
-                  <m:chr m:val="̃"/>
-                </m:accPr>
+              <m:limLow>
                 <m:e>
                   <m:r>
                     <m:t>β</m:t>
                   </m:r>
                 </m:e>
-              </m:acc>
+                <m:lim>
+                  <m:r>
+                    <m:rPr>
+                      <m:sty m:val="p"/>
+                    </m:rPr>
+                    <m:t>∼</m:t>
+                  </m:r>
+                </m:lim>
+              </m:limLow>
             </m:oMath>
             <w:r>
               <w:t xml:space="preserve">.</w:t>
@@ -59684,16 +60339,21 @@
               </m:r>
               <m:sSub>
                 <m:e>
-                  <m:acc>
-                    <m:accPr>
-                      <m:chr m:val="̃"/>
-                    </m:accPr>
+                  <m:limLow>
                     <m:e>
                       <m:r>
                         <m:t>x</m:t>
                       </m:r>
                     </m:e>
-                  </m:acc>
+                    <m:lim>
+                      <m:r>
+                        <m:rPr>
+                          <m:sty m:val="p"/>
+                        </m:rPr>
+                        <m:t>∼</m:t>
+                      </m:r>
+                    </m:lim>
+                  </m:limLow>
                 </m:e>
                 <m:sub>
                   <m:r>
@@ -60198,16 +60858,21 @@
               </m:r>
               <m:sSub>
                 <m:e>
-                  <m:acc>
-                    <m:accPr>
-                      <m:chr m:val="̃"/>
-                    </m:accPr>
+                  <m:limLow>
                     <m:e>
                       <m:r>
                         <m:t>x</m:t>
                       </m:r>
                     </m:e>
-                  </m:acc>
+                    <m:lim>
+                      <m:r>
+                        <m:rPr>
+                          <m:sty m:val="p"/>
+                        </m:rPr>
+                        <m:t>∼</m:t>
+                      </m:r>
+                    </m:lim>
+                  </m:limLow>
                 </m:e>
                 <m:sub>
                   <m:r>
@@ -60606,16 +61271,21 @@
               </m:r>
               <m:sSub>
                 <m:e>
-                  <m:acc>
-                    <m:accPr>
-                      <m:chr m:val="̃"/>
-                    </m:accPr>
+                  <m:limLow>
                     <m:e>
                       <m:r>
                         <m:t>x</m:t>
                       </m:r>
                     </m:e>
-                  </m:acc>
+                    <m:lim>
+                      <m:r>
+                        <m:rPr>
+                          <m:sty m:val="p"/>
+                        </m:rPr>
+                        <m:t>∼</m:t>
+                      </m:r>
+                    </m:lim>
+                  </m:limLow>
                 </m:e>
                 <m:sub>
                   <m:r>
@@ -63323,16 +63993,21 @@
         <w:t xml:space="preserve"> </w:t>
       </w:r>
       <m:oMath>
-        <m:acc>
-          <m:accPr>
-            <m:chr m:val="̃"/>
-          </m:accPr>
+        <m:limLow>
           <m:e>
             <m:r>
               <m:t>X</m:t>
             </m:r>
           </m:e>
-        </m:acc>
+          <m:lim>
+            <m:r>
+              <m:rPr>
+                <m:sty m:val="p"/>
+              </m:rPr>
+              <m:t>∼</m:t>
+            </m:r>
+          </m:lim>
+        </m:limLow>
       </m:oMath>
       <w:r>
         <w:t xml:space="preserve"> </w:t>
@@ -63344,16 +64019,21 @@
         <w:t xml:space="preserve"> </w:t>
       </w:r>
       <m:oMath>
-        <m:acc>
-          <m:accPr>
-            <m:chr m:val="̃"/>
-          </m:accPr>
+        <m:limLow>
           <m:e>
             <m:r>
               <m:t>X</m:t>
             </m:r>
           </m:e>
-        </m:acc>
+          <m:lim>
+            <m:r>
+              <m:rPr>
+                <m:sty m:val="p"/>
+              </m:rPr>
+              <m:t>∼</m:t>
+            </m:r>
+          </m:lim>
+        </m:limLow>
       </m:oMath>
       <w:r>
         <w:t xml:space="preserve"> </w:t>

</xml_diff>

<commit_message>
Deploying to gh-pages from @ Morrison-Lab/rme@1fc40655f4e7b4e80d61b04f35fb32c4c6a0eb2d 🚀
</commit_message>
<xml_diff>
--- a/chapters/Intro-to-GLMs-handout.docx
+++ b/chapters/Intro-to-GLMs-handout.docx
@@ -9776,7 +9776,7 @@
               <w:pStyle w:val="BodyText"/>
             </w:pPr>
             <w:r>
-              <w:t xml:space="preserve">$$\operatorname{P}(Y|\mathord{\smash[b]{\underset{\raise.3ex\hbox{$\scriptstyle\sim$}}{X}}\vphantom{X}})$$</w:t>
+              <w:t xml:space="preserve">$$\mathbb{P}(Y|\mathord{\smash[b]{\underset{\raise.3ex\hbox{$\scriptstyle\sim$}}{X}}\vphantom{X}})$$</w:t>
             </w:r>
           </w:p>
           <w:bookmarkEnd w:id="125"/>
@@ -9839,7 +9839,7 @@
               <w:t xml:space="preserve"> </w:t>
             </w:r>
             <w:r>
-              <w:t xml:space="preserve">$\operatorname{P}(Y|\mathord{\smash[b]{\underset{\raise.3ex\hbox{$\scriptstyle\sim$}}{X}}\vphantom{X}})$</w:t>
+              <w:t xml:space="preserve">$\mathbb{P}(Y|\mathord{\smash[b]{\underset{\raise.3ex\hbox{$\scriptstyle\sim$}}{X}}\vphantom{X}})$</w:t>
             </w:r>
             <w:r>
               <w:t xml:space="preserve">?</w:t>
@@ -11376,7 +11376,7 @@
               <w:t xml:space="preserve"> </w:t>
             </w:r>
             <w:r>
-              <w:t xml:space="preserve">$\operatorname{log}\mathopen{}\left\{\frac{\mu(y)}{1-\mu(y)}\right\}\mathclose{} = \eta(\mathord{\smash[b]{\underset{\raise.3ex\hbox{$\scriptstyle\sim$}}{x}}\vphantom{x}})$</w:t>
+              <w:t xml:space="preserve">${\operatorname{log}\mathopen{}\left\{\frac{\mu(y)}{1-\mu(y)}\right\}\mathclose{}} = \eta(\mathord{\smash[b]{\underset{\raise.3ex\hbox{$\scriptstyle\sim$}}{x}}\vphantom{x}})$</w:t>
             </w:r>
           </w:p>
           <w:p>
@@ -11394,7 +11394,7 @@
               <w:t xml:space="preserve"> </w:t>
             </w:r>
             <w:r>
-              <w:t xml:space="preserve">$\operatorname{log}\mathopen{}\left\{\mu(y)\right\}\mathclose{} = \eta(\mathord{\smash[b]{\underset{\raise.3ex\hbox{$\scriptstyle\sim$}}{x}}\vphantom{x}})$</w:t>
+              <w:t xml:space="preserve">${\operatorname{log}\mathopen{}\left\{\mu(y)\right\}\mathclose{}} = \eta(\mathord{\smash[b]{\underset{\raise.3ex\hbox{$\scriptstyle\sim$}}{x}}\vphantom{x}})$</w:t>
             </w:r>
           </w:p>
           <w:p>
@@ -11430,7 +11430,7 @@
               <w:t xml:space="preserve"> </w:t>
             </w:r>
             <w:r>
-              <w:t xml:space="preserve">$\operatorname{log}\mathopen{}\left\{-\operatorname{log}\mathopen{}\left\{1-\mu(y)\right\}\mathclose{}\right\}\mathclose{} = \eta(\mathord{\smash[b]{\underset{\raise.3ex\hbox{$\scriptstyle\sim$}}{x}}\vphantom{x}})$</w:t>
+              <w:t xml:space="preserve">${\operatorname{log}\mathopen{}\left\{-{\operatorname{log}\mathopen{}\left\{1-\mu(y)\right\}\mathclose{}}\right\}\mathclose{}} = \eta(\mathord{\smash[b]{\underset{\raise.3ex\hbox{$\scriptstyle\sim$}}{x}}\vphantom{x}})$</w:t>
             </w:r>
           </w:p>
           <w:p>
@@ -12052,7 +12052,7 @@
               <w:t xml:space="preserve"> </w:t>
             </w:r>
             <w:r>
-              <w:t xml:space="preserve">$\eta(\mathord{\smash[b]{\underset{\raise.3ex\hbox{$\scriptstyle\sim$}}{x}}\vphantom{x}}) = \beta_0 + \beta_1 \operatorname{log}\mathopen{}\left\{x\right\}\mathclose{} + \beta_2 x^2$</w:t>
+              <w:t xml:space="preserve">$\eta(\mathord{\smash[b]{\underset{\raise.3ex\hbox{$\scriptstyle\sim$}}{x}}\vphantom{x}}) = \beta_0 + \beta_1 {\operatorname{log}\mathopen{}\left\{x\right\}\mathclose{}} + \beta_2 x^2$</w:t>
             </w:r>
             <w:r>
               <w:t xml:space="preserve"> </w:t>
@@ -12911,7 +12911,7 @@
               <w:t xml:space="preserve"> </w:t>
             </w:r>
             <w:r>
-              <w:t xml:space="preserve">$\mu(\mathord{\smash[b]{\underset{\raise.3ex\hbox{$\scriptstyle\sim$}}{x}}\vphantom{x}}) \stackrel{\text{def}}{=}\operatorname{E}\mathopen{}\left[Y|\mathord{\smash[b]{\underset{\raise.3ex\hbox{$\scriptstyle\sim$}}{X}}\vphantom{X}}=\mathord{\smash[b]{\underset{\raise.3ex\hbox{$\scriptstyle\sim$}}{x}}\vphantom{x}}\right]\mathclose{}$</w:t>
+              <w:t xml:space="preserve">$\mu(\mathord{\smash[b]{\underset{\raise.3ex\hbox{$\scriptstyle\sim$}}{x}}\vphantom{x}}) \stackrel{\text{def}}{=}{\mathbb{E}\mathopen{}\left[Y|\mathord{\smash[b]{\underset{\raise.3ex\hbox{$\scriptstyle\sim$}}{X}}\vphantom{X}}=\mathord{\smash[b]{\underset{\raise.3ex\hbox{$\scriptstyle\sim$}}{x}}\vphantom{x}}\right]\mathclose{}}$</w:t>
             </w:r>
             <w:r>
               <w:t xml:space="preserve"> </w:t>
@@ -14919,7 +14919,7 @@
               <w:t xml:space="preserve"> </w:t>
             </w:r>
             <w:r>
-              <w:t xml:space="preserve">$\mu(\mathord{\smash[b]{\underset{\raise.3ex\hbox{$\scriptstyle\sim$}}{x}}\vphantom{x}}) \stackrel{\text{def}}{=}\operatorname{E}\mathopen{}\left[Y|\mathord{\smash[b]{\underset{\raise.3ex\hbox{$\scriptstyle\sim$}}{X}}\vphantom{X}}=\mathord{\smash[b]{\underset{\raise.3ex\hbox{$\scriptstyle\sim$}}{x}}\vphantom{x}}\right]\mathclose{}$</w:t>
+              <w:t xml:space="preserve">$\mu(\mathord{\smash[b]{\underset{\raise.3ex\hbox{$\scriptstyle\sim$}}{x}}\vphantom{x}}) \stackrel{\text{def}}{=}{\mathbb{E}\mathopen{}\left[Y|\mathord{\smash[b]{\underset{\raise.3ex\hbox{$\scriptstyle\sim$}}{X}}\vphantom{X}}=\mathord{\smash[b]{\underset{\raise.3ex\hbox{$\scriptstyle\sim$}}{x}}\vphantom{x}}\right]\mathclose{}}$</w:t>
             </w:r>
             <w:r>
               <w:t xml:space="preserve">,</w:t>
@@ -15120,7 +15120,7 @@
               <w:t xml:space="preserve"> </w:t>
             </w:r>
             <w:r>
-              <w:t xml:space="preserve">$\mu(\mathord{\smash[b]{\underset{\raise.3ex\hbox{$\scriptstyle\sim$}}{x}}\vphantom{x}}) \stackrel{\text{def}}{=}\operatorname{E}\mathopen{}\left[Y|\mathord{\smash[b]{\underset{\raise.3ex\hbox{$\scriptstyle\sim$}}{X}}\vphantom{X}}=\mathord{\smash[b]{\underset{\raise.3ex\hbox{$\scriptstyle\sim$}}{x}}\vphantom{x}}\right]\mathclose{}$</w:t>
+              <w:t xml:space="preserve">$\mu(\mathord{\smash[b]{\underset{\raise.3ex\hbox{$\scriptstyle\sim$}}{x}}\vphantom{x}}) \stackrel{\text{def}}{=}{\mathbb{E}\mathopen{}\left[Y|\mathord{\smash[b]{\underset{\raise.3ex\hbox{$\scriptstyle\sim$}}{X}}\vphantom{X}}=\mathord{\smash[b]{\underset{\raise.3ex\hbox{$\scriptstyle\sim$}}{x}}\vphantom{x}}\right]\mathclose{}}$</w:t>
             </w:r>
             <w:r>
               <w:t xml:space="preserve">,</w:t>
@@ -15784,6 +15784,7 @@
             <m:oMath>
               <m:r>
                 <m:rPr>
+                  <m:scr m:val="double-struck"/>
                   <m:sty m:val="p"/>
                 </m:rPr>
                 <m:t>P</m:t>
@@ -18714,7 +18715,7 @@
               <w:t xml:space="preserve"> </w:t>
             </w:r>
             <w:r>
-              <w:t xml:space="preserve">$\mu(\mathord{\smash[b]{\underset{\raise.3ex\hbox{$\scriptstyle\sim$}}{x}}\vphantom{x}}) = \operatorname{exp}\mathopen{}\left\{\eta(\mathord{\smash[b]{\underset{\raise.3ex\hbox{$\scriptstyle\sim$}}{x}}\vphantom{x}})\right\}\mathclose{} &gt; 0$</w:t>
+              <w:t xml:space="preserve">$\mu(\mathord{\smash[b]{\underset{\raise.3ex\hbox{$\scriptstyle\sim$}}{x}}\vphantom{x}}) = {\operatorname{exp}\mathopen{}\left\{\eta(\mathord{\smash[b]{\underset{\raise.3ex\hbox{$\scriptstyle\sim$}}{x}}\vphantom{x}})\right\}\mathclose{}} &gt; 0$</w:t>
             </w:r>
             <w:r>
               <w:t xml:space="preserve">, so a mean count is never negative;</w:t>
@@ -24431,6 +24432,7 @@
                   <m:e>
                     <m:r>
                       <m:rPr>
+                        <m:scr m:val="double-struck"/>
                         <m:sty m:val="p"/>
                       </m:rPr>
                       <m:t>E</m:t>
@@ -25453,6 +25455,7 @@
                       <m:num>
                         <m:r>
                           <m:rPr>
+                            <m:scr m:val="double-struck"/>
                             <m:sty m:val="p"/>
                           </m:rPr>
                           <m:t>E</m:t>
@@ -25598,6 +25601,7 @@
             <m:oMath>
               <m:r>
                 <m:rPr>
+                  <m:scr m:val="double-struck"/>
                   <m:sty m:val="p"/>
                 </m:rPr>
                 <m:t>E</m:t>
@@ -26387,6 +26391,7 @@
                       <m:num>
                         <m:r>
                           <m:rPr>
+                            <m:scr m:val="double-struck"/>
                             <m:sty m:val="p"/>
                           </m:rPr>
                           <m:t>E</m:t>
@@ -26687,6 +26692,7 @@
                     </m:r>
                     <m:r>
                       <m:rPr>
+                        <m:scr m:val="double-struck"/>
                         <m:sty m:val="p"/>
                       </m:rPr>
                       <m:t>E</m:t>
@@ -27187,6 +27193,7 @@
             <m:oMath>
               <m:r>
                 <m:rPr>
+                  <m:scr m:val="double-struck"/>
                   <m:sty m:val="p"/>
                 </m:rPr>
                 <m:t>E</m:t>
@@ -27368,6 +27375,7 @@
             <m:oMath>
               <m:r>
                 <m:rPr>
+                  <m:scr m:val="double-struck"/>
                   <m:sty m:val="p"/>
                 </m:rPr>
                 <m:t>E</m:t>
@@ -27700,6 +27708,7 @@
             <m:oMath>
               <m:r>
                 <m:rPr>
+                  <m:scr m:val="double-struck"/>
                   <m:sty m:val="p"/>
                 </m:rPr>
                 <m:t>E</m:t>
@@ -28855,6 +28864,7 @@
             <m:oMath>
               <m:r>
                 <m:rPr>
+                  <m:scr m:val="double-struck"/>
                   <m:sty m:val="p"/>
                 </m:rPr>
                 <m:t>E</m:t>
@@ -33432,7 +33442,7 @@
               <w:t xml:space="preserve"> </w:t>
             </w:r>
             <w:r>
-              <w:t xml:space="preserve">$\mu_i \stackrel{\text{def}}{=}\operatorname{E}\mathopen{}\left[Y_i | \mathord{\smash[b]{\underset{\raise.3ex\hbox{$\scriptstyle\sim$}}{X}}\vphantom{X}}_i = \mathord{\smash[b]{\underset{\raise.3ex\hbox{$\scriptstyle\sim$}}{x}}\vphantom{x}}_i\right]\mathclose{}$</w:t>
+              <w:t xml:space="preserve">$\mu_i \stackrel{\text{def}}{=}{\mathbb{E}\mathopen{}\left[Y_i | \mathord{\smash[b]{\underset{\raise.3ex\hbox{$\scriptstyle\sim$}}{X}}\vphantom{X}}_i = \mathord{\smash[b]{\underset{\raise.3ex\hbox{$\scriptstyle\sim$}}{x}}\vphantom{x}}_i\right]\mathclose{}}$</w:t>
             </w:r>
             <w:r>
               <w:t xml:space="preserve">.</w:t>
@@ -38901,36 +38911,77 @@
                           </m:rPr>
                           <m:t>log</m:t>
                         </m:r>
-                      </m:e>
-                    </m:nary>
-                    <m:r>
-                      <m:t>​</m:t>
-                    </m:r>
-                    <m:d>
-                      <m:dPr>
-                        <m:begChr m:val="{"/>
-                        <m:sepChr m:val=""/>
-                        <m:endChr m:val="}"/>
-                        <m:grow/>
-                      </m:dPr>
-                      <m:e>
-                        <m:f>
-                          <m:fPr>
-                            <m:type m:val="bar"/>
-                          </m:fPr>
-                          <m:num>
-                            <m:sSubSup>
-                              <m:e>
-                                <m:r>
-                                  <m:t>μ</m:t>
-                                </m:r>
-                              </m:e>
-                              <m:sub>
-                                <m:r>
-                                  <m:t>i</m:t>
-                                </m:r>
-                              </m:sub>
-                              <m:sup>
+                        <m:r>
+                          <m:t>​</m:t>
+                        </m:r>
+                        <m:d>
+                          <m:dPr>
+                            <m:begChr m:val="{"/>
+                            <m:sepChr m:val=""/>
+                            <m:endChr m:val="}"/>
+                            <m:grow/>
+                          </m:dPr>
+                          <m:e>
+                            <m:f>
+                              <m:fPr>
+                                <m:type m:val="bar"/>
+                              </m:fPr>
+                              <m:num>
+                                <m:sSubSup>
+                                  <m:e>
+                                    <m:r>
+                                      <m:t>μ</m:t>
+                                    </m:r>
+                                  </m:e>
+                                  <m:sub>
+                                    <m:r>
+                                      <m:t>i</m:t>
+                                    </m:r>
+                                  </m:sub>
+                                  <m:sup>
+                                    <m:sSub>
+                                      <m:e>
+                                        <m:r>
+                                          <m:t>y</m:t>
+                                        </m:r>
+                                      </m:e>
+                                      <m:sub>
+                                        <m:r>
+                                          <m:t>i</m:t>
+                                        </m:r>
+                                      </m:sub>
+                                    </m:sSub>
+                                  </m:sup>
+                                </m:sSubSup>
+                                <m:sSup>
+                                  <m:e>
+                                    <m:r>
+                                      <m:t>e</m:t>
+                                    </m:r>
+                                  </m:e>
+                                  <m:sup>
+                                    <m:r>
+                                      <m:rPr>
+                                        <m:sty m:val="p"/>
+                                      </m:rPr>
+                                      <m:t>−</m:t>
+                                    </m:r>
+                                    <m:sSub>
+                                      <m:e>
+                                        <m:r>
+                                          <m:t>μ</m:t>
+                                        </m:r>
+                                      </m:e>
+                                      <m:sub>
+                                        <m:r>
+                                          <m:t>i</m:t>
+                                        </m:r>
+                                      </m:sub>
+                                    </m:sSub>
+                                  </m:sup>
+                                </m:sSup>
+                              </m:num>
+                              <m:den>
                                 <m:sSub>
                                   <m:e>
                                     <m:r>
@@ -38943,62 +38994,21 @@
                                     </m:r>
                                   </m:sub>
                                 </m:sSub>
-                              </m:sup>
-                            </m:sSubSup>
-                            <m:sSup>
-                              <m:e>
-                                <m:r>
-                                  <m:t>e</m:t>
-                                </m:r>
-                              </m:e>
-                              <m:sup>
                                 <m:r>
                                   <m:rPr>
                                     <m:sty m:val="p"/>
                                   </m:rPr>
-                                  <m:t>−</m:t>
+                                  <m:t>!</m:t>
                                 </m:r>
-                                <m:sSub>
-                                  <m:e>
-                                    <m:r>
-                                      <m:t>μ</m:t>
-                                    </m:r>
-                                  </m:e>
-                                  <m:sub>
-                                    <m:r>
-                                      <m:t>i</m:t>
-                                    </m:r>
-                                  </m:sub>
-                                </m:sSub>
-                              </m:sup>
-                            </m:sSup>
-                          </m:num>
-                          <m:den>
-                            <m:sSub>
-                              <m:e>
-                                <m:r>
-                                  <m:t>y</m:t>
-                                </m:r>
-                              </m:e>
-                              <m:sub>
-                                <m:r>
-                                  <m:t>i</m:t>
-                                </m:r>
-                              </m:sub>
-                            </m:sSub>
-                            <m:r>
-                              <m:rPr>
-                                <m:sty m:val="p"/>
-                              </m:rPr>
-                              <m:t>!</m:t>
-                            </m:r>
-                          </m:den>
-                        </m:f>
+                              </m:den>
+                            </m:f>
+                          </m:e>
+                        </m:d>
+                        <m:r>
+                          <m:t>​</m:t>
+                        </m:r>
                       </m:e>
-                    </m:d>
-                    <m:r>
-                      <m:t>​</m:t>
-                    </m:r>
+                    </m:nary>
                     <m:r>
                       <m:t>&amp;</m:t>
                     </m:r>
@@ -43807,7 +43817,7 @@
             </w:pPr>
             <w:r>
               <w:t xml:space="preserve">$$
-    \underbrace{\ell''\mathopen{}\left(\mathord{\smash[b]{\underset{\raise.3ex\hbox{$\scriptstyle\sim$}}{\beta}}\vphantom{\beta}}\right)\mathclose{}}_{2 \times 2}
+    \underbrace{{\ell''\mathopen{}\left(\mathord{\smash[b]{\underset{\raise.3ex\hbox{$\scriptstyle\sim$}}{\beta}}\vphantom{\beta}}\right)\mathclose{}}}_{2 \times 2}
     = -\sum_{i=1}^{49} \mu_i
     \underbrace{\mathord{\smash[b]{\underset{\raise.3ex\hbox{$\scriptstyle\sim$}}{x}}\vphantom{x}}_i}_{2 \times 1}
     \underbrace{{\mathord{\smash[b]{\underset{\raise.3ex\hbox{$\scriptstyle\sim$}}{x}}\vphantom{x}}_i}^{\top}}_{1 \times 2},
@@ -43838,7 +43848,7 @@
               <w:t xml:space="preserve"> </w:t>
             </w:r>
             <w:r>
-              <w:t xml:space="preserve">${\mathord{\smash[b]{\underset{\raise.3ex\hbox{$\scriptstyle\sim$}}{a}}\vphantom{a}}}^{\top} \ell''\mathopen{}\left(\mathord{\smash[b]{\underset{\raise.3ex\hbox{$\scriptstyle\sim$}}{\beta}}\vphantom{\beta}}\right)\mathclose{} \mathord{\smash[b]{\underset{\raise.3ex\hbox{$\scriptstyle\sim$}}{a}}\vphantom{a}} = -\sum_{i=1}^{49} \mu_i \mathopen{}\left({\mathord{\smash[b]{\underset{\raise.3ex\hbox{$\scriptstyle\sim$}}{a}}\vphantom{a}}}^{\top} \mathord{\smash[b]{\underset{\raise.3ex\hbox{$\scriptstyle\sim$}}{x}}\vphantom{x}}_i\right)\mathclose{}^2 &lt; 0$</w:t>
+              <w:t xml:space="preserve">${\mathord{\smash[b]{\underset{\raise.3ex\hbox{$\scriptstyle\sim$}}{a}}\vphantom{a}}}^{\top} {\ell''\mathopen{}\left(\mathord{\smash[b]{\underset{\raise.3ex\hbox{$\scriptstyle\sim$}}{\beta}}\vphantom{\beta}}\right)\mathclose{}} \mathord{\smash[b]{\underset{\raise.3ex\hbox{$\scriptstyle\sim$}}{a}}\vphantom{a}} = -\sum_{i=1}^{49} \mu_i \mathopen{}\left({\mathord{\smash[b]{\underset{\raise.3ex\hbox{$\scriptstyle\sim$}}{a}}\vphantom{a}}}^{\top} \mathord{\smash[b]{\underset{\raise.3ex\hbox{$\scriptstyle\sim$}}{x}}\vphantom{x}}_i\right)\mathclose{}^2 &lt; 0$</w:t>
             </w:r>
             <w:r>
               <w:t xml:space="preserve">,</w:t>
@@ -49495,7 +49505,7 @@
         <w:t xml:space="preserve"> </w:t>
       </w:r>
       <w:r>
-        <w:t xml:space="preserve">$\mu \stackrel{\text{def}}{=}\operatorname{E}\mathopen{}\left[Y \mid \mathord{\smash[b]{\underset{\raise.3ex\hbox{$\scriptstyle\sim$}}{X}}\vphantom{X}}= \mathord{\smash[b]{\underset{\raise.3ex\hbox{$\scriptstyle\sim$}}{x}}\vphantom{x}}\right]\mathclose{}$</w:t>
+        <w:t xml:space="preserve">$\mu \stackrel{\text{def}}{=}{\mathbb{E}\mathopen{}\left[Y \mid \mathord{\smash[b]{\underset{\raise.3ex\hbox{$\scriptstyle\sim$}}{X}}\vphantom{X}}= \mathord{\smash[b]{\underset{\raise.3ex\hbox{$\scriptstyle\sim$}}{x}}\vphantom{x}}\right]\mathclose{}}$</w:t>
       </w:r>
       <w:r>
         <w:t xml:space="preserve"> </w:t>
@@ -55497,6 +55507,7 @@
               </m:r>
               <m:r>
                 <m:rPr>
+                  <m:scr m:val="double-struck"/>
                   <m:sty m:val="p"/>
                 </m:rPr>
                 <m:t>E</m:t>

</xml_diff>

<commit_message>
Deploying to gh-pages from @ Morrison-Lab/rme@17e50647d9fcb9fa6cf6f029dd15381a3823d807 🚀
</commit_message>
<xml_diff>
--- a/chapters/Intro-to-GLMs-handout.docx
+++ b/chapters/Intro-to-GLMs-handout.docx
@@ -23131,7 +23131,7 @@
                         <m:nor/>
                         <m:sty m:val="p"/>
                       </m:rPr>
-                      <m:t>(split the fraction)</m:t>
+                      <m:t>(distribute the division over the sum, and simplify each term)</m:t>
                     </m:r>
                   </m:e>
                 </m:eqArr>
@@ -28557,7 +28557,7 @@
                         <m:nor/>
                         <m:sty m:val="p"/>
                       </m:rPr>
-                      <m:t>(split the fraction)</m:t>
+                      <m:t>(write the fraction as a product of two fractions)</m:t>
                     </m:r>
                   </m:e>
                   <m:e>
@@ -48292,7 +48292,7 @@
                         <m:nor/>
                         <m:sty m:val="p"/>
                       </m:rPr>
-                      <m:t>(split the fraction)</m:t>
+                      <m:t>(distribute the division over the sum, then cancel the common factors)</m:t>
                     </m:r>
                   </m:e>
                   <m:e>

</xml_diff>